<commit_message>
Integrate database-backed device/user features
Switch app data from hardcoded lists to Supabase-backed queries and add UI refinements. Adds .streamlit theme config and a new api.py stub, removes test.py. database.py: fix delete_device table, add typing import, implement delete_user, get_username, search_devices, total_devices and all_devices_name helpers to enable dynamic queries. main.py: refactor header layout, pull users and device names from database, use database.search_devices for listings, update badges to show serial, name, assigned user and purchase date, and adjust various UI behaviors (removed reruns and placeholder status handlers). Minor binary and pyc files changed/updated.
</commit_message>
<xml_diff>
--- a/Documentations/Documentation.docx
+++ b/Documentations/Documentation.docx
@@ -4,18 +4,18 @@
   <w:body>
     <w:p>
       <w:pPr>
-        <w:pStyle w:val="Title"/>
-      </w:pPr>
-    </w:p>
-    <w:p>
-      <w:pPr>
-        <w:pStyle w:val="Title"/>
+        <w:pStyle w:val="Titre"/>
+      </w:pPr>
+    </w:p>
+    <w:p>
+      <w:pPr>
+        <w:pStyle w:val="Titre"/>
         <w:jc w:val="center"/>
       </w:pPr>
     </w:p>
     <w:p>
       <w:pPr>
-        <w:pStyle w:val="Title"/>
+        <w:pStyle w:val="Titre"/>
         <w:jc w:val="center"/>
         <w:rPr>
           <w:sz w:val="96"/>
@@ -32,7 +32,7 @@
     </w:p>
     <w:p>
       <w:pPr>
-        <w:pStyle w:val="Title"/>
+        <w:pStyle w:val="Titre"/>
         <w:jc w:val="center"/>
         <w:rPr>
           <w:sz w:val="96"/>
@@ -207,7 +207,7 @@
           <w:kern w:val="2"/>
           <w:sz w:val="24"/>
           <w:szCs w:val="24"/>
-          <w:lang w:val="en-CH"/>
+          <w:lang/>
           <w14:ligatures w14:val="standardContextual"/>
         </w:rPr>
         <w:id w:val="412974573"/>
@@ -225,7 +225,7 @@
       <w:sdtContent>
         <w:p>
           <w:pPr>
-            <w:pStyle w:val="TOCHeading"/>
+            <w:pStyle w:val="En-ttedetabledesmatires"/>
             <w:rPr>
               <w:lang w:val="fr-CH"/>
             </w:rPr>
@@ -239,14 +239,14 @@
         </w:p>
         <w:p>
           <w:pPr>
-            <w:pStyle w:val="TOC1"/>
+            <w:pStyle w:val="TM1"/>
             <w:tabs>
               <w:tab w:val="right" w:leader="dot" w:pos="9016"/>
             </w:tabs>
             <w:rPr>
               <w:rFonts w:asciiTheme="minorHAnsi" w:eastAsiaTheme="minorEastAsia" w:hAnsiTheme="minorHAnsi" w:cstheme="minorBidi"/>
               <w:noProof/>
-              <w:lang w:eastAsia="en-CH"/>
+              <w:lang/>
             </w:rPr>
           </w:pPr>
           <w:r>
@@ -261,7 +261,7 @@
           <w:hyperlink w:anchor="_Toc223628711" w:history="1">
             <w:r>
               <w:rPr>
-                <w:rStyle w:val="Hyperlink"/>
+                <w:rStyle w:val="Lienhypertexte"/>
                 <w:noProof/>
               </w:rPr>
               <w:t>Informations générales</w:t>
@@ -318,20 +318,20 @@
         </w:p>
         <w:p>
           <w:pPr>
-            <w:pStyle w:val="TOC2"/>
+            <w:pStyle w:val="TM2"/>
             <w:tabs>
               <w:tab w:val="right" w:leader="dot" w:pos="9016"/>
             </w:tabs>
             <w:rPr>
               <w:rFonts w:asciiTheme="minorHAnsi" w:eastAsiaTheme="minorEastAsia" w:hAnsiTheme="minorHAnsi" w:cstheme="minorBidi"/>
               <w:noProof/>
-              <w:lang w:eastAsia="en-CH"/>
+              <w:lang/>
             </w:rPr>
           </w:pPr>
           <w:hyperlink w:anchor="_Toc223628712" w:history="1">
             <w:r>
               <w:rPr>
-                <w:rStyle w:val="Hyperlink"/>
+                <w:rStyle w:val="Lienhypertexte"/>
                 <w:noProof/>
               </w:rPr>
               <w:t>Fiche projet (données du candidat et contacts)</w:t>
@@ -388,20 +388,20 @@
         </w:p>
         <w:p>
           <w:pPr>
-            <w:pStyle w:val="TOC2"/>
+            <w:pStyle w:val="TM2"/>
             <w:tabs>
               <w:tab w:val="right" w:leader="dot" w:pos="9016"/>
             </w:tabs>
             <w:rPr>
               <w:rFonts w:asciiTheme="minorHAnsi" w:eastAsiaTheme="minorEastAsia" w:hAnsiTheme="minorHAnsi" w:cstheme="minorBidi"/>
               <w:noProof/>
-              <w:lang w:eastAsia="en-CH"/>
+              <w:lang/>
             </w:rPr>
           </w:pPr>
           <w:hyperlink w:anchor="_Toc223628713" w:history="1">
             <w:r>
               <w:rPr>
-                <w:rStyle w:val="Hyperlink"/>
+                <w:rStyle w:val="Lienhypertexte"/>
                 <w:noProof/>
               </w:rPr>
               <w:t>Nom</w:t>
@@ -458,20 +458,20 @@
         </w:p>
         <w:p>
           <w:pPr>
-            <w:pStyle w:val="TOC2"/>
+            <w:pStyle w:val="TM2"/>
             <w:tabs>
               <w:tab w:val="right" w:leader="dot" w:pos="9016"/>
             </w:tabs>
             <w:rPr>
               <w:rFonts w:asciiTheme="minorHAnsi" w:eastAsiaTheme="minorEastAsia" w:hAnsiTheme="minorHAnsi" w:cstheme="minorBidi"/>
               <w:noProof/>
-              <w:lang w:eastAsia="en-CH"/>
+              <w:lang/>
             </w:rPr>
           </w:pPr>
           <w:hyperlink w:anchor="_Toc223628714" w:history="1">
             <w:r>
               <w:rPr>
-                <w:rStyle w:val="Hyperlink"/>
+                <w:rStyle w:val="Lienhypertexte"/>
                 <w:noProof/>
               </w:rPr>
               <w:t>Jimmy LAM</w:t>
@@ -528,20 +528,20 @@
         </w:p>
         <w:p>
           <w:pPr>
-            <w:pStyle w:val="TOC2"/>
+            <w:pStyle w:val="TM2"/>
             <w:tabs>
               <w:tab w:val="right" w:leader="dot" w:pos="9016"/>
             </w:tabs>
             <w:rPr>
               <w:rFonts w:asciiTheme="minorHAnsi" w:eastAsiaTheme="minorEastAsia" w:hAnsiTheme="minorHAnsi" w:cstheme="minorBidi"/>
               <w:noProof/>
-              <w:lang w:eastAsia="en-CH"/>
+              <w:lang/>
             </w:rPr>
           </w:pPr>
           <w:hyperlink w:anchor="_Toc223628715" w:history="1">
             <w:r>
               <w:rPr>
-                <w:rStyle w:val="Hyperlink"/>
+                <w:rStyle w:val="Lienhypertexte"/>
                 <w:noProof/>
               </w:rPr>
               <w:t>Date de naissance</w:t>
@@ -598,20 +598,20 @@
         </w:p>
         <w:p>
           <w:pPr>
-            <w:pStyle w:val="TOC2"/>
+            <w:pStyle w:val="TM2"/>
             <w:tabs>
               <w:tab w:val="right" w:leader="dot" w:pos="9016"/>
             </w:tabs>
             <w:rPr>
               <w:rFonts w:asciiTheme="minorHAnsi" w:eastAsiaTheme="minorEastAsia" w:hAnsiTheme="minorHAnsi" w:cstheme="minorBidi"/>
               <w:noProof/>
-              <w:lang w:eastAsia="en-CH"/>
+              <w:lang/>
             </w:rPr>
           </w:pPr>
           <w:hyperlink w:anchor="_Toc223628716" w:history="1">
             <w:r>
               <w:rPr>
-                <w:rStyle w:val="Hyperlink"/>
+                <w:rStyle w:val="Lienhypertexte"/>
                 <w:noProof/>
               </w:rPr>
               <w:t>11. Septembre 2004</w:t>
@@ -668,20 +668,20 @@
         </w:p>
         <w:p>
           <w:pPr>
-            <w:pStyle w:val="TOC2"/>
+            <w:pStyle w:val="TM2"/>
             <w:tabs>
               <w:tab w:val="right" w:leader="dot" w:pos="9016"/>
             </w:tabs>
             <w:rPr>
               <w:rFonts w:asciiTheme="minorHAnsi" w:eastAsiaTheme="minorEastAsia" w:hAnsiTheme="minorHAnsi" w:cstheme="minorBidi"/>
               <w:noProof/>
-              <w:lang w:eastAsia="en-CH"/>
+              <w:lang/>
             </w:rPr>
           </w:pPr>
           <w:hyperlink w:anchor="_Toc223628717" w:history="1">
             <w:r>
               <w:rPr>
-                <w:rStyle w:val="Hyperlink"/>
+                <w:rStyle w:val="Lienhypertexte"/>
                 <w:noProof/>
               </w:rPr>
               <w:t>Email</w:t>
@@ -738,20 +738,20 @@
         </w:p>
         <w:p>
           <w:pPr>
-            <w:pStyle w:val="TOC2"/>
+            <w:pStyle w:val="TM2"/>
             <w:tabs>
               <w:tab w:val="right" w:leader="dot" w:pos="9016"/>
             </w:tabs>
             <w:rPr>
               <w:rFonts w:asciiTheme="minorHAnsi" w:eastAsiaTheme="minorEastAsia" w:hAnsiTheme="minorHAnsi" w:cstheme="minorBidi"/>
               <w:noProof/>
-              <w:lang w:eastAsia="en-CH"/>
+              <w:lang/>
             </w:rPr>
           </w:pPr>
           <w:hyperlink w:anchor="_Toc223628718" w:history="1">
             <w:r>
               <w:rPr>
-                <w:rStyle w:val="Hyperlink"/>
+                <w:rStyle w:val="Lienhypertexte"/>
                 <w:noProof/>
               </w:rPr>
               <w:t>jimmy.lam@eduvaud.ch</w:t>
@@ -808,20 +808,20 @@
         </w:p>
         <w:p>
           <w:pPr>
-            <w:pStyle w:val="TOC2"/>
+            <w:pStyle w:val="TM2"/>
             <w:tabs>
               <w:tab w:val="right" w:leader="dot" w:pos="9016"/>
             </w:tabs>
             <w:rPr>
               <w:rFonts w:asciiTheme="minorHAnsi" w:eastAsiaTheme="minorEastAsia" w:hAnsiTheme="minorHAnsi" w:cstheme="minorBidi"/>
               <w:noProof/>
-              <w:lang w:eastAsia="en-CH"/>
+              <w:lang/>
             </w:rPr>
           </w:pPr>
           <w:hyperlink w:anchor="_Toc223628719" w:history="1">
             <w:r>
               <w:rPr>
-                <w:rStyle w:val="Hyperlink"/>
+                <w:rStyle w:val="Lienhypertexte"/>
                 <w:noProof/>
               </w:rPr>
               <w:t>Contexte et objectifs généraux</w:t>
@@ -878,20 +878,20 @@
         </w:p>
         <w:p>
           <w:pPr>
-            <w:pStyle w:val="TOC2"/>
+            <w:pStyle w:val="TM2"/>
             <w:tabs>
               <w:tab w:val="right" w:leader="dot" w:pos="9016"/>
             </w:tabs>
             <w:rPr>
               <w:rFonts w:asciiTheme="minorHAnsi" w:eastAsiaTheme="minorEastAsia" w:hAnsiTheme="minorHAnsi" w:cstheme="minorBidi"/>
               <w:noProof/>
-              <w:lang w:eastAsia="en-CH"/>
+              <w:lang/>
             </w:rPr>
           </w:pPr>
           <w:hyperlink w:anchor="_Toc223628720" w:history="1">
             <w:r>
               <w:rPr>
-                <w:rStyle w:val="Hyperlink"/>
+                <w:rStyle w:val="Lienhypertexte"/>
                 <w:noProof/>
               </w:rPr>
               <w:t>Contraintes (planning, matériel, licences, calendrier)</w:t>
@@ -948,20 +948,20 @@
         </w:p>
         <w:p>
           <w:pPr>
-            <w:pStyle w:val="TOC1"/>
+            <w:pStyle w:val="TM1"/>
             <w:tabs>
               <w:tab w:val="right" w:leader="dot" w:pos="9016"/>
             </w:tabs>
             <w:rPr>
               <w:rFonts w:asciiTheme="minorHAnsi" w:eastAsiaTheme="minorEastAsia" w:hAnsiTheme="minorHAnsi" w:cstheme="minorBidi"/>
               <w:noProof/>
-              <w:lang w:eastAsia="en-CH"/>
+              <w:lang/>
             </w:rPr>
           </w:pPr>
           <w:hyperlink w:anchor="_Toc223628721" w:history="1">
             <w:r>
               <w:rPr>
-                <w:rStyle w:val="Hyperlink"/>
+                <w:rStyle w:val="Lienhypertexte"/>
                 <w:noProof/>
               </w:rPr>
               <w:t>Procédure et livrables</w:t>
@@ -1018,20 +1018,20 @@
         </w:p>
         <w:p>
           <w:pPr>
-            <w:pStyle w:val="TOC2"/>
+            <w:pStyle w:val="TM2"/>
             <w:tabs>
               <w:tab w:val="right" w:leader="dot" w:pos="9016"/>
             </w:tabs>
             <w:rPr>
               <w:rFonts w:asciiTheme="minorHAnsi" w:eastAsiaTheme="minorEastAsia" w:hAnsiTheme="minorHAnsi" w:cstheme="minorBidi"/>
               <w:noProof/>
-              <w:lang w:eastAsia="en-CH"/>
+              <w:lang/>
             </w:rPr>
           </w:pPr>
           <w:hyperlink w:anchor="_Toc223628722" w:history="1">
             <w:r>
               <w:rPr>
-                <w:rStyle w:val="Hyperlink"/>
+                <w:rStyle w:val="Lienhypertexte"/>
                 <w:noProof/>
               </w:rPr>
               <w:t>Règles de réalisation (procédure fournie)</w:t>
@@ -1088,20 +1088,20 @@
         </w:p>
         <w:p>
           <w:pPr>
-            <w:pStyle w:val="TOC2"/>
+            <w:pStyle w:val="TM2"/>
             <w:tabs>
               <w:tab w:val="right" w:leader="dot" w:pos="9016"/>
             </w:tabs>
             <w:rPr>
               <w:rFonts w:asciiTheme="minorHAnsi" w:eastAsiaTheme="minorEastAsia" w:hAnsiTheme="minorHAnsi" w:cstheme="minorBidi"/>
               <w:noProof/>
-              <w:lang w:eastAsia="en-CH"/>
+              <w:lang/>
             </w:rPr>
           </w:pPr>
           <w:hyperlink w:anchor="_Toc223628723" w:history="1">
             <w:r>
               <w:rPr>
-                <w:rStyle w:val="Hyperlink"/>
+                <w:rStyle w:val="Lienhypertexte"/>
                 <w:noProof/>
               </w:rPr>
               <w:t>Calendrier des livrables</w:t>
@@ -1158,20 +1158,20 @@
         </w:p>
         <w:p>
           <w:pPr>
-            <w:pStyle w:val="TOC2"/>
+            <w:pStyle w:val="TM2"/>
             <w:tabs>
               <w:tab w:val="right" w:leader="dot" w:pos="9016"/>
             </w:tabs>
             <w:rPr>
               <w:rFonts w:asciiTheme="minorHAnsi" w:eastAsiaTheme="minorEastAsia" w:hAnsiTheme="minorHAnsi" w:cstheme="minorBidi"/>
               <w:noProof/>
-              <w:lang w:eastAsia="en-CH"/>
+              <w:lang/>
             </w:rPr>
           </w:pPr>
           <w:hyperlink w:anchor="_Toc223628724" w:history="1">
             <w:r>
               <w:rPr>
-                <w:rStyle w:val="Hyperlink"/>
+                <w:rStyle w:val="Lienhypertexte"/>
                 <w:noProof/>
               </w:rPr>
               <w:t>Journal de travail (format et fréquence)</w:t>
@@ -1228,20 +1228,20 @@
         </w:p>
         <w:p>
           <w:pPr>
-            <w:pStyle w:val="TOC2"/>
+            <w:pStyle w:val="TM2"/>
             <w:tabs>
               <w:tab w:val="right" w:leader="dot" w:pos="9016"/>
             </w:tabs>
             <w:rPr>
               <w:rFonts w:asciiTheme="minorHAnsi" w:eastAsiaTheme="minorEastAsia" w:hAnsiTheme="minorHAnsi" w:cstheme="minorBidi"/>
               <w:noProof/>
-              <w:lang w:eastAsia="en-CH"/>
+              <w:lang/>
             </w:rPr>
           </w:pPr>
           <w:hyperlink w:anchor="_Toc223628725" w:history="1">
             <w:r>
               <w:rPr>
-                <w:rStyle w:val="Hyperlink"/>
+                <w:rStyle w:val="Lienhypertexte"/>
                 <w:noProof/>
               </w:rPr>
               <w:t>Gestion des versions et archivage</w:t>
@@ -1298,20 +1298,20 @@
         </w:p>
         <w:p>
           <w:pPr>
-            <w:pStyle w:val="TOC1"/>
+            <w:pStyle w:val="TM1"/>
             <w:tabs>
               <w:tab w:val="right" w:leader="dot" w:pos="9016"/>
             </w:tabs>
             <w:rPr>
               <w:rFonts w:asciiTheme="minorHAnsi" w:eastAsiaTheme="minorEastAsia" w:hAnsiTheme="minorHAnsi" w:cstheme="minorBidi"/>
               <w:noProof/>
-              <w:lang w:eastAsia="en-CH"/>
+              <w:lang/>
             </w:rPr>
           </w:pPr>
           <w:hyperlink w:anchor="_Toc223628726" w:history="1">
             <w:r>
               <w:rPr>
-                <w:rStyle w:val="Hyperlink"/>
+                <w:rStyle w:val="Lienhypertexte"/>
                 <w:noProof/>
               </w:rPr>
               <w:t>Cahier des charges fonctionnel</w:t>
@@ -1368,20 +1368,20 @@
         </w:p>
         <w:p>
           <w:pPr>
-            <w:pStyle w:val="TOC2"/>
+            <w:pStyle w:val="TM2"/>
             <w:tabs>
               <w:tab w:val="right" w:leader="dot" w:pos="9016"/>
             </w:tabs>
             <w:rPr>
               <w:rFonts w:asciiTheme="minorHAnsi" w:eastAsiaTheme="minorEastAsia" w:hAnsiTheme="minorHAnsi" w:cstheme="minorBidi"/>
               <w:noProof/>
-              <w:lang w:eastAsia="en-CH"/>
+              <w:lang/>
             </w:rPr>
           </w:pPr>
           <w:hyperlink w:anchor="_Toc223628727" w:history="1">
             <w:r>
               <w:rPr>
-                <w:rStyle w:val="Hyperlink"/>
+                <w:rStyle w:val="Lienhypertexte"/>
                 <w:noProof/>
               </w:rPr>
               <w:t>Liste des fonctionnalités (priorisées: MMP Minimum, Nice-to-have)</w:t>
@@ -1438,20 +1438,20 @@
         </w:p>
         <w:p>
           <w:pPr>
-            <w:pStyle w:val="TOC2"/>
+            <w:pStyle w:val="TM2"/>
             <w:tabs>
               <w:tab w:val="right" w:leader="dot" w:pos="9016"/>
             </w:tabs>
             <w:rPr>
               <w:rFonts w:asciiTheme="minorHAnsi" w:eastAsiaTheme="minorEastAsia" w:hAnsiTheme="minorHAnsi" w:cstheme="minorBidi"/>
               <w:noProof/>
-              <w:lang w:eastAsia="en-CH"/>
+              <w:lang/>
             </w:rPr>
           </w:pPr>
           <w:hyperlink w:anchor="_Toc223628728" w:history="1">
             <w:r>
               <w:rPr>
-                <w:rStyle w:val="Hyperlink"/>
+                <w:rStyle w:val="Lienhypertexte"/>
                 <w:noProof/>
               </w:rPr>
               <w:t>Fonctionnalités Secondaires (Nice to have)</w:t>
@@ -1508,20 +1508,20 @@
         </w:p>
         <w:p>
           <w:pPr>
-            <w:pStyle w:val="TOC2"/>
+            <w:pStyle w:val="TM2"/>
             <w:tabs>
               <w:tab w:val="right" w:leader="dot" w:pos="9016"/>
             </w:tabs>
             <w:rPr>
               <w:rFonts w:asciiTheme="minorHAnsi" w:eastAsiaTheme="minorEastAsia" w:hAnsiTheme="minorHAnsi" w:cstheme="minorBidi"/>
               <w:noProof/>
-              <w:lang w:eastAsia="en-CH"/>
+              <w:lang/>
             </w:rPr>
           </w:pPr>
           <w:hyperlink w:anchor="_Toc223628729" w:history="1">
             <w:r>
               <w:rPr>
-                <w:rStyle w:val="Hyperlink"/>
+                <w:rStyle w:val="Lienhypertexte"/>
                 <w:noProof/>
               </w:rPr>
               <w:t>Rôles utilisateurs et cas d’utilisation (authentification, rôles)</w:t>
@@ -1578,20 +1578,20 @@
         </w:p>
         <w:p>
           <w:pPr>
-            <w:pStyle w:val="TOC1"/>
+            <w:pStyle w:val="TM1"/>
             <w:tabs>
               <w:tab w:val="right" w:leader="dot" w:pos="9016"/>
             </w:tabs>
             <w:rPr>
               <w:rFonts w:asciiTheme="minorHAnsi" w:eastAsiaTheme="minorEastAsia" w:hAnsiTheme="minorHAnsi" w:cstheme="minorBidi"/>
               <w:noProof/>
-              <w:lang w:eastAsia="en-CH"/>
+              <w:lang/>
             </w:rPr>
           </w:pPr>
           <w:hyperlink w:anchor="_Toc223628730" w:history="1">
             <w:r>
               <w:rPr>
-                <w:rStyle w:val="Hyperlink"/>
+                <w:rStyle w:val="Lienhypertexte"/>
                 <w:noProof/>
               </w:rPr>
               <w:t>Spécifications techniques</w:t>
@@ -1648,20 +1648,20 @@
         </w:p>
         <w:p>
           <w:pPr>
-            <w:pStyle w:val="TOC2"/>
+            <w:pStyle w:val="TM2"/>
             <w:tabs>
               <w:tab w:val="right" w:leader="dot" w:pos="9016"/>
             </w:tabs>
             <w:rPr>
               <w:rFonts w:asciiTheme="minorHAnsi" w:eastAsiaTheme="minorEastAsia" w:hAnsiTheme="minorHAnsi" w:cstheme="minorBidi"/>
               <w:noProof/>
-              <w:lang w:eastAsia="en-CH"/>
+              <w:lang/>
             </w:rPr>
           </w:pPr>
           <w:hyperlink w:anchor="_Toc223628731" w:history="1">
             <w:r>
               <w:rPr>
-                <w:rStyle w:val="Hyperlink"/>
+                <w:rStyle w:val="Lienhypertexte"/>
                 <w:noProof/>
               </w:rPr>
               <w:t>Technologies retenues (stack, frameworks, bibliothèques OCR)</w:t>
@@ -1718,20 +1718,20 @@
         </w:p>
         <w:p>
           <w:pPr>
-            <w:pStyle w:val="TOC2"/>
+            <w:pStyle w:val="TM2"/>
             <w:tabs>
               <w:tab w:val="right" w:leader="dot" w:pos="9016"/>
             </w:tabs>
             <w:rPr>
               <w:rFonts w:asciiTheme="minorHAnsi" w:eastAsiaTheme="minorEastAsia" w:hAnsiTheme="minorHAnsi" w:cstheme="minorBidi"/>
               <w:noProof/>
-              <w:lang w:eastAsia="en-CH"/>
+              <w:lang/>
             </w:rPr>
           </w:pPr>
           <w:hyperlink w:anchor="_Toc223628732" w:history="1">
             <w:r>
               <w:rPr>
-                <w:rStyle w:val="Hyperlink"/>
+                <w:rStyle w:val="Lienhypertexte"/>
                 <w:noProof/>
               </w:rPr>
               <w:t>Base de données (modèle relationnel)</w:t>
@@ -1788,20 +1788,20 @@
         </w:p>
         <w:p>
           <w:pPr>
-            <w:pStyle w:val="TOC2"/>
+            <w:pStyle w:val="TM2"/>
             <w:tabs>
               <w:tab w:val="right" w:leader="dot" w:pos="9016"/>
             </w:tabs>
             <w:rPr>
               <w:rFonts w:asciiTheme="minorHAnsi" w:eastAsiaTheme="minorEastAsia" w:hAnsiTheme="minorHAnsi" w:cstheme="minorBidi"/>
               <w:noProof/>
-              <w:lang w:eastAsia="en-CH"/>
+              <w:lang/>
             </w:rPr>
           </w:pPr>
           <w:hyperlink w:anchor="_Toc223628733" w:history="1">
             <w:r>
               <w:rPr>
-                <w:rStyle w:val="Hyperlink"/>
+                <w:rStyle w:val="Lienhypertexte"/>
                 <w:noProof/>
               </w:rPr>
               <w:t>API externes (fabricants) — spécifications d’intégration</w:t>
@@ -1858,20 +1858,20 @@
         </w:p>
         <w:p>
           <w:pPr>
-            <w:pStyle w:val="TOC2"/>
+            <w:pStyle w:val="TM2"/>
             <w:tabs>
               <w:tab w:val="right" w:leader="dot" w:pos="9016"/>
             </w:tabs>
             <w:rPr>
               <w:rFonts w:asciiTheme="minorHAnsi" w:eastAsiaTheme="minorEastAsia" w:hAnsiTheme="minorHAnsi" w:cstheme="minorBidi"/>
               <w:noProof/>
-              <w:lang w:eastAsia="en-CH"/>
+              <w:lang/>
             </w:rPr>
           </w:pPr>
           <w:hyperlink w:anchor="_Toc223628734" w:history="1">
             <w:r>
               <w:rPr>
-                <w:rStyle w:val="Hyperlink"/>
+                <w:rStyle w:val="Lienhypertexte"/>
                 <w:noProof/>
               </w:rPr>
               <w:t>Sécurité (authentification, autorisations, stockage des données)</w:t>
@@ -1928,20 +1928,20 @@
         </w:p>
         <w:p>
           <w:pPr>
-            <w:pStyle w:val="TOC2"/>
+            <w:pStyle w:val="TM2"/>
             <w:tabs>
               <w:tab w:val="right" w:leader="dot" w:pos="9016"/>
             </w:tabs>
             <w:rPr>
               <w:rFonts w:asciiTheme="minorHAnsi" w:eastAsiaTheme="minorEastAsia" w:hAnsiTheme="minorHAnsi" w:cstheme="minorBidi"/>
               <w:noProof/>
-              <w:lang w:eastAsia="en-CH"/>
+              <w:lang/>
             </w:rPr>
           </w:pPr>
           <w:hyperlink w:anchor="_Toc223628735" w:history="1">
             <w:r>
               <w:rPr>
-                <w:rStyle w:val="Hyperlink"/>
+                <w:rStyle w:val="Lienhypertexte"/>
                 <w:noProof/>
               </w:rPr>
               <w:t>Contraintes de déploiement et environnements (dev/test/prod)</w:t>
@@ -1998,20 +1998,20 @@
         </w:p>
         <w:p>
           <w:pPr>
-            <w:pStyle w:val="TOC1"/>
+            <w:pStyle w:val="TM1"/>
             <w:tabs>
               <w:tab w:val="right" w:leader="dot" w:pos="9016"/>
             </w:tabs>
             <w:rPr>
               <w:rFonts w:asciiTheme="minorHAnsi" w:eastAsiaTheme="minorEastAsia" w:hAnsiTheme="minorHAnsi" w:cstheme="minorBidi"/>
               <w:noProof/>
-              <w:lang w:eastAsia="en-CH"/>
+              <w:lang/>
             </w:rPr>
           </w:pPr>
           <w:hyperlink w:anchor="_Toc223628736" w:history="1">
             <w:r>
               <w:rPr>
-                <w:rStyle w:val="Hyperlink"/>
+                <w:rStyle w:val="Lienhypertexte"/>
                 <w:noProof/>
               </w:rPr>
               <w:t>Analyse &amp; conception</w:t>
@@ -2068,27 +2068,27 @@
         </w:p>
         <w:p>
           <w:pPr>
-            <w:pStyle w:val="TOC2"/>
+            <w:pStyle w:val="TM2"/>
             <w:tabs>
               <w:tab w:val="right" w:leader="dot" w:pos="9016"/>
             </w:tabs>
             <w:rPr>
               <w:rFonts w:asciiTheme="minorHAnsi" w:eastAsiaTheme="minorEastAsia" w:hAnsiTheme="minorHAnsi" w:cstheme="minorBidi"/>
               <w:noProof/>
-              <w:lang w:eastAsia="en-CH"/>
+              <w:lang/>
             </w:rPr>
           </w:pPr>
           <w:hyperlink w:anchor="_Toc223628737" w:history="1">
             <w:r>
               <w:rPr>
-                <w:rStyle w:val="Hyperlink"/>
+                <w:rStyle w:val="Lienhypertexte"/>
                 <w:noProof/>
               </w:rPr>
               <w:t>Analyse des besoins (fonctionnels &amp; non</w:t>
             </w:r>
             <w:r>
               <w:rPr>
-                <w:rStyle w:val="Hyperlink"/>
+                <w:rStyle w:val="Lienhypertexte"/>
                 <w:rFonts w:ascii="Cambria Math" w:hAnsi="Cambria Math" w:cs="Cambria Math"/>
                 <w:noProof/>
               </w:rPr>
@@ -2096,7 +2096,7 @@
             </w:r>
             <w:r>
               <w:rPr>
-                <w:rStyle w:val="Hyperlink"/>
+                <w:rStyle w:val="Lienhypertexte"/>
                 <w:noProof/>
               </w:rPr>
               <w:t>fonctionnels)</w:t>
@@ -2153,20 +2153,20 @@
         </w:p>
         <w:p>
           <w:pPr>
-            <w:pStyle w:val="TOC2"/>
+            <w:pStyle w:val="TM2"/>
             <w:tabs>
               <w:tab w:val="right" w:leader="dot" w:pos="9016"/>
             </w:tabs>
             <w:rPr>
               <w:rFonts w:asciiTheme="minorHAnsi" w:eastAsiaTheme="minorEastAsia" w:hAnsiTheme="minorHAnsi" w:cstheme="minorBidi"/>
               <w:noProof/>
-              <w:lang w:eastAsia="en-CH"/>
+              <w:lang/>
             </w:rPr>
           </w:pPr>
           <w:hyperlink w:anchor="_Toc223628738" w:history="1">
             <w:r>
               <w:rPr>
-                <w:rStyle w:val="Hyperlink"/>
+                <w:rStyle w:val="Lienhypertexte"/>
                 <w:noProof/>
               </w:rPr>
               <w:t>Cas d’utilisation</w:t>
@@ -2223,20 +2223,20 @@
         </w:p>
         <w:p>
           <w:pPr>
-            <w:pStyle w:val="TOC2"/>
+            <w:pStyle w:val="TM2"/>
             <w:tabs>
               <w:tab w:val="right" w:leader="dot" w:pos="9016"/>
             </w:tabs>
             <w:rPr>
               <w:rFonts w:asciiTheme="minorHAnsi" w:eastAsiaTheme="minorEastAsia" w:hAnsiTheme="minorHAnsi" w:cstheme="minorBidi"/>
               <w:noProof/>
-              <w:lang w:eastAsia="en-CH"/>
+              <w:lang/>
             </w:rPr>
           </w:pPr>
           <w:hyperlink w:anchor="_Toc223628739" w:history="1">
             <w:r>
               <w:rPr>
-                <w:rStyle w:val="Hyperlink"/>
+                <w:rStyle w:val="Lienhypertexte"/>
                 <w:noProof/>
               </w:rPr>
               <w:t>Diagramme de classes / modèle de données</w:t>
@@ -2293,20 +2293,20 @@
         </w:p>
         <w:p>
           <w:pPr>
-            <w:pStyle w:val="TOC1"/>
+            <w:pStyle w:val="TM1"/>
             <w:tabs>
               <w:tab w:val="right" w:leader="dot" w:pos="9016"/>
             </w:tabs>
             <w:rPr>
               <w:rFonts w:asciiTheme="minorHAnsi" w:eastAsiaTheme="minorEastAsia" w:hAnsiTheme="minorHAnsi" w:cstheme="minorBidi"/>
               <w:noProof/>
-              <w:lang w:eastAsia="en-CH"/>
+              <w:lang/>
             </w:rPr>
           </w:pPr>
           <w:hyperlink w:anchor="_Toc223628740" w:history="1">
             <w:r>
               <w:rPr>
-                <w:rStyle w:val="Hyperlink"/>
+                <w:rStyle w:val="Lienhypertexte"/>
                 <w:noProof/>
               </w:rPr>
               <w:t>Planification et gestion de projet</w:t>
@@ -2363,20 +2363,20 @@
         </w:p>
         <w:p>
           <w:pPr>
-            <w:pStyle w:val="TOC2"/>
+            <w:pStyle w:val="TM2"/>
             <w:tabs>
               <w:tab w:val="right" w:leader="dot" w:pos="9016"/>
             </w:tabs>
             <w:rPr>
               <w:rFonts w:asciiTheme="minorHAnsi" w:eastAsiaTheme="minorEastAsia" w:hAnsiTheme="minorHAnsi" w:cstheme="minorBidi"/>
               <w:noProof/>
-              <w:lang w:eastAsia="en-CH"/>
+              <w:lang/>
             </w:rPr>
           </w:pPr>
           <w:hyperlink w:anchor="_Toc223628741" w:history="1">
             <w:r>
               <w:rPr>
-                <w:rStyle w:val="Hyperlink"/>
+                <w:rStyle w:val="Lienhypertexte"/>
                 <w:noProof/>
               </w:rPr>
               <w:t>Estimation des charges et points de contrôle</w:t>
@@ -2433,20 +2433,20 @@
         </w:p>
         <w:p>
           <w:pPr>
-            <w:pStyle w:val="TOC2"/>
+            <w:pStyle w:val="TM2"/>
             <w:tabs>
               <w:tab w:val="right" w:leader="dot" w:pos="9016"/>
             </w:tabs>
             <w:rPr>
               <w:rFonts w:asciiTheme="minorHAnsi" w:eastAsiaTheme="minorEastAsia" w:hAnsiTheme="minorHAnsi" w:cstheme="minorBidi"/>
               <w:noProof/>
-              <w:lang w:eastAsia="en-CH"/>
+              <w:lang/>
             </w:rPr>
           </w:pPr>
           <w:hyperlink w:anchor="_Toc223628742" w:history="1">
             <w:r>
               <w:rPr>
-                <w:rStyle w:val="Hyperlink"/>
+                <w:rStyle w:val="Lienhypertexte"/>
                 <w:noProof/>
               </w:rPr>
               <w:t>Risques, impacts et plan d’atténuation</w:t>
@@ -2503,20 +2503,20 @@
         </w:p>
         <w:p>
           <w:pPr>
-            <w:pStyle w:val="TOC1"/>
+            <w:pStyle w:val="TM1"/>
             <w:tabs>
               <w:tab w:val="right" w:leader="dot" w:pos="9016"/>
             </w:tabs>
             <w:rPr>
               <w:rFonts w:asciiTheme="minorHAnsi" w:eastAsiaTheme="minorEastAsia" w:hAnsiTheme="minorHAnsi" w:cstheme="minorBidi"/>
               <w:noProof/>
-              <w:lang w:eastAsia="en-CH"/>
+              <w:lang/>
             </w:rPr>
           </w:pPr>
           <w:hyperlink w:anchor="_Toc223628743" w:history="1">
             <w:r>
               <w:rPr>
-                <w:rStyle w:val="Hyperlink"/>
+                <w:rStyle w:val="Lienhypertexte"/>
                 <w:noProof/>
               </w:rPr>
               <w:t>Implémentation</w:t>
@@ -2573,20 +2573,20 @@
         </w:p>
         <w:p>
           <w:pPr>
-            <w:pStyle w:val="TOC2"/>
+            <w:pStyle w:val="TM2"/>
             <w:tabs>
               <w:tab w:val="right" w:leader="dot" w:pos="9016"/>
             </w:tabs>
             <w:rPr>
               <w:rFonts w:asciiTheme="minorHAnsi" w:eastAsiaTheme="minorEastAsia" w:hAnsiTheme="minorHAnsi" w:cstheme="minorBidi"/>
               <w:noProof/>
-              <w:lang w:eastAsia="en-CH"/>
+              <w:lang/>
             </w:rPr>
           </w:pPr>
           <w:hyperlink w:anchor="_Toc223628744" w:history="1">
             <w:r>
               <w:rPr>
-                <w:rStyle w:val="Hyperlink"/>
+                <w:rStyle w:val="Lienhypertexte"/>
                 <w:noProof/>
               </w:rPr>
               <w:t>Intégration OCR : choix de la bibliothèque, flux de traitement d’image</w:t>
@@ -2643,20 +2643,20 @@
         </w:p>
         <w:p>
           <w:pPr>
-            <w:pStyle w:val="TOC2"/>
+            <w:pStyle w:val="TM2"/>
             <w:tabs>
               <w:tab w:val="right" w:leader="dot" w:pos="9016"/>
             </w:tabs>
             <w:rPr>
               <w:rFonts w:asciiTheme="minorHAnsi" w:eastAsiaTheme="minorEastAsia" w:hAnsiTheme="minorHAnsi" w:cstheme="minorBidi"/>
               <w:noProof/>
-              <w:lang w:eastAsia="en-CH"/>
+              <w:lang/>
             </w:rPr>
           </w:pPr>
           <w:hyperlink w:anchor="_Toc223628745" w:history="1">
             <w:r>
               <w:rPr>
-                <w:rStyle w:val="Hyperlink"/>
+                <w:rStyle w:val="Lienhypertexte"/>
                 <w:noProof/>
               </w:rPr>
               <w:t>Intégration API fabricants (auth, formats)</w:t>
@@ -2713,20 +2713,20 @@
         </w:p>
         <w:p>
           <w:pPr>
-            <w:pStyle w:val="TOC2"/>
+            <w:pStyle w:val="TM2"/>
             <w:tabs>
               <w:tab w:val="right" w:leader="dot" w:pos="9016"/>
             </w:tabs>
             <w:rPr>
               <w:rFonts w:asciiTheme="minorHAnsi" w:eastAsiaTheme="minorEastAsia" w:hAnsiTheme="minorHAnsi" w:cstheme="minorBidi"/>
               <w:noProof/>
-              <w:lang w:eastAsia="en-CH"/>
+              <w:lang/>
             </w:rPr>
           </w:pPr>
           <w:hyperlink w:anchor="_Toc223628746" w:history="1">
             <w:r>
               <w:rPr>
-                <w:rStyle w:val="Hyperlink"/>
+                <w:rStyle w:val="Lienhypertexte"/>
                 <w:noProof/>
               </w:rPr>
               <w:t>Gestion des erreurs et journalisation</w:t>
@@ -2783,20 +2783,20 @@
         </w:p>
         <w:p>
           <w:pPr>
-            <w:pStyle w:val="TOC2"/>
+            <w:pStyle w:val="TM2"/>
             <w:tabs>
               <w:tab w:val="right" w:leader="dot" w:pos="9016"/>
             </w:tabs>
             <w:rPr>
               <w:rFonts w:asciiTheme="minorHAnsi" w:eastAsiaTheme="minorEastAsia" w:hAnsiTheme="minorHAnsi" w:cstheme="minorBidi"/>
               <w:noProof/>
-              <w:lang w:eastAsia="en-CH"/>
+              <w:lang/>
             </w:rPr>
           </w:pPr>
           <w:hyperlink w:anchor="_Toc223628747" w:history="1">
             <w:r>
               <w:rPr>
-                <w:rStyle w:val="Hyperlink"/>
+                <w:rStyle w:val="Lienhypertexte"/>
                 <w:noProof/>
               </w:rPr>
               <w:t>Tests unitaires et d’intégration (stratégie et exemples)</w:t>
@@ -2853,20 +2853,20 @@
         </w:p>
         <w:p>
           <w:pPr>
-            <w:pStyle w:val="TOC2"/>
+            <w:pStyle w:val="TM2"/>
             <w:tabs>
               <w:tab w:val="right" w:leader="dot" w:pos="9016"/>
             </w:tabs>
             <w:rPr>
               <w:rFonts w:asciiTheme="minorHAnsi" w:eastAsiaTheme="minorEastAsia" w:hAnsiTheme="minorHAnsi" w:cstheme="minorBidi"/>
               <w:noProof/>
-              <w:lang w:eastAsia="en-CH"/>
+              <w:lang/>
             </w:rPr>
           </w:pPr>
           <w:hyperlink w:anchor="_Toc223628748" w:history="1">
             <w:r>
               <w:rPr>
-                <w:rStyle w:val="Hyperlink"/>
+                <w:rStyle w:val="Lienhypertexte"/>
                 <w:noProof/>
                 <w:lang w:val="fr-CH"/>
               </w:rPr>
@@ -2924,20 +2924,20 @@
         </w:p>
         <w:p>
           <w:pPr>
-            <w:pStyle w:val="TOC1"/>
+            <w:pStyle w:val="TM1"/>
             <w:tabs>
               <w:tab w:val="right" w:leader="dot" w:pos="9016"/>
             </w:tabs>
             <w:rPr>
               <w:rFonts w:asciiTheme="minorHAnsi" w:eastAsiaTheme="minorEastAsia" w:hAnsiTheme="minorHAnsi" w:cstheme="minorBidi"/>
               <w:noProof/>
-              <w:lang w:eastAsia="en-CH"/>
+              <w:lang/>
             </w:rPr>
           </w:pPr>
           <w:hyperlink w:anchor="_Toc223628749" w:history="1">
             <w:r>
               <w:rPr>
-                <w:rStyle w:val="Hyperlink"/>
+                <w:rStyle w:val="Lienhypertexte"/>
                 <w:noProof/>
               </w:rPr>
               <w:t>Base de données</w:t>
@@ -2994,20 +2994,20 @@
         </w:p>
         <w:p>
           <w:pPr>
-            <w:pStyle w:val="TOC2"/>
+            <w:pStyle w:val="TM2"/>
             <w:tabs>
               <w:tab w:val="right" w:leader="dot" w:pos="9016"/>
             </w:tabs>
             <w:rPr>
               <w:rFonts w:asciiTheme="minorHAnsi" w:eastAsiaTheme="minorEastAsia" w:hAnsiTheme="minorHAnsi" w:cstheme="minorBidi"/>
               <w:noProof/>
-              <w:lang w:eastAsia="en-CH"/>
+              <w:lang/>
             </w:rPr>
           </w:pPr>
           <w:hyperlink w:anchor="_Toc223628750" w:history="1">
             <w:r>
               <w:rPr>
-                <w:rStyle w:val="Hyperlink"/>
+                <w:rStyle w:val="Lienhypertexte"/>
                 <w:noProof/>
               </w:rPr>
               <w:t>Diagramme ER</w:t>
@@ -3064,20 +3064,20 @@
         </w:p>
         <w:p>
           <w:pPr>
-            <w:pStyle w:val="TOC2"/>
+            <w:pStyle w:val="TM2"/>
             <w:tabs>
               <w:tab w:val="right" w:leader="dot" w:pos="9016"/>
             </w:tabs>
             <w:rPr>
               <w:rFonts w:asciiTheme="minorHAnsi" w:eastAsiaTheme="minorEastAsia" w:hAnsiTheme="minorHAnsi" w:cstheme="minorBidi"/>
               <w:noProof/>
-              <w:lang w:eastAsia="en-CH"/>
+              <w:lang/>
             </w:rPr>
           </w:pPr>
           <w:hyperlink w:anchor="_Toc223628751" w:history="1">
             <w:r>
               <w:rPr>
-                <w:rStyle w:val="Hyperlink"/>
+                <w:rStyle w:val="Lienhypertexte"/>
                 <w:noProof/>
               </w:rPr>
               <w:t>Scripts de création / migration</w:t>
@@ -3134,20 +3134,20 @@
         </w:p>
         <w:p>
           <w:pPr>
-            <w:pStyle w:val="TOC2"/>
+            <w:pStyle w:val="TM2"/>
             <w:tabs>
               <w:tab w:val="right" w:leader="dot" w:pos="9016"/>
             </w:tabs>
             <w:rPr>
               <w:rFonts w:asciiTheme="minorHAnsi" w:eastAsiaTheme="minorEastAsia" w:hAnsiTheme="minorHAnsi" w:cstheme="minorBidi"/>
               <w:noProof/>
-              <w:lang w:eastAsia="en-CH"/>
+              <w:lang/>
             </w:rPr>
           </w:pPr>
           <w:hyperlink w:anchor="_Toc223628752" w:history="1">
             <w:r>
               <w:rPr>
-                <w:rStyle w:val="Hyperlink"/>
+                <w:rStyle w:val="Lienhypertexte"/>
                 <w:noProof/>
               </w:rPr>
               <w:t>Exemples de requêtes (recherche, mise à jour garantie)</w:t>
@@ -3204,20 +3204,20 @@
         </w:p>
         <w:p>
           <w:pPr>
-            <w:pStyle w:val="TOC2"/>
+            <w:pStyle w:val="TM2"/>
             <w:tabs>
               <w:tab w:val="right" w:leader="dot" w:pos="9016"/>
             </w:tabs>
             <w:rPr>
               <w:rFonts w:asciiTheme="minorHAnsi" w:eastAsiaTheme="minorEastAsia" w:hAnsiTheme="minorHAnsi" w:cstheme="minorBidi"/>
               <w:noProof/>
-              <w:lang w:eastAsia="en-CH"/>
+              <w:lang/>
             </w:rPr>
           </w:pPr>
           <w:hyperlink w:anchor="_Toc223628753" w:history="1">
             <w:r>
               <w:rPr>
-                <w:rStyle w:val="Hyperlink"/>
+                <w:rStyle w:val="Lienhypertexte"/>
                 <w:noProof/>
               </w:rPr>
               <w:t>Politique de sauvegarde et sécurité des données</w:t>
@@ -3274,20 +3274,20 @@
         </w:p>
         <w:p>
           <w:pPr>
-            <w:pStyle w:val="TOC1"/>
+            <w:pStyle w:val="TM1"/>
             <w:tabs>
               <w:tab w:val="right" w:leader="dot" w:pos="9016"/>
             </w:tabs>
             <w:rPr>
               <w:rFonts w:asciiTheme="minorHAnsi" w:eastAsiaTheme="minorEastAsia" w:hAnsiTheme="minorHAnsi" w:cstheme="minorBidi"/>
               <w:noProof/>
-              <w:lang w:eastAsia="en-CH"/>
+              <w:lang/>
             </w:rPr>
           </w:pPr>
           <w:hyperlink w:anchor="_Toc223628754" w:history="1">
             <w:r>
               <w:rPr>
-                <w:rStyle w:val="Hyperlink"/>
+                <w:rStyle w:val="Lienhypertexte"/>
                 <w:noProof/>
               </w:rPr>
               <w:t>Sécurité et conformité</w:t>
@@ -3344,20 +3344,20 @@
         </w:p>
         <w:p>
           <w:pPr>
-            <w:pStyle w:val="TOC2"/>
+            <w:pStyle w:val="TM2"/>
             <w:tabs>
               <w:tab w:val="right" w:leader="dot" w:pos="9016"/>
             </w:tabs>
             <w:rPr>
               <w:rFonts w:asciiTheme="minorHAnsi" w:eastAsiaTheme="minorEastAsia" w:hAnsiTheme="minorHAnsi" w:cstheme="minorBidi"/>
               <w:noProof/>
-              <w:lang w:eastAsia="en-CH"/>
+              <w:lang/>
             </w:rPr>
           </w:pPr>
           <w:hyperlink w:anchor="_Toc223628755" w:history="1">
             <w:r>
               <w:rPr>
-                <w:rStyle w:val="Hyperlink"/>
+                <w:rStyle w:val="Lienhypertexte"/>
                 <w:noProof/>
               </w:rPr>
               <w:t>Authentification et gestion des sessions</w:t>
@@ -3414,20 +3414,20 @@
         </w:p>
         <w:p>
           <w:pPr>
-            <w:pStyle w:val="TOC2"/>
+            <w:pStyle w:val="TM2"/>
             <w:tabs>
               <w:tab w:val="right" w:leader="dot" w:pos="9016"/>
             </w:tabs>
             <w:rPr>
               <w:rFonts w:asciiTheme="minorHAnsi" w:eastAsiaTheme="minorEastAsia" w:hAnsiTheme="minorHAnsi" w:cstheme="minorBidi"/>
               <w:noProof/>
-              <w:lang w:eastAsia="en-CH"/>
+              <w:lang/>
             </w:rPr>
           </w:pPr>
           <w:hyperlink w:anchor="_Toc223628756" w:history="1">
             <w:r>
               <w:rPr>
-                <w:rStyle w:val="Hyperlink"/>
+                <w:rStyle w:val="Lienhypertexte"/>
                 <w:noProof/>
               </w:rPr>
               <w:t>Contrôle d’accès par rôle</w:t>
@@ -3484,20 +3484,20 @@
         </w:p>
         <w:p>
           <w:pPr>
-            <w:pStyle w:val="TOC2"/>
+            <w:pStyle w:val="TM2"/>
             <w:tabs>
               <w:tab w:val="right" w:leader="dot" w:pos="9016"/>
             </w:tabs>
             <w:rPr>
               <w:rFonts w:asciiTheme="minorHAnsi" w:eastAsiaTheme="minorEastAsia" w:hAnsiTheme="minorHAnsi" w:cstheme="minorBidi"/>
               <w:noProof/>
-              <w:lang w:eastAsia="en-CH"/>
+              <w:lang/>
             </w:rPr>
           </w:pPr>
           <w:hyperlink w:anchor="_Toc223628757" w:history="1">
             <w:r>
               <w:rPr>
-                <w:rStyle w:val="Hyperlink"/>
+                <w:rStyle w:val="Lienhypertexte"/>
                 <w:noProof/>
               </w:rPr>
               <w:t>Sécurisation des communications (HTTPS, en-têtes)</w:t>
@@ -3554,20 +3554,20 @@
         </w:p>
         <w:p>
           <w:pPr>
-            <w:pStyle w:val="TOC2"/>
+            <w:pStyle w:val="TM2"/>
             <w:tabs>
               <w:tab w:val="right" w:leader="dot" w:pos="9016"/>
             </w:tabs>
             <w:rPr>
               <w:rFonts w:asciiTheme="minorHAnsi" w:eastAsiaTheme="minorEastAsia" w:hAnsiTheme="minorHAnsi" w:cstheme="minorBidi"/>
               <w:noProof/>
-              <w:lang w:eastAsia="en-CH"/>
+              <w:lang/>
             </w:rPr>
           </w:pPr>
           <w:hyperlink w:anchor="_Toc223628758" w:history="1">
             <w:r>
               <w:rPr>
-                <w:rStyle w:val="Hyperlink"/>
+                <w:rStyle w:val="Lienhypertexte"/>
                 <w:noProof/>
               </w:rPr>
               <w:t>Protection des données sensibles (chiffrement, stockage)</w:t>
@@ -3624,20 +3624,20 @@
         </w:p>
         <w:p>
           <w:pPr>
-            <w:pStyle w:val="TOC2"/>
+            <w:pStyle w:val="TM2"/>
             <w:tabs>
               <w:tab w:val="right" w:leader="dot" w:pos="9016"/>
             </w:tabs>
             <w:rPr>
               <w:rFonts w:asciiTheme="minorHAnsi" w:eastAsiaTheme="minorEastAsia" w:hAnsiTheme="minorHAnsi" w:cstheme="minorBidi"/>
               <w:noProof/>
-              <w:lang w:eastAsia="en-CH"/>
+              <w:lang/>
             </w:rPr>
           </w:pPr>
           <w:hyperlink w:anchor="_Toc223628759" w:history="1">
             <w:r>
               <w:rPr>
-                <w:rStyle w:val="Hyperlink"/>
+                <w:rStyle w:val="Lienhypertexte"/>
                 <w:noProof/>
               </w:rPr>
               <w:t>Bonnes pratiques de développement et revue de code</w:t>
@@ -3694,20 +3694,20 @@
         </w:p>
         <w:p>
           <w:pPr>
-            <w:pStyle w:val="TOC1"/>
+            <w:pStyle w:val="TM1"/>
             <w:tabs>
               <w:tab w:val="right" w:leader="dot" w:pos="9016"/>
             </w:tabs>
             <w:rPr>
               <w:rFonts w:asciiTheme="minorHAnsi" w:eastAsiaTheme="minorEastAsia" w:hAnsiTheme="minorHAnsi" w:cstheme="minorBidi"/>
               <w:noProof/>
-              <w:lang w:eastAsia="en-CH"/>
+              <w:lang/>
             </w:rPr>
           </w:pPr>
           <w:hyperlink w:anchor="_Toc223628760" w:history="1">
             <w:r>
               <w:rPr>
-                <w:rStyle w:val="Hyperlink"/>
+                <w:rStyle w:val="Lienhypertexte"/>
                 <w:noProof/>
               </w:rPr>
               <w:t>Tests et validation</w:t>
@@ -3764,20 +3764,20 @@
         </w:p>
         <w:p>
           <w:pPr>
-            <w:pStyle w:val="TOC2"/>
+            <w:pStyle w:val="TM2"/>
             <w:tabs>
               <w:tab w:val="right" w:leader="dot" w:pos="9016"/>
             </w:tabs>
             <w:rPr>
               <w:rFonts w:asciiTheme="minorHAnsi" w:eastAsiaTheme="minorEastAsia" w:hAnsiTheme="minorHAnsi" w:cstheme="minorBidi"/>
               <w:noProof/>
-              <w:lang w:eastAsia="en-CH"/>
+              <w:lang/>
             </w:rPr>
           </w:pPr>
           <w:hyperlink w:anchor="_Toc223628761" w:history="1">
             <w:r>
               <w:rPr>
-                <w:rStyle w:val="Hyperlink"/>
+                <w:rStyle w:val="Lienhypertexte"/>
                 <w:noProof/>
               </w:rPr>
               <w:t>Plan de test (cas de test, critères d’acceptation)</w:t>
@@ -3834,20 +3834,20 @@
         </w:p>
         <w:p>
           <w:pPr>
-            <w:pStyle w:val="TOC2"/>
+            <w:pStyle w:val="TM2"/>
             <w:tabs>
               <w:tab w:val="right" w:leader="dot" w:pos="9016"/>
             </w:tabs>
             <w:rPr>
               <w:rFonts w:asciiTheme="minorHAnsi" w:eastAsiaTheme="minorEastAsia" w:hAnsiTheme="minorHAnsi" w:cstheme="minorBidi"/>
               <w:noProof/>
-              <w:lang w:eastAsia="en-CH"/>
+              <w:lang/>
             </w:rPr>
           </w:pPr>
           <w:hyperlink w:anchor="_Toc223628762" w:history="1">
             <w:r>
               <w:rPr>
-                <w:rStyle w:val="Hyperlink"/>
+                <w:rStyle w:val="Lienhypertexte"/>
                 <w:noProof/>
               </w:rPr>
               <w:t>Tests OCR (précision, robustesse sur photos réelles)</w:t>
@@ -3904,20 +3904,20 @@
         </w:p>
         <w:p>
           <w:pPr>
-            <w:pStyle w:val="TOC2"/>
+            <w:pStyle w:val="TM2"/>
             <w:tabs>
               <w:tab w:val="right" w:leader="dot" w:pos="9016"/>
             </w:tabs>
             <w:rPr>
               <w:rFonts w:asciiTheme="minorHAnsi" w:eastAsiaTheme="minorEastAsia" w:hAnsiTheme="minorHAnsi" w:cstheme="minorBidi"/>
               <w:noProof/>
-              <w:lang w:eastAsia="en-CH"/>
+              <w:lang/>
             </w:rPr>
           </w:pPr>
           <w:hyperlink w:anchor="_Toc223628763" w:history="1">
             <w:r>
               <w:rPr>
-                <w:rStyle w:val="Hyperlink"/>
+                <w:rStyle w:val="Lienhypertexte"/>
                 <w:noProof/>
               </w:rPr>
               <w:t>Tests UI/UX (accessibilité, responsive)</w:t>
@@ -3974,20 +3974,20 @@
         </w:p>
         <w:p>
           <w:pPr>
-            <w:pStyle w:val="TOC2"/>
+            <w:pStyle w:val="TM2"/>
             <w:tabs>
               <w:tab w:val="right" w:leader="dot" w:pos="9016"/>
             </w:tabs>
             <w:rPr>
               <w:rFonts w:asciiTheme="minorHAnsi" w:eastAsiaTheme="minorEastAsia" w:hAnsiTheme="minorHAnsi" w:cstheme="minorBidi"/>
               <w:noProof/>
-              <w:lang w:eastAsia="en-CH"/>
+              <w:lang/>
             </w:rPr>
           </w:pPr>
           <w:hyperlink w:anchor="_Toc223628764" w:history="1">
             <w:r>
               <w:rPr>
-                <w:rStyle w:val="Hyperlink"/>
+                <w:rStyle w:val="Lienhypertexte"/>
                 <w:noProof/>
               </w:rPr>
               <w:t>Tests de sécurité (authentification, injections)</w:t>
@@ -4044,20 +4044,20 @@
         </w:p>
         <w:p>
           <w:pPr>
-            <w:pStyle w:val="TOC2"/>
+            <w:pStyle w:val="TM2"/>
             <w:tabs>
               <w:tab w:val="right" w:leader="dot" w:pos="9016"/>
             </w:tabs>
             <w:rPr>
               <w:rFonts w:asciiTheme="minorHAnsi" w:eastAsiaTheme="minorEastAsia" w:hAnsiTheme="minorHAnsi" w:cstheme="minorBidi"/>
               <w:noProof/>
-              <w:lang w:eastAsia="en-CH"/>
+              <w:lang/>
             </w:rPr>
           </w:pPr>
           <w:hyperlink w:anchor="_Toc223628765" w:history="1">
             <w:r>
               <w:rPr>
-                <w:rStyle w:val="Hyperlink"/>
+                <w:rStyle w:val="Lienhypertexte"/>
                 <w:noProof/>
               </w:rPr>
               <w:t>Résultats des tests et corrections</w:t>
@@ -4114,20 +4114,20 @@
         </w:p>
         <w:p>
           <w:pPr>
-            <w:pStyle w:val="TOC1"/>
+            <w:pStyle w:val="TM1"/>
             <w:tabs>
               <w:tab w:val="right" w:leader="dot" w:pos="9016"/>
             </w:tabs>
             <w:rPr>
               <w:rFonts w:asciiTheme="minorHAnsi" w:eastAsiaTheme="minorEastAsia" w:hAnsiTheme="minorHAnsi" w:cstheme="minorBidi"/>
               <w:noProof/>
-              <w:lang w:eastAsia="en-CH"/>
+              <w:lang/>
             </w:rPr>
           </w:pPr>
           <w:hyperlink w:anchor="_Toc223628766" w:history="1">
             <w:r>
               <w:rPr>
-                <w:rStyle w:val="Hyperlink"/>
+                <w:rStyle w:val="Lienhypertexte"/>
                 <w:noProof/>
               </w:rPr>
               <w:t>Manuel utilisateur — Administrateur</w:t>
@@ -4184,20 +4184,20 @@
         </w:p>
         <w:p>
           <w:pPr>
-            <w:pStyle w:val="TOC2"/>
+            <w:pStyle w:val="TM2"/>
             <w:tabs>
               <w:tab w:val="right" w:leader="dot" w:pos="9016"/>
             </w:tabs>
             <w:rPr>
               <w:rFonts w:asciiTheme="minorHAnsi" w:eastAsiaTheme="minorEastAsia" w:hAnsiTheme="minorHAnsi" w:cstheme="minorBidi"/>
               <w:noProof/>
-              <w:lang w:eastAsia="en-CH"/>
+              <w:lang/>
             </w:rPr>
           </w:pPr>
           <w:hyperlink w:anchor="_Toc223628767" w:history="1">
             <w:r>
               <w:rPr>
-                <w:rStyle w:val="Hyperlink"/>
+                <w:rStyle w:val="Lienhypertexte"/>
                 <w:noProof/>
               </w:rPr>
               <w:t>Installation / déploiement</w:t>
@@ -4254,20 +4254,20 @@
         </w:p>
         <w:p>
           <w:pPr>
-            <w:pStyle w:val="TOC2"/>
+            <w:pStyle w:val="TM2"/>
             <w:tabs>
               <w:tab w:val="right" w:leader="dot" w:pos="9016"/>
             </w:tabs>
             <w:rPr>
               <w:rFonts w:asciiTheme="minorHAnsi" w:eastAsiaTheme="minorEastAsia" w:hAnsiTheme="minorHAnsi" w:cstheme="minorBidi"/>
               <w:noProof/>
-              <w:lang w:eastAsia="en-CH"/>
+              <w:lang/>
             </w:rPr>
           </w:pPr>
           <w:hyperlink w:anchor="_Toc223628768" w:history="1">
             <w:r>
               <w:rPr>
-                <w:rStyle w:val="Hyperlink"/>
+                <w:rStyle w:val="Lienhypertexte"/>
                 <w:noProof/>
               </w:rPr>
               <w:t>Gestion des comptes et permissions</w:t>
@@ -4324,20 +4324,20 @@
         </w:p>
         <w:p>
           <w:pPr>
-            <w:pStyle w:val="TOC2"/>
+            <w:pStyle w:val="TM2"/>
             <w:tabs>
               <w:tab w:val="right" w:leader="dot" w:pos="9016"/>
             </w:tabs>
             <w:rPr>
               <w:rFonts w:asciiTheme="minorHAnsi" w:eastAsiaTheme="minorEastAsia" w:hAnsiTheme="minorHAnsi" w:cstheme="minorBidi"/>
               <w:noProof/>
-              <w:lang w:eastAsia="en-CH"/>
+              <w:lang/>
             </w:rPr>
           </w:pPr>
           <w:hyperlink w:anchor="_Toc223628769" w:history="1">
             <w:r>
               <w:rPr>
-                <w:rStyle w:val="Hyperlink"/>
+                <w:rStyle w:val="Lienhypertexte"/>
                 <w:noProof/>
               </w:rPr>
               <w:t>Utilisation: capture photo, correction OCR, recherche, formulaire manuel</w:t>
@@ -4394,20 +4394,20 @@
         </w:p>
         <w:p>
           <w:pPr>
-            <w:pStyle w:val="TOC2"/>
+            <w:pStyle w:val="TM2"/>
             <w:tabs>
               <w:tab w:val="right" w:leader="dot" w:pos="9016"/>
             </w:tabs>
             <w:rPr>
               <w:rFonts w:asciiTheme="minorHAnsi" w:eastAsiaTheme="minorEastAsia" w:hAnsiTheme="minorHAnsi" w:cstheme="minorBidi"/>
               <w:noProof/>
-              <w:lang w:eastAsia="en-CH"/>
+              <w:lang/>
             </w:rPr>
           </w:pPr>
           <w:hyperlink w:anchor="_Toc223628770" w:history="1">
             <w:r>
               <w:rPr>
-                <w:rStyle w:val="Hyperlink"/>
+                <w:rStyle w:val="Lienhypertexte"/>
                 <w:noProof/>
               </w:rPr>
               <w:t>Suivi des garanties et exportations</w:t>
@@ -4464,20 +4464,20 @@
         </w:p>
         <w:p>
           <w:pPr>
-            <w:pStyle w:val="TOC2"/>
+            <w:pStyle w:val="TM2"/>
             <w:tabs>
               <w:tab w:val="right" w:leader="dot" w:pos="9016"/>
             </w:tabs>
             <w:rPr>
               <w:rFonts w:asciiTheme="minorHAnsi" w:eastAsiaTheme="minorEastAsia" w:hAnsiTheme="minorHAnsi" w:cstheme="minorBidi"/>
               <w:noProof/>
-              <w:lang w:eastAsia="en-CH"/>
+              <w:lang/>
             </w:rPr>
           </w:pPr>
           <w:hyperlink w:anchor="_Toc223628771" w:history="1">
             <w:r>
               <w:rPr>
-                <w:rStyle w:val="Hyperlink"/>
+                <w:rStyle w:val="Lienhypertexte"/>
                 <w:noProof/>
               </w:rPr>
               <w:t>Sauvegarde et restauration</w:t>
@@ -4534,20 +4534,20 @@
         </w:p>
         <w:p>
           <w:pPr>
-            <w:pStyle w:val="TOC1"/>
+            <w:pStyle w:val="TM1"/>
             <w:tabs>
               <w:tab w:val="right" w:leader="dot" w:pos="9016"/>
             </w:tabs>
             <w:rPr>
               <w:rFonts w:asciiTheme="minorHAnsi" w:eastAsiaTheme="minorEastAsia" w:hAnsiTheme="minorHAnsi" w:cstheme="minorBidi"/>
               <w:noProof/>
-              <w:lang w:eastAsia="en-CH"/>
+              <w:lang/>
             </w:rPr>
           </w:pPr>
           <w:hyperlink w:anchor="_Toc223628772" w:history="1">
             <w:r>
               <w:rPr>
-                <w:rStyle w:val="Hyperlink"/>
+                <w:rStyle w:val="Lienhypertexte"/>
                 <w:noProof/>
               </w:rPr>
               <w:t>Rapport final</w:t>
@@ -4604,20 +4604,20 @@
         </w:p>
         <w:p>
           <w:pPr>
-            <w:pStyle w:val="TOC2"/>
+            <w:pStyle w:val="TM2"/>
             <w:tabs>
               <w:tab w:val="right" w:leader="dot" w:pos="9016"/>
             </w:tabs>
             <w:rPr>
               <w:rFonts w:asciiTheme="minorHAnsi" w:eastAsiaTheme="minorEastAsia" w:hAnsiTheme="minorHAnsi" w:cstheme="minorBidi"/>
               <w:noProof/>
-              <w:lang w:eastAsia="en-CH"/>
+              <w:lang/>
             </w:rPr>
           </w:pPr>
           <w:hyperlink w:anchor="_Toc223628773" w:history="1">
             <w:r>
               <w:rPr>
-                <w:rStyle w:val="Hyperlink"/>
+                <w:rStyle w:val="Lienhypertexte"/>
                 <w:noProof/>
               </w:rPr>
               <w:t>Résumé exécutif</w:t>
@@ -4674,20 +4674,20 @@
         </w:p>
         <w:p>
           <w:pPr>
-            <w:pStyle w:val="TOC2"/>
+            <w:pStyle w:val="TM2"/>
             <w:tabs>
               <w:tab w:val="right" w:leader="dot" w:pos="9016"/>
             </w:tabs>
             <w:rPr>
               <w:rFonts w:asciiTheme="minorHAnsi" w:eastAsiaTheme="minorEastAsia" w:hAnsiTheme="minorHAnsi" w:cstheme="minorBidi"/>
               <w:noProof/>
-              <w:lang w:eastAsia="en-CH"/>
+              <w:lang/>
             </w:rPr>
           </w:pPr>
           <w:hyperlink w:anchor="_Toc223628774" w:history="1">
             <w:r>
               <w:rPr>
-                <w:rStyle w:val="Hyperlink"/>
+                <w:rStyle w:val="Lienhypertexte"/>
                 <w:noProof/>
               </w:rPr>
               <w:t>Travaux réalisés vs objectifs</w:t>
@@ -4744,20 +4744,20 @@
         </w:p>
         <w:p>
           <w:pPr>
-            <w:pStyle w:val="TOC2"/>
+            <w:pStyle w:val="TM2"/>
             <w:tabs>
               <w:tab w:val="right" w:leader="dot" w:pos="9016"/>
             </w:tabs>
             <w:rPr>
               <w:rFonts w:asciiTheme="minorHAnsi" w:eastAsiaTheme="minorEastAsia" w:hAnsiTheme="minorHAnsi" w:cstheme="minorBidi"/>
               <w:noProof/>
-              <w:lang w:eastAsia="en-CH"/>
+              <w:lang/>
             </w:rPr>
           </w:pPr>
           <w:hyperlink w:anchor="_Toc223628775" w:history="1">
             <w:r>
               <w:rPr>
-                <w:rStyle w:val="Hyperlink"/>
+                <w:rStyle w:val="Lienhypertexte"/>
                 <w:noProof/>
               </w:rPr>
               <w:t>Limites et améliorations futures</w:t>
@@ -4814,20 +4814,20 @@
         </w:p>
         <w:p>
           <w:pPr>
-            <w:pStyle w:val="TOC1"/>
+            <w:pStyle w:val="TM1"/>
             <w:tabs>
               <w:tab w:val="right" w:leader="dot" w:pos="9016"/>
             </w:tabs>
             <w:rPr>
               <w:rFonts w:asciiTheme="minorHAnsi" w:eastAsiaTheme="minorEastAsia" w:hAnsiTheme="minorHAnsi" w:cstheme="minorBidi"/>
               <w:noProof/>
-              <w:lang w:eastAsia="en-CH"/>
+              <w:lang/>
             </w:rPr>
           </w:pPr>
           <w:hyperlink w:anchor="_Toc223628776" w:history="1">
             <w:r>
               <w:rPr>
-                <w:rStyle w:val="Hyperlink"/>
+                <w:rStyle w:val="Lienhypertexte"/>
                 <w:noProof/>
               </w:rPr>
               <w:t>Annexes techniques</w:t>
@@ -4884,20 +4884,20 @@
         </w:p>
         <w:p>
           <w:pPr>
-            <w:pStyle w:val="TOC2"/>
+            <w:pStyle w:val="TM2"/>
             <w:tabs>
               <w:tab w:val="right" w:leader="dot" w:pos="9016"/>
             </w:tabs>
             <w:rPr>
               <w:rFonts w:asciiTheme="minorHAnsi" w:eastAsiaTheme="minorEastAsia" w:hAnsiTheme="minorHAnsi" w:cstheme="minorBidi"/>
               <w:noProof/>
-              <w:lang w:eastAsia="en-CH"/>
+              <w:lang/>
             </w:rPr>
           </w:pPr>
           <w:hyperlink w:anchor="_Toc223628777" w:history="1">
             <w:r>
               <w:rPr>
-                <w:rStyle w:val="Hyperlink"/>
+                <w:rStyle w:val="Lienhypertexte"/>
                 <w:noProof/>
               </w:rPr>
               <w:t>Liens vers le dépôt/versioning (instructions d’accès)</w:t>
@@ -4954,20 +4954,20 @@
         </w:p>
         <w:p>
           <w:pPr>
-            <w:pStyle w:val="TOC2"/>
+            <w:pStyle w:val="TM2"/>
             <w:tabs>
               <w:tab w:val="right" w:leader="dot" w:pos="9016"/>
             </w:tabs>
             <w:rPr>
               <w:rFonts w:asciiTheme="minorHAnsi" w:eastAsiaTheme="minorEastAsia" w:hAnsiTheme="minorHAnsi" w:cstheme="minorBidi"/>
               <w:noProof/>
-              <w:lang w:eastAsia="en-CH"/>
+              <w:lang/>
             </w:rPr>
           </w:pPr>
           <w:hyperlink w:anchor="_Toc223628778" w:history="1">
             <w:r>
               <w:rPr>
-                <w:rStyle w:val="Hyperlink"/>
+                <w:rStyle w:val="Lienhypertexte"/>
                 <w:noProof/>
               </w:rPr>
               <w:t>Sources</w:t>
@@ -5047,7 +5047,7 @@
     </w:p>
     <w:p>
       <w:pPr>
-        <w:pStyle w:val="Heading1"/>
+        <w:pStyle w:val="Titre1"/>
       </w:pPr>
       <w:bookmarkStart w:id="0" w:name="_Toc223628711"/>
       <w:r>
@@ -5058,9 +5058,9 @@
     </w:p>
     <w:p>
       <w:pPr>
-        <w:pStyle w:val="Heading2"/>
-        <w:rPr>
-          <w:rStyle w:val="Heading2Char"/>
+        <w:pStyle w:val="Titre2"/>
+        <w:rPr>
+          <w:rStyle w:val="Titre2Car"/>
           <w:b/>
           <w:bCs/>
         </w:rPr>
@@ -5068,7 +5068,7 @@
       <w:bookmarkStart w:id="1" w:name="_Toc223628712"/>
       <w:r>
         <w:rPr>
-          <w:rStyle w:val="Heading2Char"/>
+          <w:rStyle w:val="Titre2Car"/>
           <w:b/>
           <w:bCs/>
         </w:rPr>
@@ -5078,7 +5078,7 @@
     </w:p>
     <w:tbl>
       <w:tblPr>
-        <w:tblStyle w:val="TableGrid"/>
+        <w:tblStyle w:val="Grilledutableau"/>
         <w:tblW w:w="0" w:type="auto"/>
         <w:tblLook w:val="04A0" w:firstRow="1" w:lastRow="0" w:firstColumn="1" w:lastColumn="0" w:noHBand="0" w:noVBand="1"/>
       </w:tblPr>
@@ -5094,7 +5094,7 @@
           <w:p>
             <w:pPr>
               <w:rPr>
-                <w:rStyle w:val="Heading2Char"/>
+                <w:rStyle w:val="Titre2Car"/>
                 <w:b w:val="0"/>
                 <w:bCs w:val="0"/>
                 <w:color w:val="auto"/>
@@ -5105,7 +5105,7 @@
             <w:bookmarkStart w:id="2" w:name="_Toc223628713"/>
             <w:r>
               <w:rPr>
-                <w:rStyle w:val="Heading2Char"/>
+                <w:rStyle w:val="Titre2Car"/>
                 <w:b w:val="0"/>
                 <w:bCs w:val="0"/>
                 <w:color w:val="auto"/>
@@ -5124,7 +5124,7 @@
           <w:p>
             <w:pPr>
               <w:rPr>
-                <w:rStyle w:val="Heading2Char"/>
+                <w:rStyle w:val="Titre2Car"/>
                 <w:b w:val="0"/>
                 <w:bCs w:val="0"/>
                 <w:color w:val="auto"/>
@@ -5135,7 +5135,7 @@
             <w:bookmarkStart w:id="3" w:name="_Toc223628714"/>
             <w:r>
               <w:rPr>
-                <w:rStyle w:val="Heading2Char"/>
+                <w:rStyle w:val="Titre2Car"/>
                 <w:b w:val="0"/>
                 <w:bCs w:val="0"/>
                 <w:color w:val="auto"/>
@@ -5146,7 +5146,7 @@
             </w:r>
             <w:r>
               <w:rPr>
-                <w:rStyle w:val="Heading2Char"/>
+                <w:rStyle w:val="Titre2Car"/>
                 <w:b w:val="0"/>
                 <w:bCs w:val="0"/>
                 <w:color w:val="auto"/>
@@ -5167,7 +5167,7 @@
           <w:p>
             <w:pPr>
               <w:rPr>
-                <w:rStyle w:val="Heading2Char"/>
+                <w:rStyle w:val="Titre2Car"/>
                 <w:b w:val="0"/>
                 <w:bCs w:val="0"/>
                 <w:color w:val="auto"/>
@@ -5178,7 +5178,7 @@
             <w:bookmarkStart w:id="4" w:name="_Toc223628715"/>
             <w:r>
               <w:rPr>
-                <w:rStyle w:val="Heading2Char"/>
+                <w:rStyle w:val="Titre2Car"/>
                 <w:b w:val="0"/>
                 <w:bCs w:val="0"/>
                 <w:color w:val="auto"/>
@@ -5197,7 +5197,7 @@
           <w:p>
             <w:pPr>
               <w:rPr>
-                <w:rStyle w:val="Heading2Char"/>
+                <w:rStyle w:val="Titre2Car"/>
                 <w:b w:val="0"/>
                 <w:bCs w:val="0"/>
                 <w:color w:val="auto"/>
@@ -5208,7 +5208,7 @@
             <w:bookmarkStart w:id="5" w:name="_Toc223628716"/>
             <w:r>
               <w:rPr>
-                <w:rStyle w:val="Heading2Char"/>
+                <w:rStyle w:val="Titre2Car"/>
                 <w:b w:val="0"/>
                 <w:bCs w:val="0"/>
                 <w:color w:val="auto"/>
@@ -5229,7 +5229,7 @@
           <w:p>
             <w:pPr>
               <w:rPr>
-                <w:rStyle w:val="Heading2Char"/>
+                <w:rStyle w:val="Titre2Car"/>
                 <w:b w:val="0"/>
                 <w:bCs w:val="0"/>
                 <w:color w:val="auto"/>
@@ -5240,7 +5240,7 @@
             <w:bookmarkStart w:id="6" w:name="_Toc223628717"/>
             <w:r>
               <w:rPr>
-                <w:rStyle w:val="Heading2Char"/>
+                <w:rStyle w:val="Titre2Car"/>
                 <w:b w:val="0"/>
                 <w:bCs w:val="0"/>
                 <w:color w:val="auto"/>
@@ -5259,7 +5259,7 @@
           <w:p>
             <w:pPr>
               <w:rPr>
-                <w:rStyle w:val="Heading2Char"/>
+                <w:rStyle w:val="Titre2Car"/>
                 <w:b w:val="0"/>
                 <w:bCs w:val="0"/>
                 <w:color w:val="auto"/>
@@ -5270,7 +5270,7 @@
             <w:bookmarkStart w:id="7" w:name="_Toc223628718"/>
             <w:r>
               <w:rPr>
-                <w:rStyle w:val="Heading2Char"/>
+                <w:rStyle w:val="Titre2Car"/>
                 <w:b w:val="0"/>
                 <w:bCs w:val="0"/>
                 <w:color w:val="auto"/>
@@ -5286,9 +5286,9 @@
     </w:tbl>
     <w:p>
       <w:pPr>
-        <w:pStyle w:val="Heading2"/>
-        <w:rPr>
-          <w:rStyle w:val="Heading2Char"/>
+        <w:pStyle w:val="Titre2"/>
+        <w:rPr>
+          <w:rStyle w:val="Titre2Car"/>
           <w:b/>
           <w:bCs/>
         </w:rPr>
@@ -5296,9 +5296,9 @@
     </w:p>
     <w:p>
       <w:pPr>
-        <w:pStyle w:val="Heading2"/>
-        <w:rPr>
-          <w:rStyle w:val="Heading2Char"/>
+        <w:pStyle w:val="Titre2"/>
+        <w:rPr>
+          <w:rStyle w:val="Titre2Car"/>
           <w:b/>
           <w:bCs/>
         </w:rPr>
@@ -5306,7 +5306,7 @@
       <w:bookmarkStart w:id="8" w:name="_Toc223628719"/>
       <w:r>
         <w:rPr>
-          <w:rStyle w:val="Heading2Char"/>
+          <w:rStyle w:val="Titre2Car"/>
           <w:b/>
           <w:bCs/>
         </w:rPr>
@@ -5321,9 +5321,9 @@
     </w:p>
     <w:p>
       <w:pPr>
-        <w:pStyle w:val="Heading2"/>
-        <w:rPr>
-          <w:rStyle w:val="Heading2Char"/>
+        <w:pStyle w:val="Titre2"/>
+        <w:rPr>
+          <w:rStyle w:val="Titre2Car"/>
           <w:b/>
           <w:bCs/>
         </w:rPr>
@@ -5331,7 +5331,7 @@
       <w:bookmarkStart w:id="9" w:name="_Toc223628720"/>
       <w:r>
         <w:rPr>
-          <w:rStyle w:val="Heading2Char"/>
+          <w:rStyle w:val="Titre2Car"/>
           <w:b/>
           <w:bCs/>
         </w:rPr>
@@ -5346,15 +5346,7 @@
         </w:rPr>
       </w:pPr>
       <w:r>
-        <w:t xml:space="preserve">Grille </w:t>
-      </w:r>
-      <w:proofErr w:type="gramStart"/>
-      <w:r>
-        <w:t>d’évaluation :</w:t>
-      </w:r>
-      <w:proofErr w:type="gramEnd"/>
-      <w:r>
-        <w:t xml:space="preserve"> la grille d’évaluation </w:t>
+        <w:t xml:space="preserve">Grille d’évaluation : la grille d’évaluation </w:t>
       </w:r>
       <w:r>
         <w:rPr>
@@ -5364,52 +5356,132 @@
       </w:r>
     </w:p>
     <w:p>
-      <w:proofErr w:type="gramStart"/>
-      <w:r>
-        <w:t>Planning :</w:t>
-      </w:r>
-      <w:proofErr w:type="gramEnd"/>
-      <w:r>
-        <w:t xml:space="preserve"> risque de retard sur le planning global.</w:t>
-      </w:r>
-    </w:p>
-    <w:p>
-      <w:r>
-        <w:t xml:space="preserve">Dépassement de </w:t>
-      </w:r>
-      <w:proofErr w:type="gramStart"/>
-      <w:r>
-        <w:t>charge :</w:t>
-      </w:r>
-      <w:proofErr w:type="gramEnd"/>
-      <w:r>
-        <w:t xml:space="preserve"> si une tâche prend beaucoup plus de </w:t>
-      </w:r>
-      <w:proofErr w:type="gramStart"/>
-      <w:r>
-        <w:t>temps</w:t>
-      </w:r>
-      <w:proofErr w:type="gramEnd"/>
-      <w:r>
-        <w:t xml:space="preserve"> que prévu, cela impactera les livrables et le calendrier.</w:t>
-      </w:r>
-    </w:p>
-    <w:p>
-      <w:proofErr w:type="gramStart"/>
-      <w:r>
-        <w:t>Absences :</w:t>
-      </w:r>
-      <w:proofErr w:type="gramEnd"/>
-      <w:r>
-        <w:t xml:space="preserve"> indisponibilité possible en cas de maladie ou autres empêchements.</w:t>
-      </w:r>
-    </w:p>
-    <w:p>
-      <w:pPr>
-        <w:pStyle w:val="Heading1"/>
+      <w:r>
+        <w:t>Planning : risque de retard sur le planning global.</w:t>
+      </w:r>
+    </w:p>
+    <w:p>
+      <w:r>
+        <w:t>Dépassement de charge : si une tâche prend beaucoup plus de temps que prévu, cela impactera les livrables et le calendrier.</w:t>
+      </w:r>
+    </w:p>
+    <w:p>
+      <w:pPr>
+        <w:rPr>
+          <w:lang w:val="fr-CH"/>
+        </w:rPr>
+      </w:pPr>
+      <w:r>
+        <w:t>Absences : indisponibilité possible en cas de maladie ou autres empêchements.</w:t>
+      </w:r>
+    </w:p>
+    <w:p>
+      <w:pPr>
+        <w:rPr>
+          <w:lang w:val="fr-CH"/>
+        </w:rPr>
+      </w:pPr>
+      <w:r>
+        <w:rPr>
+          <w:lang w:val="fr-CH"/>
+        </w:rPr>
+        <w:t>Dell doit approuver ma demande d’API car leur api n’est pas publique. Ce qui peut prendre du retard sur le module api.</w:t>
+      </w:r>
+      <w:r>
+        <w:rPr>
+          <w:noProof/>
+        </w:rPr>
+        <w:t xml:space="preserve"> </w:t>
+      </w:r>
+      <w:r>
+        <w:rPr>
+          <w:lang w:val="fr-CH"/>
+        </w:rPr>
+        <w:t xml:space="preserve"> </w:t>
+      </w:r>
+    </w:p>
+    <w:p>
+      <w:pPr>
+        <w:rPr>
+          <w:rFonts w:ascii="Arial Black" w:eastAsiaTheme="majorEastAsia" w:hAnsi="Arial Black" w:cstheme="majorBidi"/>
+          <w:color w:val="0F4761" w:themeColor="accent1" w:themeShade="BF"/>
+          <w:sz w:val="36"/>
+          <w:szCs w:val="36"/>
+        </w:rPr>
       </w:pPr>
       <w:bookmarkStart w:id="10" w:name="_Toc223628721"/>
       <w:r>
+        <w:rPr>
+          <w:lang w:val="fr-CH"/>
+        </w:rPr>
+        <w:drawing>
+          <wp:anchor distT="0" distB="0" distL="114300" distR="114300" simplePos="0" relativeHeight="251660288" behindDoc="1" locked="0" layoutInCell="1" allowOverlap="1" wp14:anchorId="2ACC5BC1" wp14:editId="318A22F2">
+            <wp:simplePos x="0" y="0"/>
+            <wp:positionH relativeFrom="margin">
+              <wp:align>center</wp:align>
+            </wp:positionH>
+            <wp:positionV relativeFrom="paragraph">
+              <wp:posOffset>454148</wp:posOffset>
+            </wp:positionV>
+            <wp:extent cx="6089650" cy="1801495"/>
+            <wp:effectExtent l="0" t="0" r="6350" b="8255"/>
+            <wp:wrapTight wrapText="bothSides">
+              <wp:wrapPolygon edited="0">
+                <wp:start x="0" y="0"/>
+                <wp:lineTo x="0" y="21471"/>
+                <wp:lineTo x="21555" y="21471"/>
+                <wp:lineTo x="21555" y="0"/>
+                <wp:lineTo x="0" y="0"/>
+              </wp:wrapPolygon>
+            </wp:wrapTight>
+            <wp:docPr id="437952586" name="Image 1"/>
+            <wp:cNvGraphicFramePr>
+              <a:graphicFrameLocks xmlns:a="http://schemas.openxmlformats.org/drawingml/2006/main" noChangeAspect="1"/>
+            </wp:cNvGraphicFramePr>
+            <a:graphic xmlns:a="http://schemas.openxmlformats.org/drawingml/2006/main">
+              <a:graphicData uri="http://schemas.openxmlformats.org/drawingml/2006/picture">
+                <pic:pic xmlns:pic="http://schemas.openxmlformats.org/drawingml/2006/picture">
+                  <pic:nvPicPr>
+                    <pic:cNvPr id="437952586" name=""/>
+                    <pic:cNvPicPr/>
+                  </pic:nvPicPr>
+                  <pic:blipFill>
+                    <a:blip r:embed="rId9" cstate="print">
+                      <a:extLst>
+                        <a:ext uri="{28A0092B-C50C-407E-A947-70E740481C1C}">
+                          <a14:useLocalDpi xmlns:a14="http://schemas.microsoft.com/office/drawing/2010/main" val="0"/>
+                        </a:ext>
+                      </a:extLst>
+                    </a:blip>
+                    <a:stretch>
+                      <a:fillRect/>
+                    </a:stretch>
+                  </pic:blipFill>
+                  <pic:spPr>
+                    <a:xfrm>
+                      <a:off x="0" y="0"/>
+                      <a:ext cx="6089650" cy="1801495"/>
+                    </a:xfrm>
+                    <a:prstGeom prst="rect">
+                      <a:avLst/>
+                    </a:prstGeom>
+                  </pic:spPr>
+                </pic:pic>
+              </a:graphicData>
+            </a:graphic>
+          </wp:anchor>
+        </w:drawing>
+      </w:r>
+      <w:r>
+        <w:br w:type="page"/>
+      </w:r>
+    </w:p>
+    <w:p>
+      <w:pPr>
+        <w:pStyle w:val="Titre1"/>
+      </w:pPr>
+      <w:r>
+        <w:lastRenderedPageBreak/>
         <w:t>Procédure et livrables</w:t>
       </w:r>
       <w:bookmarkEnd w:id="10"/>
@@ -5417,13 +5489,13 @@
     <w:p>
       <w:pPr>
         <w:rPr>
-          <w:rStyle w:val="Heading2Char"/>
+          <w:rStyle w:val="Titre2Car"/>
         </w:rPr>
       </w:pPr>
       <w:bookmarkStart w:id="11" w:name="_Toc223628722"/>
       <w:r>
         <w:rPr>
-          <w:rStyle w:val="Heading2Char"/>
+          <w:rStyle w:val="Titre2Car"/>
         </w:rPr>
         <w:t>Règles de réalisation (procédure fournie)</w:t>
       </w:r>
@@ -5467,73 +5539,39 @@
     <w:p>
       <w:pPr>
         <w:rPr>
-          <w:rStyle w:val="Heading2Char"/>
+          <w:rStyle w:val="Titre2Car"/>
         </w:rPr>
       </w:pPr>
       <w:bookmarkStart w:id="12" w:name="_Toc223628723"/>
       <w:r>
         <w:rPr>
-          <w:rStyle w:val="Heading2Char"/>
+          <w:rStyle w:val="Titre2Car"/>
         </w:rPr>
         <w:t>Calendrier des livrables</w:t>
       </w:r>
       <w:bookmarkEnd w:id="12"/>
     </w:p>
     <w:p>
-      <w:proofErr w:type="spellStart"/>
-      <w:r>
-        <w:t>Calendrier</w:t>
-      </w:r>
-      <w:proofErr w:type="spellEnd"/>
-      <w:r>
-        <w:t xml:space="preserve"> des </w:t>
-      </w:r>
-      <w:proofErr w:type="spellStart"/>
-      <w:r>
-        <w:t>livrables</w:t>
-      </w:r>
-      <w:proofErr w:type="spellEnd"/>
-      <w:r>
-        <w:t>:</w:t>
-      </w:r>
-      <w:r>
-        <w:t xml:space="preserve"> Le </w:t>
-      </w:r>
-      <w:proofErr w:type="spellStart"/>
-      <w:r>
-        <w:t>projet</w:t>
-      </w:r>
-      <w:proofErr w:type="spellEnd"/>
-      <w:r>
-        <w:t xml:space="preserve"> </w:t>
-      </w:r>
-      <w:proofErr w:type="spellStart"/>
-      <w:r>
-        <w:t>s’étale</w:t>
-      </w:r>
-      <w:proofErr w:type="spellEnd"/>
-      <w:r>
-        <w:t xml:space="preserve"> sur 107 </w:t>
-      </w:r>
-      <w:proofErr w:type="gramStart"/>
-      <w:r>
-        <w:t>périodes ;</w:t>
-      </w:r>
-      <w:proofErr w:type="gramEnd"/>
-      <w:r>
-        <w:t xml:space="preserve"> un rendu (livrable intermédiaire ou rapport d’avancement) doit être soumis chaque jeudi avant minuit.</w:t>
-      </w:r>
-    </w:p>
-    <w:p>
-      <w:pPr>
-        <w:rPr>
-          <w:rStyle w:val="Heading2Char"/>
+      <w:r>
+        <w:t xml:space="preserve">Calendrier des </w:t>
+      </w:r>
+      <w:r>
+        <w:t>livrables:</w:t>
+      </w:r>
+      <w:r>
+        <w:t xml:space="preserve"> Le projet s’étale sur 107 périodes ; un rendu (livrable intermédiaire ou rapport d’avancement) doit être soumis chaque jeudi avant minuit.</w:t>
+      </w:r>
+    </w:p>
+    <w:p>
+      <w:pPr>
+        <w:rPr>
+          <w:rStyle w:val="Titre2Car"/>
         </w:rPr>
       </w:pPr>
       <w:bookmarkStart w:id="13" w:name="_Toc223628724"/>
       <w:r>
         <w:rPr>
-          <w:rStyle w:val="Heading2Char"/>
+          <w:rStyle w:val="Titre2Car"/>
         </w:rPr>
         <w:t>Journal de travail (format et fréquence)</w:t>
       </w:r>
@@ -5553,73 +5591,32 @@
     <w:p>
       <w:pPr>
         <w:rPr>
-          <w:rStyle w:val="Heading2Char"/>
+          <w:rStyle w:val="Titre2Car"/>
         </w:rPr>
       </w:pPr>
       <w:bookmarkStart w:id="14" w:name="_Toc223628725"/>
       <w:r>
         <w:rPr>
-          <w:rStyle w:val="Heading2Char"/>
-        </w:rPr>
-        <w:lastRenderedPageBreak/>
+          <w:rStyle w:val="Titre2Car"/>
+        </w:rPr>
         <w:t>Gestion des versions et archivage</w:t>
       </w:r>
       <w:bookmarkEnd w:id="14"/>
     </w:p>
     <w:p>
       <w:r>
-        <w:t xml:space="preserve">La gestion des versions et l’archivage </w:t>
-      </w:r>
-      <w:proofErr w:type="spellStart"/>
-      <w:r>
-        <w:t>sont</w:t>
-      </w:r>
-      <w:proofErr w:type="spellEnd"/>
-      <w:r>
-        <w:t xml:space="preserve"> </w:t>
-      </w:r>
-      <w:proofErr w:type="spellStart"/>
-      <w:r>
-        <w:t>assurés</w:t>
-      </w:r>
-      <w:proofErr w:type="spellEnd"/>
-      <w:r>
-        <w:t xml:space="preserve"> via </w:t>
+        <w:t xml:space="preserve">La gestion des versions et l’archivage sont assurés via </w:t>
       </w:r>
       <w:r>
         <w:t>GitHub:</w:t>
       </w:r>
       <w:r>
-        <w:t xml:space="preserve"> </w:t>
-      </w:r>
-      <w:proofErr w:type="spellStart"/>
-      <w:r>
-        <w:t>chaque</w:t>
-      </w:r>
-      <w:proofErr w:type="spellEnd"/>
-      <w:r>
-        <w:t xml:space="preserve"> commit </w:t>
-      </w:r>
-      <w:proofErr w:type="spellStart"/>
-      <w:r>
-        <w:t>constitue</w:t>
-      </w:r>
-      <w:proofErr w:type="spellEnd"/>
-      <w:r>
-        <w:t xml:space="preserve"> </w:t>
-      </w:r>
-      <w:proofErr w:type="gramStart"/>
-      <w:r>
-        <w:t>un point</w:t>
-      </w:r>
-      <w:proofErr w:type="gramEnd"/>
-      <w:r>
-        <w:t xml:space="preserve"> de suivi et de sauvegarde permettant de revenir à des versions antérieures et d’historiser l’évolution du projet.</w:t>
-      </w:r>
-    </w:p>
-    <w:p>
-      <w:pPr>
-        <w:pStyle w:val="Heading1"/>
+        <w:t xml:space="preserve"> chaque commit constitue un point de suivi et de sauvegarde permettant de revenir à des versions antérieures et d’historiser l’évolution du projet.</w:t>
+      </w:r>
+    </w:p>
+    <w:p>
+      <w:pPr>
+        <w:pStyle w:val="Titre1"/>
       </w:pPr>
       <w:bookmarkStart w:id="15" w:name="_Toc223628726"/>
       <w:r>
@@ -5630,13 +5627,13 @@
     <w:p>
       <w:pPr>
         <w:rPr>
-          <w:rStyle w:val="Heading2Char"/>
+          <w:rStyle w:val="Titre2Car"/>
         </w:rPr>
       </w:pPr>
       <w:bookmarkStart w:id="16" w:name="_Toc223628727"/>
       <w:r>
         <w:rPr>
-          <w:rStyle w:val="Heading2Char"/>
+          <w:rStyle w:val="Titre2Car"/>
         </w:rPr>
         <w:t>Liste des fonctionnalités (priorisées: MMP Minimum, Nice-to-have)</w:t>
       </w:r>
@@ -5644,7 +5641,7 @@
     </w:p>
     <w:tbl>
       <w:tblPr>
-        <w:tblStyle w:val="TableGrid"/>
+        <w:tblStyle w:val="Grilledutableau"/>
         <w:tblW w:w="0" w:type="auto"/>
         <w:tblLook w:val="04A0" w:firstRow="1" w:lastRow="0" w:firstColumn="1" w:lastColumn="0" w:noHBand="0" w:noVBand="1"/>
       </w:tblPr>
@@ -5704,15 +5701,7 @@
           </w:tcPr>
           <w:p>
             <w:r>
-              <w:t xml:space="preserve">Capture du numéro de </w:t>
-            </w:r>
-            <w:proofErr w:type="gramStart"/>
-            <w:r>
-              <w:t>série :</w:t>
-            </w:r>
-            <w:proofErr w:type="gramEnd"/>
-            <w:r>
-              <w:t xml:space="preserve"> saisie manuelle et capture photo avec OCR.</w:t>
+              <w:t>Capture du numéro de série : saisie manuelle et capture photo avec OCR.</w:t>
             </w:r>
           </w:p>
         </w:tc>
@@ -5757,7 +5746,7 @@
     <w:p>
       <w:pPr>
         <w:rPr>
-          <w:rStyle w:val="Heading2Char"/>
+          <w:rStyle w:val="Titre2Car"/>
           <w:b w:val="0"/>
           <w:bCs w:val="0"/>
           <w:color w:val="auto"/>
@@ -5768,7 +5757,7 @@
     </w:p>
     <w:tbl>
       <w:tblPr>
-        <w:tblStyle w:val="TableGrid"/>
+        <w:tblStyle w:val="Grilledutableau"/>
         <w:tblW w:w="0" w:type="auto"/>
         <w:tblLook w:val="04A0" w:firstRow="1" w:lastRow="0" w:firstColumn="1" w:lastColumn="0" w:noHBand="0" w:noVBand="1"/>
       </w:tblPr>
@@ -5783,7 +5772,7 @@
           <w:p>
             <w:pPr>
               <w:rPr>
-                <w:rStyle w:val="Heading2Char"/>
+                <w:rStyle w:val="Titre2Car"/>
                 <w:color w:val="auto"/>
                 <w:sz w:val="24"/>
                 <w:szCs w:val="24"/>
@@ -5792,7 +5781,7 @@
             <w:bookmarkStart w:id="17" w:name="_Toc223628728"/>
             <w:r>
               <w:rPr>
-                <w:rStyle w:val="Heading2Char"/>
+                <w:rStyle w:val="Titre2Car"/>
                 <w:color w:val="auto"/>
                 <w:sz w:val="24"/>
                 <w:szCs w:val="24"/>
@@ -5801,7 +5790,7 @@
             </w:r>
             <w:r>
               <w:rPr>
-                <w:rStyle w:val="Heading2Char"/>
+                <w:rStyle w:val="Titre2Car"/>
                 <w:color w:val="auto"/>
                 <w:sz w:val="24"/>
                 <w:szCs w:val="24"/>
@@ -5810,7 +5799,7 @@
             </w:r>
             <w:r>
               <w:rPr>
-                <w:rStyle w:val="Heading2Char"/>
+                <w:rStyle w:val="Titre2Car"/>
                 <w:color w:val="auto"/>
                 <w:sz w:val="24"/>
                 <w:szCs w:val="24"/>
@@ -5819,7 +5808,7 @@
             </w:r>
             <w:r>
               <w:rPr>
-                <w:rStyle w:val="Heading2Char"/>
+                <w:rStyle w:val="Titre2Car"/>
                 <w:color w:val="auto"/>
                 <w:sz w:val="24"/>
                 <w:szCs w:val="24"/>
@@ -5828,7 +5817,7 @@
             </w:r>
             <w:r>
               <w:rPr>
-                <w:rStyle w:val="Heading2Char"/>
+                <w:rStyle w:val="Titre2Car"/>
                 <w:color w:val="auto"/>
                 <w:sz w:val="24"/>
                 <w:szCs w:val="24"/>
@@ -5847,7 +5836,7 @@
           <w:p>
             <w:pPr>
               <w:rPr>
-                <w:rStyle w:val="Heading2Char"/>
+                <w:rStyle w:val="Titre2Car"/>
                 <w:b w:val="0"/>
                 <w:bCs w:val="0"/>
                 <w:color w:val="auto"/>
@@ -5878,7 +5867,7 @@
           <w:p>
             <w:pPr>
               <w:rPr>
-                <w:rStyle w:val="Heading2Char"/>
+                <w:rStyle w:val="Titre2Car"/>
                 <w:b w:val="0"/>
                 <w:bCs w:val="0"/>
                 <w:color w:val="auto"/>
@@ -5900,7 +5889,7 @@
           <w:p>
             <w:pPr>
               <w:rPr>
-                <w:rStyle w:val="Heading2Char"/>
+                <w:rStyle w:val="Titre2Car"/>
                 <w:b w:val="0"/>
                 <w:bCs w:val="0"/>
                 <w:color w:val="auto"/>
@@ -5922,7 +5911,7 @@
           <w:p>
             <w:pPr>
               <w:rPr>
-                <w:rStyle w:val="Heading2Char"/>
+                <w:rStyle w:val="Titre2Car"/>
                 <w:b w:val="0"/>
                 <w:bCs w:val="0"/>
                 <w:color w:val="auto"/>
@@ -5940,20 +5929,20 @@
     <w:p>
       <w:pPr>
         <w:rPr>
-          <w:rStyle w:val="Heading2Char"/>
-        </w:rPr>
-      </w:pPr>
-    </w:p>
-    <w:p>
-      <w:pPr>
-        <w:rPr>
-          <w:rStyle w:val="Heading2Char"/>
+          <w:rStyle w:val="Titre2Car"/>
+        </w:rPr>
+      </w:pPr>
+    </w:p>
+    <w:p>
+      <w:pPr>
+        <w:rPr>
+          <w:rStyle w:val="Titre2Car"/>
         </w:rPr>
       </w:pPr>
       <w:bookmarkStart w:id="18" w:name="_Toc223628729"/>
       <w:r>
         <w:rPr>
-          <w:rStyle w:val="Heading2Char"/>
+          <w:rStyle w:val="Titre2Car"/>
         </w:rPr>
         <w:t>Rôles utilisateurs et cas d’utilisation (authentification, rôles)</w:t>
       </w:r>
@@ -5966,31 +5955,25 @@
           <w:bCs/>
         </w:rPr>
       </w:pPr>
-      <w:proofErr w:type="gramStart"/>
       <w:r>
         <w:rPr>
           <w:b/>
           <w:bCs/>
         </w:rPr>
+        <w:lastRenderedPageBreak/>
         <w:t>Rôle :</w:t>
       </w:r>
-      <w:proofErr w:type="gramEnd"/>
-    </w:p>
-    <w:p>
-      <w:pPr>
-        <w:pStyle w:val="ListParagraph"/>
+    </w:p>
+    <w:p>
+      <w:pPr>
+        <w:pStyle w:val="Paragraphedeliste"/>
         <w:numPr>
           <w:ilvl w:val="0"/>
           <w:numId w:val="37"/>
         </w:numPr>
       </w:pPr>
-      <w:proofErr w:type="gramStart"/>
-      <w:r>
-        <w:t>Administrateur :</w:t>
-      </w:r>
-      <w:proofErr w:type="gramEnd"/>
-      <w:r>
-        <w:t xml:space="preserve"> rôle unique disposant de tous les droits (ajout/modification/suppression d’enregistrements, export CSV, gestion des tags et paramètres).</w:t>
+      <w:r>
+        <w:t>Administrateur : rôle unique disposant de tous les droits (ajout/modification/suppression d’enregistrements, export CSV, gestion des tags et paramètres).</w:t>
       </w:r>
     </w:p>
     <w:p>
@@ -6000,7 +5983,6 @@
           <w:bCs/>
         </w:rPr>
       </w:pPr>
-      <w:proofErr w:type="gramStart"/>
       <w:r>
         <w:rPr>
           <w:b/>
@@ -6015,7 +5997,6 @@
         </w:rPr>
         <w:t xml:space="preserve"> :</w:t>
       </w:r>
-      <w:proofErr w:type="gramEnd"/>
     </w:p>
     <w:p>
       <w:r>
@@ -6024,180 +6005,95 @@
     </w:p>
     <w:p>
       <w:r>
-        <w:t xml:space="preserve">Utilisateurs non authentifiés peuvent effectuer des recherches et consulter les </w:t>
-      </w:r>
-      <w:proofErr w:type="gramStart"/>
-      <w:r>
-        <w:t>informations</w:t>
-      </w:r>
-      <w:proofErr w:type="gramEnd"/>
-      <w:r>
-        <w:t xml:space="preserve"> des appareils en lecture seule, mais ne peuvent </w:t>
-      </w:r>
-      <w:proofErr w:type="gramStart"/>
-      <w:r>
-        <w:t>pas</w:t>
-      </w:r>
-      <w:proofErr w:type="gramEnd"/>
-      <w:r>
-        <w:t xml:space="preserve"> modifier ni exporter de données.</w:t>
-      </w:r>
-    </w:p>
-    <w:p>
-      <w:r>
-        <w:br w:type="page"/>
-      </w:r>
-    </w:p>
-    <w:p>
-      <w:pPr>
+        <w:t>Utilisateurs non authentifiés peuvent effectuer des recherches et consulter les informations des appareils en lecture seule, mais ne peuvent pas modifier ni exporter de données.</w:t>
+      </w:r>
+    </w:p>
+    <w:p>
+      <w:r>
         <w:rPr>
           <w:b/>
           <w:bCs/>
         </w:rPr>
-      </w:pPr>
+        <w:t>Cas d’utilisation principaux</w:t>
+      </w:r>
       <w:r>
         <w:rPr>
           <w:b/>
           <w:bCs/>
         </w:rPr>
-        <w:lastRenderedPageBreak/>
-        <w:t xml:space="preserve">Cas d’utilisation </w:t>
-      </w:r>
-      <w:proofErr w:type="gramStart"/>
-      <w:r>
-        <w:rPr>
-          <w:b/>
-          <w:bCs/>
-        </w:rPr>
-        <w:t>principaux</w:t>
-      </w:r>
-      <w:r>
-        <w:rPr>
-          <w:b/>
-          <w:bCs/>
-        </w:rPr>
         <w:t xml:space="preserve"> :</w:t>
       </w:r>
-      <w:proofErr w:type="gramEnd"/>
-    </w:p>
-    <w:p>
-      <w:pPr>
-        <w:pStyle w:val="ListParagraph"/>
+    </w:p>
+    <w:p>
+      <w:pPr>
+        <w:pStyle w:val="Paragraphedeliste"/>
         <w:numPr>
           <w:ilvl w:val="0"/>
           <w:numId w:val="36"/>
         </w:numPr>
       </w:pPr>
       <w:r>
-        <w:t>Connexion (admin</w:t>
-      </w:r>
-      <w:proofErr w:type="gramStart"/>
-      <w:r>
-        <w:t>) :</w:t>
-      </w:r>
-      <w:proofErr w:type="gramEnd"/>
-      <w:r>
-        <w:t xml:space="preserve"> saisie des identifiants, ouverture de session avec tous les droits.</w:t>
-      </w:r>
-    </w:p>
-    <w:p>
-      <w:pPr>
-        <w:pStyle w:val="ListParagraph"/>
+        <w:t>Connexion (admin) : saisie des identifiants, ouverture de session avec tous les droits.</w:t>
+      </w:r>
+    </w:p>
+    <w:p>
+      <w:pPr>
+        <w:pStyle w:val="Paragraphedeliste"/>
         <w:numPr>
           <w:ilvl w:val="0"/>
           <w:numId w:val="36"/>
         </w:numPr>
       </w:pPr>
       <w:r>
-        <w:t>Recherche et consultation (non authentifié ou admin</w:t>
-      </w:r>
-      <w:proofErr w:type="gramStart"/>
-      <w:r>
-        <w:t>) :</w:t>
-      </w:r>
-      <w:proofErr w:type="gramEnd"/>
-      <w:r>
-        <w:t xml:space="preserve"> recherche par tags et visualisation des détails des appareils (lecture seule si non authentifié).</w:t>
-      </w:r>
-    </w:p>
-    <w:p>
-      <w:pPr>
-        <w:pStyle w:val="ListParagraph"/>
+        <w:t>Recherche et consultation (non authentifié ou admin) : recherche par tags et visualisation des détails des appareils (lecture seule si non authentifié).</w:t>
+      </w:r>
+    </w:p>
+    <w:p>
+      <w:pPr>
+        <w:pStyle w:val="Paragraphedeliste"/>
         <w:numPr>
           <w:ilvl w:val="0"/>
           <w:numId w:val="36"/>
         </w:numPr>
       </w:pPr>
       <w:r>
-        <w:t>Capture et ajout d’appareils (admin</w:t>
-      </w:r>
-      <w:proofErr w:type="gramStart"/>
-      <w:r>
-        <w:t>) :</w:t>
-      </w:r>
-      <w:proofErr w:type="gramEnd"/>
-      <w:r>
-        <w:t xml:space="preserve"> saisie manuelle ou capture photo + OCR, correction éventuelle, validation et affectation de tags/statut.</w:t>
-      </w:r>
-    </w:p>
-    <w:p>
-      <w:pPr>
-        <w:pStyle w:val="ListParagraph"/>
+        <w:t>Capture et ajout d’appareils (admin) : saisie manuelle ou capture photo + OCR, correction éventuelle, validation et affectation de tags/statut.</w:t>
+      </w:r>
+    </w:p>
+    <w:p>
+      <w:pPr>
+        <w:pStyle w:val="Paragraphedeliste"/>
         <w:numPr>
           <w:ilvl w:val="0"/>
           <w:numId w:val="36"/>
         </w:numPr>
       </w:pPr>
       <w:r>
-        <w:t>Modification et suppression d’enregistrements (admin</w:t>
-      </w:r>
-      <w:proofErr w:type="gramStart"/>
-      <w:r>
-        <w:t>) :</w:t>
-      </w:r>
-      <w:proofErr w:type="gramEnd"/>
-      <w:r>
-        <w:t xml:space="preserve"> édition des champs, suppression d’entrées erronées.</w:t>
-      </w:r>
-    </w:p>
-    <w:p>
-      <w:pPr>
-        <w:pStyle w:val="ListParagraph"/>
+        <w:t>Modification et suppression d’enregistrements (admin) : édition des champs, suppression d’entrées erronées.</w:t>
+      </w:r>
+    </w:p>
+    <w:p>
+      <w:pPr>
+        <w:pStyle w:val="Paragraphedeliste"/>
         <w:numPr>
           <w:ilvl w:val="0"/>
           <w:numId w:val="36"/>
         </w:numPr>
       </w:pPr>
       <w:r>
-        <w:t>Export CSV (admin</w:t>
-      </w:r>
-      <w:proofErr w:type="gramStart"/>
-      <w:r>
-        <w:t>) :</w:t>
-      </w:r>
-      <w:proofErr w:type="gramEnd"/>
-      <w:r>
-        <w:t xml:space="preserve"> export des résultats de recherche filtrés par tags.</w:t>
-      </w:r>
-    </w:p>
-    <w:p>
-      <w:pPr>
-        <w:pStyle w:val="ListParagraph"/>
+        <w:t>Export CSV (admin) : export des résultats de recherche filtrés par tags.</w:t>
+      </w:r>
+    </w:p>
+    <w:p>
+      <w:pPr>
+        <w:pStyle w:val="Paragraphedeliste"/>
         <w:numPr>
           <w:ilvl w:val="0"/>
           <w:numId w:val="36"/>
         </w:numPr>
       </w:pPr>
       <w:r>
-        <w:t>Gestion des tags et paramètres (admin</w:t>
-      </w:r>
-      <w:proofErr w:type="gramStart"/>
-      <w:r>
-        <w:t>) :</w:t>
-      </w:r>
-      <w:proofErr w:type="gramEnd"/>
-      <w:r>
-        <w:t xml:space="preserve"> création, modification et suppression de tags et réglages système</w:t>
+        <w:t>Gestion des tags et paramètres (admin) : création, modification et suppression de tags et réglages système</w:t>
       </w:r>
       <w:r>
         <w:t>.</w:t>
@@ -6205,12 +6101,12 @@
     </w:p>
     <w:p>
       <w:pPr>
-        <w:pStyle w:val="ListParagraph"/>
-      </w:pPr>
-    </w:p>
-    <w:p>
-      <w:pPr>
-        <w:pStyle w:val="Heading1"/>
+        <w:pStyle w:val="Paragraphedeliste"/>
+      </w:pPr>
+    </w:p>
+    <w:p>
+      <w:pPr>
+        <w:pStyle w:val="Titre1"/>
         <w:rPr>
           <w:b/>
           <w:bCs/>
@@ -6228,13 +6124,13 @@
     <w:p>
       <w:pPr>
         <w:rPr>
-          <w:rStyle w:val="Heading2Char"/>
+          <w:rStyle w:val="Titre2Car"/>
         </w:rPr>
       </w:pPr>
       <w:bookmarkStart w:id="20" w:name="_Toc223628731"/>
       <w:r>
         <w:rPr>
-          <w:rStyle w:val="Heading2Char"/>
+          <w:rStyle w:val="Titre2Car"/>
         </w:rPr>
         <w:t>Technologies retenues (stack, frameworks, bibliothèques OCR)</w:t>
       </w:r>
@@ -6247,16 +6143,20 @@
       <w:r>
         <w:t xml:space="preserve">echnologies retenues </w:t>
       </w:r>
-      <w:proofErr w:type="gramStart"/>
       <w:r>
         <w:t xml:space="preserve">sont </w:t>
       </w:r>
       <w:r>
-        <w:t>:</w:t>
-      </w:r>
-      <w:proofErr w:type="gramEnd"/>
-      <w:r>
-        <w:t xml:space="preserve"> Python 3.13, Streamlit, SQLite</w:t>
+        <w:t>: Python 3.1</w:t>
+      </w:r>
+      <w:r>
+        <w:rPr>
+          <w:lang w:val="fr-CH"/>
+        </w:rPr>
+        <w:t>2</w:t>
+      </w:r>
+      <w:r>
+        <w:t>, Streamlit, SQLite</w:t>
       </w:r>
       <w:r>
         <w:t>3</w:t>
@@ -6272,7 +6172,7 @@
       <w:bookmarkStart w:id="21" w:name="_Toc223628732"/>
       <w:r>
         <w:rPr>
-          <w:rStyle w:val="Heading2Char"/>
+          <w:rStyle w:val="Titre2Car"/>
         </w:rPr>
         <w:t>Base de données (modèle relationnel)</w:t>
       </w:r>
@@ -6282,7 +6182,7 @@
       <w:bookmarkStart w:id="22" w:name="_Toc223628733"/>
       <w:r>
         <w:rPr>
-          <w:rStyle w:val="Heading2Char"/>
+          <w:rStyle w:val="Titre2Car"/>
         </w:rPr>
         <w:t>API externes (fabricants) — spécifications d’intégration</w:t>
       </w:r>
@@ -6292,7 +6192,7 @@
       <w:bookmarkStart w:id="23" w:name="_Toc223628734"/>
       <w:r>
         <w:rPr>
-          <w:rStyle w:val="Heading2Char"/>
+          <w:rStyle w:val="Titre2Car"/>
         </w:rPr>
         <w:t>Sécurité (authentification, autorisations, stockage des données)</w:t>
       </w:r>
@@ -6301,13 +6201,13 @@
     <w:p>
       <w:pPr>
         <w:rPr>
-          <w:rStyle w:val="Heading2Char"/>
+          <w:rStyle w:val="Titre2Car"/>
         </w:rPr>
       </w:pPr>
       <w:bookmarkStart w:id="24" w:name="_Toc223628735"/>
       <w:r>
         <w:rPr>
-          <w:rStyle w:val="Heading2Char"/>
+          <w:rStyle w:val="Titre2Car"/>
         </w:rPr>
         <w:t>Contraintes de déploiement et environnements (dev/test/prod)</w:t>
       </w:r>
@@ -6329,7 +6229,7 @@
     </w:p>
     <w:p>
       <w:pPr>
-        <w:pStyle w:val="Heading1"/>
+        <w:pStyle w:val="Titre1"/>
       </w:pPr>
       <w:bookmarkStart w:id="25" w:name="_Toc223628736"/>
       <w:r>
@@ -6341,27 +6241,27 @@
     <w:p>
       <w:pPr>
         <w:rPr>
-          <w:rStyle w:val="Heading2Char"/>
+          <w:rStyle w:val="Titre2Car"/>
           <w:lang w:val="fr-CH"/>
         </w:rPr>
       </w:pPr>
       <w:bookmarkStart w:id="26" w:name="_Toc223628737"/>
       <w:r>
         <w:rPr>
-          <w:rStyle w:val="Heading2Char"/>
+          <w:rStyle w:val="Titre2Car"/>
         </w:rPr>
         <w:t>Analyse des besoins (fonctionnels &amp; non</w:t>
       </w:r>
       <w:r>
         <w:rPr>
-          <w:rStyle w:val="Heading2Char"/>
+          <w:rStyle w:val="Titre2Car"/>
           <w:rFonts w:ascii="Cambria Math" w:hAnsi="Cambria Math" w:cs="Cambria Math"/>
         </w:rPr>
         <w:t>‑</w:t>
       </w:r>
       <w:r>
         <w:rPr>
-          <w:rStyle w:val="Heading2Char"/>
+          <w:rStyle w:val="Titre2Car"/>
         </w:rPr>
         <w:t>fonctionnels)</w:t>
       </w:r>
@@ -6379,26 +6279,12 @@
         <w:rPr>
           <w:lang w:val="fr-CH"/>
         </w:rPr>
-        <w:t xml:space="preserve">Une maquette visuelle a été réalisée sur </w:t>
-      </w:r>
-      <w:proofErr w:type="spellStart"/>
-      <w:r>
-        <w:rPr>
-          <w:lang w:val="fr-CH"/>
-        </w:rPr>
-        <w:t>Figma</w:t>
-      </w:r>
-      <w:proofErr w:type="spellEnd"/>
-      <w:r>
-        <w:rPr>
-          <w:lang w:val="fr-CH"/>
-        </w:rPr>
-        <w:t xml:space="preserve"> afin de concevoir l’interface utilisateur avant l’implémentation :</w:t>
-      </w:r>
-    </w:p>
-    <w:p>
-      <w:pPr>
-        <w:pStyle w:val="ListParagraph"/>
+        <w:t>Une maquette visuelle a été réalisée sur Figma afin de concevoir l’interface utilisateur avant l’implémentation :</w:t>
+      </w:r>
+    </w:p>
+    <w:p>
+      <w:pPr>
+        <w:pStyle w:val="Paragraphedeliste"/>
         <w:numPr>
           <w:ilvl w:val="0"/>
           <w:numId w:val="40"/>
@@ -6435,7 +6321,7 @@
       <w:bookmarkStart w:id="27" w:name="_Toc223628738"/>
       <w:r>
         <w:rPr>
-          <w:rStyle w:val="Heading2Char"/>
+          <w:rStyle w:val="Titre2Car"/>
         </w:rPr>
         <w:t>Cas d’utilisation</w:t>
       </w:r>
@@ -6444,13 +6330,13 @@
     <w:p>
       <w:pPr>
         <w:rPr>
-          <w:rStyle w:val="Heading2Char"/>
+          <w:rStyle w:val="Titre2Car"/>
         </w:rPr>
       </w:pPr>
       <w:bookmarkStart w:id="28" w:name="_Toc223628739"/>
       <w:r>
         <w:rPr>
-          <w:rStyle w:val="Heading2Char"/>
+          <w:rStyle w:val="Titre2Car"/>
         </w:rPr>
         <w:t>Diagramme de classes / modèle de données</w:t>
       </w:r>
@@ -6458,7 +6344,7 @@
     </w:p>
     <w:p>
       <w:pPr>
-        <w:pStyle w:val="Heading1"/>
+        <w:pStyle w:val="Titre1"/>
       </w:pPr>
       <w:bookmarkStart w:id="29" w:name="_Toc223628740"/>
       <w:r>
@@ -6479,7 +6365,7 @@
     </w:p>
     <w:p>
       <w:pPr>
-        <w:pStyle w:val="Heading2"/>
+        <w:pStyle w:val="Titre2"/>
       </w:pPr>
       <w:bookmarkStart w:id="30" w:name="_Toc223628741"/>
       <w:r>
@@ -6489,7 +6375,7 @@
     </w:p>
     <w:p>
       <w:pPr>
-        <w:pStyle w:val="Heading2"/>
+        <w:pStyle w:val="Titre2"/>
       </w:pPr>
       <w:bookmarkStart w:id="31" w:name="_Toc223628742"/>
       <w:r>
@@ -6500,7 +6386,7 @@
     <w:p/>
     <w:p>
       <w:pPr>
-        <w:pStyle w:val="Heading1"/>
+        <w:pStyle w:val="Titre1"/>
       </w:pPr>
       <w:bookmarkStart w:id="32" w:name="_Toc223628743"/>
       <w:r>
@@ -6510,175 +6396,24 @@
     </w:p>
     <w:p>
       <w:pPr>
-        <w:pStyle w:val="Heading2"/>
+        <w:pStyle w:val="Titre2"/>
       </w:pPr>
       <w:bookmarkStart w:id="33" w:name="_Toc223628744"/>
-      <w:proofErr w:type="spellStart"/>
-      <w:r>
-        <w:t>Intégration</w:t>
-      </w:r>
-      <w:proofErr w:type="spellEnd"/>
-      <w:r>
-        <w:t xml:space="preserve"> </w:t>
-      </w:r>
-      <w:proofErr w:type="gramStart"/>
-      <w:r>
-        <w:t>OCR :</w:t>
-      </w:r>
-      <w:proofErr w:type="gramEnd"/>
-      <w:r>
-        <w:t xml:space="preserve"> choix de la bibliothèque, flux de </w:t>
-      </w:r>
-      <w:proofErr w:type="spellStart"/>
-      <w:r>
-        <w:t>traitement</w:t>
-      </w:r>
-      <w:proofErr w:type="spellEnd"/>
-      <w:r>
-        <w:t xml:space="preserve"> </w:t>
-      </w:r>
-      <w:proofErr w:type="spellStart"/>
-      <w:r>
-        <w:t>d’image</w:t>
+      <w:r>
+        <w:t>Intégration OCR : choix de la bibliothèque, flux de traitement d’image</w:t>
       </w:r>
       <w:bookmarkEnd w:id="33"/>
-      <w:proofErr w:type="spellEnd"/>
-    </w:p>
-    <w:p>
-      <w:r>
-        <w:t xml:space="preserve">Pour le choix de </w:t>
-      </w:r>
-      <w:proofErr w:type="spellStart"/>
-      <w:r>
-        <w:t>l’OCR</w:t>
-      </w:r>
-      <w:proofErr w:type="spellEnd"/>
-      <w:r>
-        <w:t xml:space="preserve">, </w:t>
-      </w:r>
-      <w:proofErr w:type="spellStart"/>
-      <w:r>
-        <w:t>j’avais</w:t>
-      </w:r>
-      <w:proofErr w:type="spellEnd"/>
-      <w:r>
-        <w:t xml:space="preserve"> </w:t>
-      </w:r>
-      <w:proofErr w:type="spellStart"/>
-      <w:r>
-        <w:t>choisis</w:t>
-      </w:r>
-      <w:proofErr w:type="spellEnd"/>
-      <w:r>
-        <w:t xml:space="preserve"> </w:t>
-      </w:r>
-      <w:proofErr w:type="spellStart"/>
-      <w:r>
-        <w:t>EasyOCR</w:t>
-      </w:r>
-      <w:proofErr w:type="spellEnd"/>
-      <w:r>
-        <w:t xml:space="preserve"> pour </w:t>
-      </w:r>
-      <w:proofErr w:type="spellStart"/>
-      <w:r>
-        <w:t>sa</w:t>
-      </w:r>
-      <w:proofErr w:type="spellEnd"/>
-      <w:r>
-        <w:t xml:space="preserve"> </w:t>
-      </w:r>
-      <w:proofErr w:type="spellStart"/>
-      <w:r>
-        <w:t>simplicité</w:t>
-      </w:r>
-      <w:proofErr w:type="spellEnd"/>
-      <w:r>
-        <w:t xml:space="preserve"> </w:t>
-      </w:r>
-      <w:proofErr w:type="spellStart"/>
-      <w:r>
-        <w:t>d’installation</w:t>
-      </w:r>
-      <w:proofErr w:type="spellEnd"/>
-      <w:r>
-        <w:t xml:space="preserve"> et </w:t>
-      </w:r>
-      <w:proofErr w:type="spellStart"/>
-      <w:r>
-        <w:t>d’utilisation</w:t>
-      </w:r>
-      <w:proofErr w:type="spellEnd"/>
-      <w:r>
-        <w:t xml:space="preserve">. Mais il </w:t>
-      </w:r>
-      <w:proofErr w:type="spellStart"/>
-      <w:r>
-        <w:t>n’est</w:t>
-      </w:r>
-      <w:proofErr w:type="spellEnd"/>
-      <w:r>
-        <w:t xml:space="preserve"> pas très performant </w:t>
-      </w:r>
-      <w:proofErr w:type="spellStart"/>
-      <w:r>
-        <w:t>ni</w:t>
-      </w:r>
-      <w:proofErr w:type="spellEnd"/>
-      <w:r>
-        <w:t xml:space="preserve"> </w:t>
-      </w:r>
-      <w:proofErr w:type="spellStart"/>
-      <w:r>
-        <w:t>rapide</w:t>
-      </w:r>
-      <w:proofErr w:type="spellEnd"/>
-      <w:r>
-        <w:t xml:space="preserve">. </w:t>
-      </w:r>
-      <w:proofErr w:type="spellStart"/>
-      <w:r>
-        <w:t>J’ai</w:t>
-      </w:r>
-      <w:proofErr w:type="spellEnd"/>
-      <w:r>
-        <w:t xml:space="preserve"> </w:t>
-      </w:r>
-      <w:proofErr w:type="spellStart"/>
-      <w:r>
-        <w:t>donc</w:t>
-      </w:r>
-      <w:proofErr w:type="spellEnd"/>
-      <w:r>
-        <w:t xml:space="preserve"> </w:t>
-      </w:r>
-      <w:proofErr w:type="spellStart"/>
-      <w:r>
-        <w:t>cherché</w:t>
-      </w:r>
-      <w:proofErr w:type="spellEnd"/>
-      <w:r>
-        <w:t xml:space="preserve"> </w:t>
-      </w:r>
-      <w:proofErr w:type="spellStart"/>
-      <w:r>
-        <w:t>d’autres</w:t>
-      </w:r>
-      <w:proofErr w:type="spellEnd"/>
-      <w:r>
-        <w:t xml:space="preserve"> OCR à </w:t>
-      </w:r>
-      <w:proofErr w:type="spellStart"/>
-      <w:r>
-        <w:t>l’aide</w:t>
-      </w:r>
-      <w:proofErr w:type="spellEnd"/>
-      <w:r>
-        <w:t xml:space="preserve"> de ChatGPT.</w:t>
-      </w:r>
-    </w:p>
-    <w:p>
-      <w:r>
+    </w:p>
+    <w:p>
+      <w:r>
+        <w:t>Pour le choix de l’OCR, j’avais choisis EasyOCR pour sa simplicité d’installation et d’utilisation. Mais il n’est pas très performant ni rapide. J’ai donc cherché d’autres OCR à l’aide de ChatGPT.</w:t>
+      </w:r>
+    </w:p>
+    <w:p>
+      <w:r>
+        <w:rPr>
+          <w:noProof/>
+        </w:rPr>
         <w:drawing>
           <wp:anchor distT="0" distB="0" distL="114300" distR="114300" simplePos="0" relativeHeight="251659264" behindDoc="1" locked="0" layoutInCell="1" allowOverlap="1" wp14:anchorId="57709C58" wp14:editId="28241C80">
             <wp:simplePos x="0" y="0"/>
@@ -6703,7 +6438,7 @@
                     <pic:cNvPicPr/>
                   </pic:nvPicPr>
                   <pic:blipFill>
-                    <a:blip r:embed="rId9" cstate="print">
+                    <a:blip r:embed="rId10" cstate="print">
                       <a:extLst>
                         <a:ext uri="{28A0092B-C50C-407E-A947-70E740481C1C}">
                           <a14:useLocalDpi xmlns:a14="http://schemas.microsoft.com/office/drawing/2010/main" val="0"/>
@@ -6745,181 +6480,35 @@
       </w:r>
     </w:p>
     <w:p>
-      <w:proofErr w:type="spellStart"/>
       <w:r>
         <w:lastRenderedPageBreak/>
-        <w:t>J’ai</w:t>
-      </w:r>
-      <w:proofErr w:type="spellEnd"/>
-      <w:r>
-        <w:t xml:space="preserve"> </w:t>
-      </w:r>
-      <w:proofErr w:type="spellStart"/>
-      <w:r>
-        <w:t>également</w:t>
-      </w:r>
-      <w:proofErr w:type="spellEnd"/>
-      <w:r>
-        <w:t xml:space="preserve"> </w:t>
-      </w:r>
-      <w:proofErr w:type="spellStart"/>
-      <w:r>
-        <w:t>essayé</w:t>
-      </w:r>
-      <w:proofErr w:type="spellEnd"/>
-      <w:r>
-        <w:t xml:space="preserve"> </w:t>
-      </w:r>
-      <w:proofErr w:type="spellStart"/>
-      <w:r>
-        <w:t>PaddleOCR</w:t>
-      </w:r>
-      <w:proofErr w:type="spellEnd"/>
-      <w:r>
-        <w:t xml:space="preserve">, </w:t>
-      </w:r>
-      <w:proofErr w:type="spellStart"/>
-      <w:r>
-        <w:t>mais</w:t>
-      </w:r>
-      <w:proofErr w:type="spellEnd"/>
-      <w:r>
-        <w:t xml:space="preserve"> le </w:t>
-      </w:r>
-      <w:proofErr w:type="spellStart"/>
-      <w:r>
-        <w:t>problème</w:t>
-      </w:r>
-      <w:proofErr w:type="spellEnd"/>
-      <w:r>
-        <w:t xml:space="preserve"> est </w:t>
-      </w:r>
-      <w:proofErr w:type="spellStart"/>
-      <w:r>
-        <w:t>qu’il</w:t>
-      </w:r>
-      <w:proofErr w:type="spellEnd"/>
-      <w:r>
-        <w:t xml:space="preserve"> ne </w:t>
-      </w:r>
-      <w:proofErr w:type="spellStart"/>
-      <w:r>
-        <w:t>supporte</w:t>
-      </w:r>
-      <w:proofErr w:type="spellEnd"/>
-      <w:r>
-        <w:t xml:space="preserve"> pas python 3.13 et plus, </w:t>
-      </w:r>
-      <w:proofErr w:type="spellStart"/>
-      <w:r>
-        <w:t>seulement</w:t>
-      </w:r>
-      <w:proofErr w:type="spellEnd"/>
-      <w:r>
-        <w:t xml:space="preserve"> 3.9</w:t>
+        <w:t>J’ai également essayé PaddleOCR, mais le problème est qu’il ne supporte pas python 3.13 et plus, seulement 3.9</w:t>
       </w:r>
       <w:r>
         <w:t xml:space="preserve"> et 3.10</w:t>
       </w:r>
       <w:r>
-        <w:t xml:space="preserve">. Python 3.9 et 3.10 ne </w:t>
-      </w:r>
-      <w:proofErr w:type="spellStart"/>
-      <w:r>
-        <w:t>sont</w:t>
-      </w:r>
-      <w:proofErr w:type="spellEnd"/>
-      <w:r>
-        <w:t xml:space="preserve"> plus </w:t>
-      </w:r>
-      <w:proofErr w:type="spellStart"/>
-      <w:r>
-        <w:t>téléchargable</w:t>
-      </w:r>
-      <w:proofErr w:type="spellEnd"/>
-      <w:r>
-        <w:t xml:space="preserve"> </w:t>
-      </w:r>
-      <w:proofErr w:type="spellStart"/>
-      <w:r>
-        <w:t>facilement</w:t>
-      </w:r>
-      <w:proofErr w:type="spellEnd"/>
-      <w:r>
-        <w:t xml:space="preserve">, sur le site </w:t>
-      </w:r>
-      <w:proofErr w:type="spellStart"/>
-      <w:r>
-        <w:t>officiel</w:t>
-      </w:r>
-      <w:proofErr w:type="spellEnd"/>
-      <w:r>
-        <w:t xml:space="preserve"> et sur le Microsoft store, </w:t>
-      </w:r>
-      <w:proofErr w:type="spellStart"/>
-      <w:r>
-        <w:t>ils</w:t>
-      </w:r>
-      <w:proofErr w:type="spellEnd"/>
-      <w:r>
-        <w:t xml:space="preserve"> </w:t>
-      </w:r>
-      <w:proofErr w:type="spellStart"/>
-      <w:r>
-        <w:t>n’y</w:t>
-      </w:r>
-      <w:proofErr w:type="spellEnd"/>
-      <w:r>
-        <w:t xml:space="preserve"> </w:t>
-      </w:r>
-      <w:proofErr w:type="spellStart"/>
-      <w:r>
-        <w:t>sont</w:t>
-      </w:r>
-      <w:proofErr w:type="spellEnd"/>
-      <w:r>
-        <w:t xml:space="preserve"> plus. Et il </w:t>
-      </w:r>
-      <w:proofErr w:type="spellStart"/>
-      <w:r>
-        <w:t>n’y</w:t>
-      </w:r>
-      <w:proofErr w:type="spellEnd"/>
-      <w:r>
-        <w:t xml:space="preserve"> a plus de “</w:t>
-      </w:r>
-      <w:proofErr w:type="spellStart"/>
-      <w:r>
-        <w:t>installeur</w:t>
-      </w:r>
-      <w:proofErr w:type="spellEnd"/>
-      <w:r>
-        <w:t xml:space="preserve">. </w:t>
-      </w:r>
-    </w:p>
-    <w:p>
-      <w:pPr>
-        <w:pStyle w:val="Heading2"/>
-      </w:pPr>
-    </w:p>
-    <w:p>
-      <w:pPr>
-        <w:pStyle w:val="Heading2"/>
+        <w:t xml:space="preserve">. Python 3.9 et 3.10 ne sont plus téléchargable facilement, sur le site officiel et sur le Microsoft store, ils n’y sont plus. Et il n’y a plus de “installeur. </w:t>
+      </w:r>
+    </w:p>
+    <w:p>
+      <w:pPr>
+        <w:pStyle w:val="Titre2"/>
+      </w:pPr>
+    </w:p>
+    <w:p>
+      <w:pPr>
+        <w:pStyle w:val="Titre2"/>
       </w:pPr>
       <w:bookmarkStart w:id="34" w:name="_Toc223628745"/>
-      <w:proofErr w:type="spellStart"/>
-      <w:r>
-        <w:t>Intégration</w:t>
-      </w:r>
-      <w:proofErr w:type="spellEnd"/>
-      <w:r>
-        <w:t xml:space="preserve"> API fabricants (auth, formats)</w:t>
+      <w:r>
+        <w:t>Intégration API fabricants (auth, formats)</w:t>
       </w:r>
       <w:bookmarkEnd w:id="34"/>
     </w:p>
     <w:p>
       <w:pPr>
-        <w:pStyle w:val="Heading2"/>
+        <w:pStyle w:val="Titre2"/>
       </w:pPr>
       <w:bookmarkStart w:id="35" w:name="_Toc223628746"/>
       <w:r>
@@ -6929,7 +6518,7 @@
     </w:p>
     <w:p>
       <w:pPr>
-        <w:pStyle w:val="Heading2"/>
+        <w:pStyle w:val="Titre2"/>
         <w:rPr>
           <w:lang w:val="fr-CH"/>
         </w:rPr>
@@ -6942,7 +6531,7 @@
     </w:p>
     <w:p>
       <w:pPr>
-        <w:pStyle w:val="Heading2"/>
+        <w:pStyle w:val="Titre2"/>
         <w:rPr>
           <w:lang w:val="fr-CH"/>
         </w:rPr>
@@ -6984,7 +6573,7 @@
     </w:p>
     <w:p>
       <w:pPr>
-        <w:pStyle w:val="ListParagraph"/>
+        <w:pStyle w:val="Paragraphedeliste"/>
         <w:numPr>
           <w:ilvl w:val="0"/>
           <w:numId w:val="35"/>
@@ -7002,7 +6591,7 @@
     </w:p>
     <w:p>
       <w:pPr>
-        <w:pStyle w:val="ListParagraph"/>
+        <w:pStyle w:val="Paragraphedeliste"/>
         <w:numPr>
           <w:ilvl w:val="0"/>
           <w:numId w:val="35"/>
@@ -7020,7 +6609,7 @@
     </w:p>
     <w:p>
       <w:pPr>
-        <w:pStyle w:val="ListParagraph"/>
+        <w:pStyle w:val="Paragraphedeliste"/>
         <w:numPr>
           <w:ilvl w:val="0"/>
           <w:numId w:val="35"/>
@@ -7038,7 +6627,7 @@
     </w:p>
     <w:p>
       <w:pPr>
-        <w:pStyle w:val="ListParagraph"/>
+        <w:pStyle w:val="Paragraphedeliste"/>
         <w:numPr>
           <w:ilvl w:val="0"/>
           <w:numId w:val="35"/>
@@ -7069,7 +6658,7 @@
     </w:p>
     <w:p>
       <w:pPr>
-        <w:pStyle w:val="ListParagraph"/>
+        <w:pStyle w:val="Paragraphedeliste"/>
         <w:numPr>
           <w:ilvl w:val="0"/>
           <w:numId w:val="34"/>
@@ -7087,7 +6676,7 @@
     </w:p>
     <w:p>
       <w:pPr>
-        <w:pStyle w:val="ListParagraph"/>
+        <w:pStyle w:val="Paragraphedeliste"/>
         <w:numPr>
           <w:ilvl w:val="0"/>
           <w:numId w:val="34"/>
@@ -7105,7 +6694,7 @@
     </w:p>
     <w:p>
       <w:pPr>
-        <w:pStyle w:val="ListParagraph"/>
+        <w:pStyle w:val="Paragraphedeliste"/>
         <w:numPr>
           <w:ilvl w:val="0"/>
           <w:numId w:val="34"/>
@@ -7123,7 +6712,7 @@
     </w:p>
     <w:p>
       <w:pPr>
-        <w:pStyle w:val="ListParagraph"/>
+        <w:pStyle w:val="Paragraphedeliste"/>
         <w:numPr>
           <w:ilvl w:val="0"/>
           <w:numId w:val="34"/>
@@ -7148,7 +6737,7 @@
     </w:p>
     <w:p>
       <w:pPr>
-        <w:pStyle w:val="Heading1"/>
+        <w:pStyle w:val="Titre1"/>
       </w:pPr>
       <w:bookmarkStart w:id="38" w:name="_Toc223628749"/>
       <w:r>
@@ -7158,7 +6747,7 @@
     </w:p>
     <w:p>
       <w:pPr>
-        <w:pStyle w:val="Heading2"/>
+        <w:pStyle w:val="Titre2"/>
       </w:pPr>
       <w:bookmarkStart w:id="39" w:name="_Toc223628750"/>
       <w:r>
@@ -7168,7 +6757,7 @@
     </w:p>
     <w:p>
       <w:pPr>
-        <w:pStyle w:val="Heading2"/>
+        <w:pStyle w:val="Titre2"/>
       </w:pPr>
       <w:bookmarkStart w:id="40" w:name="_Toc223628751"/>
       <w:r>
@@ -7178,7 +6767,7 @@
     </w:p>
     <w:p>
       <w:pPr>
-        <w:pStyle w:val="Heading2"/>
+        <w:pStyle w:val="Titre2"/>
       </w:pPr>
       <w:bookmarkStart w:id="41" w:name="_Toc223628752"/>
       <w:r>
@@ -7188,7 +6777,7 @@
     </w:p>
     <w:p>
       <w:pPr>
-        <w:pStyle w:val="Heading2"/>
+        <w:pStyle w:val="Titre2"/>
       </w:pPr>
       <w:bookmarkStart w:id="42" w:name="_Toc223628753"/>
       <w:r>
@@ -7212,7 +6801,7 @@
     </w:p>
     <w:p>
       <w:pPr>
-        <w:pStyle w:val="Heading1"/>
+        <w:pStyle w:val="Titre1"/>
       </w:pPr>
       <w:bookmarkStart w:id="43" w:name="_Toc223628754"/>
       <w:r>
@@ -7223,7 +6812,7 @@
     </w:p>
     <w:p>
       <w:pPr>
-        <w:pStyle w:val="Heading2"/>
+        <w:pStyle w:val="Titre2"/>
       </w:pPr>
       <w:bookmarkStart w:id="44" w:name="_Toc223628755"/>
       <w:r>
@@ -7233,7 +6822,7 @@
     </w:p>
     <w:p>
       <w:pPr>
-        <w:pStyle w:val="Heading2"/>
+        <w:pStyle w:val="Titre2"/>
       </w:pPr>
       <w:bookmarkStart w:id="45" w:name="_Toc223628756"/>
       <w:r>
@@ -7243,7 +6832,7 @@
     </w:p>
     <w:p>
       <w:pPr>
-        <w:pStyle w:val="Heading2"/>
+        <w:pStyle w:val="Titre2"/>
       </w:pPr>
       <w:bookmarkStart w:id="46" w:name="_Toc223628757"/>
       <w:r>
@@ -7253,47 +6842,7 @@
     </w:p>
     <w:p>
       <w:r>
-        <w:t xml:space="preserve">Le site est </w:t>
-      </w:r>
-      <w:proofErr w:type="spellStart"/>
-      <w:r>
-        <w:t>hébergé</w:t>
-      </w:r>
-      <w:proofErr w:type="spellEnd"/>
-      <w:r>
-        <w:t xml:space="preserve"> sur le cloud de </w:t>
-      </w:r>
-      <w:proofErr w:type="spellStart"/>
-      <w:r>
-        <w:t>streamlit</w:t>
-      </w:r>
-      <w:proofErr w:type="spellEnd"/>
-      <w:r>
-        <w:t xml:space="preserve">. Il est </w:t>
-      </w:r>
-      <w:proofErr w:type="spellStart"/>
-      <w:r>
-        <w:t>donc</w:t>
-      </w:r>
-      <w:proofErr w:type="spellEnd"/>
-      <w:r>
-        <w:t xml:space="preserve"> </w:t>
-      </w:r>
-      <w:proofErr w:type="spellStart"/>
-      <w:r>
-        <w:t>sécurisé</w:t>
-      </w:r>
-      <w:proofErr w:type="spellEnd"/>
-      <w:r>
-        <w:t xml:space="preserve"> et accessible </w:t>
-      </w:r>
-      <w:proofErr w:type="spellStart"/>
-      <w:r>
-        <w:t>en</w:t>
-      </w:r>
-      <w:proofErr w:type="spellEnd"/>
-      <w:r>
-        <w:t xml:space="preserve"> “https”</w:t>
+        <w:t>Le site est hébergé sur le cloud de streamlit. Il est donc sécurisé et accessible en “https”</w:t>
       </w:r>
       <w:r>
         <w:t>.</w:t>
@@ -7301,7 +6850,7 @@
     </w:p>
     <w:p>
       <w:pPr>
-        <w:pStyle w:val="Heading2"/>
+        <w:pStyle w:val="Titre2"/>
       </w:pPr>
       <w:bookmarkStart w:id="47" w:name="_Toc223628758"/>
       <w:r>
@@ -7311,7 +6860,7 @@
     </w:p>
     <w:p>
       <w:pPr>
-        <w:pStyle w:val="Heading2"/>
+        <w:pStyle w:val="Titre2"/>
       </w:pPr>
       <w:bookmarkStart w:id="48" w:name="_Toc223628759"/>
       <w:r>
@@ -7321,128 +6870,14 @@
     </w:p>
     <w:p>
       <w:r>
-        <w:t xml:space="preserve">Une bonne pratique </w:t>
-      </w:r>
-      <w:proofErr w:type="spellStart"/>
-      <w:r>
-        <w:t>serait</w:t>
-      </w:r>
-      <w:proofErr w:type="spellEnd"/>
-      <w:r>
-        <w:t xml:space="preserve"> </w:t>
-      </w:r>
-      <w:proofErr w:type="spellStart"/>
-      <w:r>
-        <w:t>d’avoir</w:t>
-      </w:r>
-      <w:proofErr w:type="spellEnd"/>
-      <w:r>
-        <w:t xml:space="preserve"> </w:t>
-      </w:r>
-      <w:proofErr w:type="spellStart"/>
-      <w:r>
-        <w:t>plusieurs</w:t>
-      </w:r>
-      <w:proofErr w:type="spellEnd"/>
-      <w:r>
-        <w:t xml:space="preserve"> </w:t>
-      </w:r>
-      <w:proofErr w:type="spellStart"/>
-      <w:r>
-        <w:t>fichiers</w:t>
-      </w:r>
-      <w:proofErr w:type="spellEnd"/>
-      <w:r>
-        <w:t xml:space="preserve"> python pour </w:t>
-      </w:r>
-      <w:proofErr w:type="spellStart"/>
-      <w:r>
-        <w:t>une</w:t>
-      </w:r>
-      <w:proofErr w:type="spellEnd"/>
-      <w:r>
-        <w:t xml:space="preserve"> </w:t>
-      </w:r>
-      <w:proofErr w:type="spellStart"/>
-      <w:r>
-        <w:t>meilleur</w:t>
-      </w:r>
-      <w:proofErr w:type="spellEnd"/>
-      <w:r>
-        <w:t xml:space="preserve"> lecture du code. Mais je </w:t>
-      </w:r>
-      <w:proofErr w:type="spellStart"/>
-      <w:r>
-        <w:t>n’ai</w:t>
-      </w:r>
-      <w:proofErr w:type="spellEnd"/>
-      <w:r>
-        <w:t xml:space="preserve"> pas </w:t>
-      </w:r>
-      <w:proofErr w:type="spellStart"/>
-      <w:r>
-        <w:t>réussis</w:t>
-      </w:r>
-      <w:proofErr w:type="spellEnd"/>
-      <w:r>
-        <w:t xml:space="preserve"> à le faire </w:t>
-      </w:r>
-      <w:proofErr w:type="spellStart"/>
-      <w:r>
-        <w:t>fonctionner</w:t>
-      </w:r>
-      <w:proofErr w:type="spellEnd"/>
-      <w:r>
-        <w:t xml:space="preserve"> avec le cloud de </w:t>
-      </w:r>
-      <w:proofErr w:type="spellStart"/>
-      <w:r>
-        <w:t>streamlit</w:t>
-      </w:r>
-      <w:proofErr w:type="spellEnd"/>
-      <w:r>
-        <w:t xml:space="preserve">, </w:t>
-      </w:r>
-      <w:proofErr w:type="spellStart"/>
-      <w:r>
-        <w:t>seulement</w:t>
-      </w:r>
-      <w:proofErr w:type="spellEnd"/>
-      <w:r>
-        <w:t xml:space="preserve"> </w:t>
-      </w:r>
-      <w:proofErr w:type="spellStart"/>
-      <w:r>
-        <w:t>en</w:t>
-      </w:r>
-      <w:proofErr w:type="spellEnd"/>
-      <w:r>
-        <w:t xml:space="preserve"> locale. </w:t>
-      </w:r>
-      <w:r>
-        <w:t xml:space="preserve">Mettre des </w:t>
-      </w:r>
-      <w:proofErr w:type="spellStart"/>
-      <w:r>
-        <w:t>commentaires</w:t>
-      </w:r>
-      <w:proofErr w:type="spellEnd"/>
-      <w:r>
-        <w:t xml:space="preserve">, </w:t>
-      </w:r>
-      <w:proofErr w:type="spellStart"/>
-      <w:r>
-        <w:t>créer</w:t>
-      </w:r>
-      <w:proofErr w:type="spellEnd"/>
-      <w:r>
-        <w:t xml:space="preserve"> des </w:t>
-      </w:r>
-      <w:proofErr w:type="spellStart"/>
+        <w:t xml:space="preserve">Une bonne pratique serait d’avoir plusieurs fichiers python pour une meilleur lecture du code. Mais je n’ai pas réussis à le faire fonctionner avec le cloud de streamlit, seulement en locale. </w:t>
+      </w:r>
+      <w:r>
+        <w:t xml:space="preserve">Mettre des commentaires, créer des </w:t>
+      </w:r>
       <w:r>
         <w:t>séctions</w:t>
       </w:r>
-      <w:proofErr w:type="spellEnd"/>
       <w:r>
         <w:t>.</w:t>
       </w:r>
@@ -7450,7 +6885,7 @@
     <w:p/>
     <w:p>
       <w:pPr>
-        <w:pStyle w:val="Heading1"/>
+        <w:pStyle w:val="Titre1"/>
       </w:pPr>
       <w:bookmarkStart w:id="49" w:name="_Toc223628760"/>
       <w:r>
@@ -7460,7 +6895,7 @@
     </w:p>
     <w:p>
       <w:pPr>
-        <w:pStyle w:val="Heading2"/>
+        <w:pStyle w:val="Titre2"/>
       </w:pPr>
       <w:bookmarkStart w:id="50" w:name="_Toc223628761"/>
       <w:r>
@@ -7470,7 +6905,7 @@
     </w:p>
     <w:p>
       <w:pPr>
-        <w:pStyle w:val="Heading2"/>
+        <w:pStyle w:val="Titre2"/>
       </w:pPr>
       <w:bookmarkStart w:id="51" w:name="_Toc223628762"/>
       <w:r>
@@ -7480,7 +6915,7 @@
     </w:p>
     <w:p>
       <w:pPr>
-        <w:pStyle w:val="Heading2"/>
+        <w:pStyle w:val="Titre2"/>
       </w:pPr>
       <w:bookmarkStart w:id="52" w:name="_Toc223628763"/>
       <w:r>
@@ -7490,7 +6925,7 @@
     </w:p>
     <w:p>
       <w:pPr>
-        <w:pStyle w:val="Heading2"/>
+        <w:pStyle w:val="Titre2"/>
       </w:pPr>
       <w:bookmarkStart w:id="53" w:name="_Toc223628764"/>
       <w:r>
@@ -7500,7 +6935,7 @@
     </w:p>
     <w:p>
       <w:pPr>
-        <w:pStyle w:val="Heading2"/>
+        <w:pStyle w:val="Titre2"/>
       </w:pPr>
       <w:bookmarkStart w:id="54" w:name="_Toc223628765"/>
       <w:r>
@@ -7524,7 +6959,7 @@
     </w:p>
     <w:p>
       <w:pPr>
-        <w:pStyle w:val="Heading1"/>
+        <w:pStyle w:val="Titre1"/>
       </w:pPr>
       <w:bookmarkStart w:id="55" w:name="_Toc223628766"/>
       <w:r>
@@ -7535,7 +6970,7 @@
     </w:p>
     <w:p>
       <w:pPr>
-        <w:pStyle w:val="Heading2"/>
+        <w:pStyle w:val="Titre2"/>
         <w:rPr>
           <w:lang w:val="fr-CH"/>
         </w:rPr>
@@ -7548,7 +6983,7 @@
     </w:p>
     <w:p>
       <w:pPr>
-        <w:pStyle w:val="ListParagraph"/>
+        <w:pStyle w:val="Paragraphedeliste"/>
         <w:numPr>
           <w:ilvl w:val="0"/>
           <w:numId w:val="33"/>
@@ -7566,7 +7001,7 @@
     </w:p>
     <w:p>
       <w:pPr>
-        <w:pStyle w:val="ListParagraph"/>
+        <w:pStyle w:val="Paragraphedeliste"/>
         <w:rPr>
           <w:lang w:val="fr-CH"/>
         </w:rPr>
@@ -7592,7 +7027,7 @@
                     <pic:cNvPicPr/>
                   </pic:nvPicPr>
                   <pic:blipFill>
-                    <a:blip r:embed="rId10"/>
+                    <a:blip r:embed="rId11"/>
                     <a:stretch>
                       <a:fillRect/>
                     </a:stretch>
@@ -7615,7 +7050,7 @@
     </w:p>
     <w:p>
       <w:pPr>
-        <w:pStyle w:val="ListParagraph"/>
+        <w:pStyle w:val="Paragraphedeliste"/>
         <w:numPr>
           <w:ilvl w:val="0"/>
           <w:numId w:val="33"/>
@@ -7633,7 +7068,7 @@
     </w:p>
     <w:p>
       <w:pPr>
-        <w:pStyle w:val="ListParagraph"/>
+        <w:pStyle w:val="Paragraphedeliste"/>
         <w:numPr>
           <w:ilvl w:val="0"/>
           <w:numId w:val="33"/>
@@ -7651,7 +7086,7 @@
     </w:p>
     <w:p>
       <w:pPr>
-        <w:pStyle w:val="ListParagraph"/>
+        <w:pStyle w:val="Paragraphedeliste"/>
         <w:numPr>
           <w:ilvl w:val="0"/>
           <w:numId w:val="33"/>
@@ -7669,7 +7104,7 @@
     </w:p>
     <w:p>
       <w:pPr>
-        <w:pStyle w:val="ListParagraph"/>
+        <w:pStyle w:val="Paragraphedeliste"/>
         <w:numPr>
           <w:ilvl w:val="0"/>
           <w:numId w:val="33"/>
@@ -7687,7 +7122,7 @@
     </w:p>
     <w:p>
       <w:pPr>
-        <w:pStyle w:val="ListParagraph"/>
+        <w:pStyle w:val="Paragraphedeliste"/>
         <w:numPr>
           <w:ilvl w:val="1"/>
           <w:numId w:val="33"/>
@@ -7700,8 +7135,6 @@
           <w:lang w:val="fr-CH"/>
         </w:rPr>
       </w:pPr>
-      <w:proofErr w:type="spellStart"/>
-      <w:proofErr w:type="gramStart"/>
       <w:r>
         <w:rPr>
           <w:b/>
@@ -7710,46 +7143,12 @@
           <w:iCs/>
           <w:lang w:val="fr-CH"/>
         </w:rPr>
-        <w:t>pip</w:t>
-      </w:r>
-      <w:proofErr w:type="spellEnd"/>
-      <w:proofErr w:type="gramEnd"/>
-      <w:r>
-        <w:rPr>
-          <w:b/>
-          <w:bCs/>
-          <w:i/>
-          <w:iCs/>
-          <w:lang w:val="fr-CH"/>
-        </w:rPr>
-        <w:t xml:space="preserve"> </w:t>
-      </w:r>
-      <w:proofErr w:type="spellStart"/>
-      <w:r>
-        <w:rPr>
-          <w:b/>
-          <w:bCs/>
-          <w:i/>
-          <w:iCs/>
-          <w:lang w:val="fr-CH"/>
-        </w:rPr>
-        <w:t>install</w:t>
-      </w:r>
-      <w:proofErr w:type="spellEnd"/>
-      <w:r>
-        <w:rPr>
-          <w:b/>
-          <w:bCs/>
-          <w:i/>
-          <w:iCs/>
-          <w:lang w:val="fr-CH"/>
-        </w:rPr>
-        <w:t xml:space="preserve"> -r requirements.txt</w:t>
-      </w:r>
-    </w:p>
-    <w:p>
-      <w:pPr>
-        <w:pStyle w:val="ListParagraph"/>
+        <w:t>pip install -r requirements.txt</w:t>
+      </w:r>
+    </w:p>
+    <w:p>
+      <w:pPr>
+        <w:pStyle w:val="Paragraphedeliste"/>
         <w:rPr>
           <w:b/>
           <w:bCs/>
@@ -7783,7 +7182,7 @@
                     <pic:cNvPicPr/>
                   </pic:nvPicPr>
                   <pic:blipFill>
-                    <a:blip r:embed="rId11"/>
+                    <a:blip r:embed="rId12"/>
                     <a:stretch>
                       <a:fillRect/>
                     </a:stretch>
@@ -7806,7 +7205,7 @@
     </w:p>
     <w:p>
       <w:pPr>
-        <w:pStyle w:val="ListParagraph"/>
+        <w:pStyle w:val="Paragraphedeliste"/>
         <w:numPr>
           <w:ilvl w:val="0"/>
           <w:numId w:val="33"/>
@@ -7836,7 +7235,7 @@
     </w:p>
     <w:p>
       <w:pPr>
-        <w:pStyle w:val="ListParagraph"/>
+        <w:pStyle w:val="Paragraphedeliste"/>
         <w:numPr>
           <w:ilvl w:val="1"/>
           <w:numId w:val="33"/>
@@ -7845,26 +7244,16 @@
           <w:lang w:val="fr-CH"/>
         </w:rPr>
       </w:pPr>
-      <w:proofErr w:type="spellStart"/>
-      <w:proofErr w:type="gramStart"/>
       <w:r>
         <w:rPr>
           <w:lang w:val="fr-CH"/>
         </w:rPr>
-        <w:t>streamlit</w:t>
-      </w:r>
-      <w:proofErr w:type="spellEnd"/>
-      <w:proofErr w:type="gramEnd"/>
-      <w:r>
-        <w:rPr>
-          <w:lang w:val="fr-CH"/>
-        </w:rPr>
-        <w:t xml:space="preserve"> run main.py</w:t>
-      </w:r>
-    </w:p>
-    <w:p>
-      <w:pPr>
-        <w:pStyle w:val="ListParagraph"/>
+        <w:t>streamlit run main.py</w:t>
+      </w:r>
+    </w:p>
+    <w:p>
+      <w:pPr>
+        <w:pStyle w:val="Paragraphedeliste"/>
         <w:numPr>
           <w:ilvl w:val="1"/>
           <w:numId w:val="33"/>
@@ -7896,40 +7285,18 @@
           <w:iCs/>
           <w:lang w:val="fr-CH"/>
         </w:rPr>
-        <w:t xml:space="preserve">python -m </w:t>
-      </w:r>
-      <w:proofErr w:type="spellStart"/>
-      <w:r>
-        <w:rPr>
-          <w:b/>
-          <w:bCs/>
-          <w:i/>
-          <w:iCs/>
+        <w:t>python -m streamlit run main.py</w:t>
+      </w:r>
+      <w:r>
+        <w:rPr>
           <w:lang w:val="fr-CH"/>
         </w:rPr>
-        <w:t>streamlit</w:t>
-      </w:r>
-      <w:proofErr w:type="spellEnd"/>
-      <w:r>
-        <w:rPr>
-          <w:b/>
-          <w:bCs/>
-          <w:i/>
-          <w:iCs/>
-          <w:lang w:val="fr-CH"/>
-        </w:rPr>
-        <w:t xml:space="preserve"> run main.py</w:t>
-      </w:r>
-      <w:r>
-        <w:rPr>
-          <w:lang w:val="fr-CH"/>
-        </w:rPr>
         <w:t>)</w:t>
       </w:r>
     </w:p>
     <w:p>
       <w:pPr>
-        <w:pStyle w:val="Heading2"/>
+        <w:pStyle w:val="Titre2"/>
       </w:pPr>
       <w:bookmarkStart w:id="57" w:name="_Toc223628768"/>
       <w:r>
@@ -7939,7 +7306,7 @@
     </w:p>
     <w:p>
       <w:pPr>
-        <w:pStyle w:val="Heading2"/>
+        <w:pStyle w:val="Titre2"/>
       </w:pPr>
       <w:bookmarkStart w:id="58" w:name="_Toc223628769"/>
       <w:r>
@@ -7949,7 +7316,7 @@
     </w:p>
     <w:p>
       <w:pPr>
-        <w:pStyle w:val="Heading2"/>
+        <w:pStyle w:val="Titre2"/>
       </w:pPr>
       <w:bookmarkStart w:id="59" w:name="_Toc223628770"/>
       <w:r>
@@ -7960,7 +7327,7 @@
     </w:p>
     <w:p>
       <w:pPr>
-        <w:pStyle w:val="Heading2"/>
+        <w:pStyle w:val="Titre2"/>
       </w:pPr>
       <w:bookmarkStart w:id="60" w:name="_Toc223628771"/>
       <w:r>
@@ -7971,7 +7338,7 @@
     <w:p/>
     <w:p>
       <w:pPr>
-        <w:pStyle w:val="Heading1"/>
+        <w:pStyle w:val="Titre1"/>
       </w:pPr>
       <w:bookmarkStart w:id="61" w:name="_Toc223628772"/>
       <w:r>
@@ -7981,7 +7348,7 @@
     </w:p>
     <w:p>
       <w:pPr>
-        <w:pStyle w:val="Heading2"/>
+        <w:pStyle w:val="Titre2"/>
       </w:pPr>
       <w:bookmarkStart w:id="62" w:name="_Toc223628773"/>
       <w:r>
@@ -7991,7 +7358,7 @@
     </w:p>
     <w:p>
       <w:pPr>
-        <w:pStyle w:val="Heading2"/>
+        <w:pStyle w:val="Titre2"/>
       </w:pPr>
       <w:bookmarkStart w:id="63" w:name="_Toc223628774"/>
       <w:r>
@@ -8001,7 +7368,7 @@
     </w:p>
     <w:p>
       <w:pPr>
-        <w:pStyle w:val="Heading2"/>
+        <w:pStyle w:val="Titre2"/>
       </w:pPr>
       <w:bookmarkStart w:id="64" w:name="_Toc223628775"/>
       <w:r>
@@ -8011,7 +7378,7 @@
     </w:p>
     <w:p>
       <w:pPr>
-        <w:pStyle w:val="Heading1"/>
+        <w:pStyle w:val="Titre1"/>
       </w:pPr>
       <w:bookmarkStart w:id="65" w:name="_Toc223628776"/>
       <w:r>
@@ -8021,27 +7388,17 @@
     </w:p>
     <w:p>
       <w:pPr>
-        <w:pStyle w:val="Heading2"/>
+        <w:pStyle w:val="Titre2"/>
       </w:pPr>
       <w:bookmarkStart w:id="66" w:name="_Toc223628777"/>
-      <w:proofErr w:type="gramStart"/>
-      <w:r>
-        <w:t>Liens</w:t>
-      </w:r>
-      <w:proofErr w:type="gramEnd"/>
-      <w:r>
-        <w:t xml:space="preserve"> vers le dépôt/versioning (instructions d’accès)</w:t>
+      <w:r>
+        <w:t>Liens vers le dépôt/versioning (instructions d’accès)</w:t>
       </w:r>
       <w:bookmarkEnd w:id="66"/>
     </w:p>
     <w:p>
-      <w:proofErr w:type="gramStart"/>
-      <w:r>
-        <w:t>Github :</w:t>
-      </w:r>
-      <w:proofErr w:type="gramEnd"/>
-      <w:r>
-        <w:t xml:space="preserve"> </w:t>
+      <w:r>
+        <w:t xml:space="preserve">Github : </w:t>
       </w:r>
       <w:r>
         <w:t>https://github.com/jimmylamcpnv/pre-tpi</w:t>
@@ -8049,20 +7406,12 @@
     </w:p>
     <w:p>
       <w:r>
-        <w:t xml:space="preserve">Web application </w:t>
-      </w:r>
-      <w:proofErr w:type="gramStart"/>
-      <w:r>
-        <w:t>demo :</w:t>
-      </w:r>
-      <w:proofErr w:type="gramEnd"/>
-      <w:r>
-        <w:t xml:space="preserve"> </w:t>
-      </w:r>
-      <w:hyperlink r:id="rId12" w:history="1">
+        <w:t xml:space="preserve">Web application demo : </w:t>
+      </w:r>
+      <w:hyperlink r:id="rId13" w:history="1">
         <w:r>
           <w:rPr>
-            <w:rStyle w:val="Hyperlink"/>
+            <w:rStyle w:val="Lienhypertexte"/>
           </w:rPr>
           <w:t>https://serial-guard.streamlit.app/</w:t>
         </w:r>
@@ -8070,7 +7419,7 @@
     </w:p>
     <w:p>
       <w:pPr>
-        <w:pStyle w:val="Heading2"/>
+        <w:pStyle w:val="Titre2"/>
       </w:pPr>
       <w:bookmarkStart w:id="67" w:name="_Toc223628778"/>
       <w:r>
@@ -8079,64 +7428,44 @@
       <w:bookmarkEnd w:id="67"/>
     </w:p>
     <w:p>
-      <w:proofErr w:type="spellStart"/>
-      <w:proofErr w:type="gramStart"/>
-      <w:r>
-        <w:t>Streamlit</w:t>
-      </w:r>
-      <w:proofErr w:type="spellEnd"/>
-      <w:r>
-        <w:t xml:space="preserve"> :</w:t>
-      </w:r>
-      <w:proofErr w:type="gramEnd"/>
-      <w:r>
-        <w:t xml:space="preserve"> </w:t>
-      </w:r>
-    </w:p>
-    <w:p>
-      <w:pPr>
-        <w:pStyle w:val="ListParagraph"/>
+      <w:r>
+        <w:t xml:space="preserve">Streamlit : </w:t>
+      </w:r>
+    </w:p>
+    <w:p>
+      <w:pPr>
+        <w:pStyle w:val="Paragraphedeliste"/>
         <w:numPr>
           <w:ilvl w:val="0"/>
           <w:numId w:val="41"/>
         </w:numPr>
       </w:pPr>
-      <w:hyperlink r:id="rId13" w:history="1">
+      <w:hyperlink r:id="rId14" w:history="1">
         <w:r>
           <w:rPr>
-            <w:rStyle w:val="Hyperlink"/>
+            <w:rStyle w:val="Lienhypertexte"/>
           </w:rPr>
           <w:t>https://docs.streamlit.io/</w:t>
         </w:r>
       </w:hyperlink>
     </w:p>
     <w:p>
-      <w:proofErr w:type="spellStart"/>
-      <w:proofErr w:type="gramStart"/>
-      <w:r>
-        <w:t>EasyOCR</w:t>
-      </w:r>
-      <w:proofErr w:type="spellEnd"/>
-      <w:r>
-        <w:t xml:space="preserve"> :</w:t>
-      </w:r>
-      <w:proofErr w:type="gramEnd"/>
-      <w:r>
-        <w:t xml:space="preserve"> </w:t>
-      </w:r>
-    </w:p>
-    <w:p>
-      <w:pPr>
-        <w:pStyle w:val="ListParagraph"/>
+      <w:r>
+        <w:t xml:space="preserve">EasyOCR : </w:t>
+      </w:r>
+    </w:p>
+    <w:p>
+      <w:pPr>
+        <w:pStyle w:val="Paragraphedeliste"/>
         <w:numPr>
           <w:ilvl w:val="0"/>
           <w:numId w:val="41"/>
         </w:numPr>
       </w:pPr>
-      <w:hyperlink r:id="rId14" w:history="1">
+      <w:hyperlink r:id="rId15" w:history="1">
         <w:r>
           <w:rPr>
-            <w:rStyle w:val="Hyperlink"/>
+            <w:rStyle w:val="Lienhypertexte"/>
           </w:rPr>
           <w:t>https://github.com/JaidedAI/EasyOCR</w:t>
         </w:r>
@@ -8144,16 +7473,16 @@
     </w:p>
     <w:p>
       <w:pPr>
-        <w:pStyle w:val="ListParagraph"/>
+        <w:pStyle w:val="Paragraphedeliste"/>
         <w:numPr>
           <w:ilvl w:val="0"/>
           <w:numId w:val="41"/>
         </w:numPr>
       </w:pPr>
-      <w:hyperlink r:id="rId15" w:history="1">
+      <w:hyperlink r:id="rId16" w:history="1">
         <w:r>
           <w:rPr>
-            <w:rStyle w:val="Hyperlink"/>
+            <w:rStyle w:val="Lienhypertexte"/>
           </w:rPr>
           <w:t>https://www.jaided.ai/easyocr/</w:t>
         </w:r>
@@ -8161,11 +7490,11 @@
     </w:p>
     <w:p>
       <w:pPr>
-        <w:pStyle w:val="ListParagraph"/>
+        <w:pStyle w:val="Paragraphedeliste"/>
       </w:pPr>
     </w:p>
     <w:sectPr>
-      <w:footerReference w:type="default" r:id="rId16"/>
+      <w:footerReference w:type="default" r:id="rId17"/>
       <w:pgSz w:w="11906" w:h="16838"/>
       <w:pgMar w:top="1440" w:right="1440" w:bottom="1440" w:left="1440" w:header="708" w:footer="708" w:gutter="0"/>
       <w:cols w:space="708"/>
@@ -8212,7 +7541,7 @@
     <w:sdtContent>
       <w:p>
         <w:pPr>
-          <w:pStyle w:val="Footer"/>
+          <w:pStyle w:val="Pieddepage"/>
         </w:pPr>
         <w:r>
           <w:fldChar w:fldCharType="begin"/>
@@ -8240,7 +7569,7 @@
   </w:sdt>
   <w:p>
     <w:pPr>
-      <w:pStyle w:val="Footer"/>
+      <w:pStyle w:val="Pieddepage"/>
     </w:pPr>
   </w:p>
 </w:ftr>
@@ -10033,7 +9362,7 @@
         <w:kern w:val="2"/>
         <w:sz w:val="24"/>
         <w:szCs w:val="24"/>
-        <w:lang w:val="en-CH" w:eastAsia="en-US" w:bidi="ar-SA"/>
+        <w:lang w:eastAsia="en-US" w:bidi="ar-SA"/>
         <w14:ligatures w14:val="standardContextual"/>
       </w:rPr>
     </w:rPrDefault>
@@ -10429,11 +9758,11 @@
       <w:rFonts w:ascii="Arial" w:hAnsi="Arial" w:cs="Arial"/>
     </w:rPr>
   </w:style>
-  <w:style w:type="paragraph" w:styleId="Heading1">
+  <w:style w:type="paragraph" w:styleId="Titre1">
     <w:name w:val="heading 1"/>
     <w:basedOn w:val="Normal"/>
     <w:next w:val="Normal"/>
-    <w:link w:val="Heading1Char"/>
+    <w:link w:val="Titre1Car"/>
     <w:uiPriority w:val="9"/>
     <w:qFormat/>
     <w:rsid w:val="000F4A7A"/>
@@ -10451,11 +9780,11 @@
       <w:szCs w:val="36"/>
     </w:rPr>
   </w:style>
-  <w:style w:type="paragraph" w:styleId="Heading2">
+  <w:style w:type="paragraph" w:styleId="Titre2">
     <w:name w:val="heading 2"/>
     <w:basedOn w:val="Normal"/>
     <w:next w:val="Normal"/>
-    <w:link w:val="Heading2Char"/>
+    <w:link w:val="Titre2Car"/>
     <w:uiPriority w:val="9"/>
     <w:unhideWhenUsed/>
     <w:qFormat/>
@@ -10471,11 +9800,11 @@
       <w:szCs w:val="28"/>
     </w:rPr>
   </w:style>
-  <w:style w:type="paragraph" w:styleId="Heading3">
+  <w:style w:type="paragraph" w:styleId="Titre3">
     <w:name w:val="heading 3"/>
     <w:basedOn w:val="Normal"/>
     <w:next w:val="Normal"/>
-    <w:link w:val="Heading3Char"/>
+    <w:link w:val="Titre3Car"/>
     <w:uiPriority w:val="9"/>
     <w:semiHidden/>
     <w:unhideWhenUsed/>
@@ -10494,11 +9823,11 @@
       <w:szCs w:val="28"/>
     </w:rPr>
   </w:style>
-  <w:style w:type="paragraph" w:styleId="Heading4">
+  <w:style w:type="paragraph" w:styleId="Titre4">
     <w:name w:val="heading 4"/>
     <w:basedOn w:val="Normal"/>
     <w:next w:val="Normal"/>
-    <w:link w:val="Heading4Char"/>
+    <w:link w:val="Titre4Car"/>
     <w:uiPriority w:val="9"/>
     <w:semiHidden/>
     <w:unhideWhenUsed/>
@@ -10517,11 +9846,11 @@
       <w:color w:val="0F4761" w:themeColor="accent1" w:themeShade="BF"/>
     </w:rPr>
   </w:style>
-  <w:style w:type="paragraph" w:styleId="Heading5">
+  <w:style w:type="paragraph" w:styleId="Titre5">
     <w:name w:val="heading 5"/>
     <w:basedOn w:val="Normal"/>
     <w:next w:val="Normal"/>
-    <w:link w:val="Heading5Char"/>
+    <w:link w:val="Titre5Car"/>
     <w:uiPriority w:val="9"/>
     <w:semiHidden/>
     <w:unhideWhenUsed/>
@@ -10538,11 +9867,11 @@
       <w:color w:val="0F4761" w:themeColor="accent1" w:themeShade="BF"/>
     </w:rPr>
   </w:style>
-  <w:style w:type="paragraph" w:styleId="Heading6">
+  <w:style w:type="paragraph" w:styleId="Titre6">
     <w:name w:val="heading 6"/>
     <w:basedOn w:val="Normal"/>
     <w:next w:val="Normal"/>
-    <w:link w:val="Heading6Char"/>
+    <w:link w:val="Titre6Car"/>
     <w:uiPriority w:val="9"/>
     <w:semiHidden/>
     <w:unhideWhenUsed/>
@@ -10561,11 +9890,11 @@
       <w:color w:val="595959" w:themeColor="text1" w:themeTint="A6"/>
     </w:rPr>
   </w:style>
-  <w:style w:type="paragraph" w:styleId="Heading7">
+  <w:style w:type="paragraph" w:styleId="Titre7">
     <w:name w:val="heading 7"/>
     <w:basedOn w:val="Normal"/>
     <w:next w:val="Normal"/>
-    <w:link w:val="Heading7Char"/>
+    <w:link w:val="Titre7Car"/>
     <w:uiPriority w:val="9"/>
     <w:semiHidden/>
     <w:unhideWhenUsed/>
@@ -10582,11 +9911,11 @@
       <w:color w:val="595959" w:themeColor="text1" w:themeTint="A6"/>
     </w:rPr>
   </w:style>
-  <w:style w:type="paragraph" w:styleId="Heading8">
+  <w:style w:type="paragraph" w:styleId="Titre8">
     <w:name w:val="heading 8"/>
     <w:basedOn w:val="Normal"/>
     <w:next w:val="Normal"/>
-    <w:link w:val="Heading8Char"/>
+    <w:link w:val="Titre8Car"/>
     <w:uiPriority w:val="9"/>
     <w:semiHidden/>
     <w:unhideWhenUsed/>
@@ -10605,11 +9934,11 @@
       <w:color w:val="272727" w:themeColor="text1" w:themeTint="D8"/>
     </w:rPr>
   </w:style>
-  <w:style w:type="paragraph" w:styleId="Heading9">
+  <w:style w:type="paragraph" w:styleId="Titre9">
     <w:name w:val="heading 9"/>
     <w:basedOn w:val="Normal"/>
     <w:next w:val="Normal"/>
-    <w:link w:val="Heading9Char"/>
+    <w:link w:val="Titre9Car"/>
     <w:uiPriority w:val="9"/>
     <w:semiHidden/>
     <w:unhideWhenUsed/>
@@ -10626,12 +9955,13 @@
       <w:color w:val="272727" w:themeColor="text1" w:themeTint="D8"/>
     </w:rPr>
   </w:style>
-  <w:style w:type="character" w:default="1" w:styleId="DefaultParagraphFont">
+  <w:style w:type="character" w:default="1" w:styleId="Policepardfaut">
     <w:name w:val="Default Paragraph Font"/>
     <w:uiPriority w:val="1"/>
+    <w:semiHidden/>
     <w:unhideWhenUsed/>
   </w:style>
-  <w:style w:type="table" w:default="1" w:styleId="TableNormal">
+  <w:style w:type="table" w:default="1" w:styleId="TableauNormal">
     <w:name w:val="Normal Table"/>
     <w:uiPriority w:val="99"/>
     <w:semiHidden/>
@@ -10646,16 +9976,16 @@
       </w:tblCellMar>
     </w:tblPr>
   </w:style>
-  <w:style w:type="numbering" w:default="1" w:styleId="NoList">
+  <w:style w:type="numbering" w:default="1" w:styleId="Aucuneliste">
     <w:name w:val="No List"/>
     <w:uiPriority w:val="99"/>
     <w:semiHidden/>
     <w:unhideWhenUsed/>
   </w:style>
-  <w:style w:type="character" w:customStyle="1" w:styleId="Heading1Char">
-    <w:name w:val="Heading 1 Char"/>
-    <w:basedOn w:val="DefaultParagraphFont"/>
-    <w:link w:val="Heading1"/>
+  <w:style w:type="character" w:customStyle="1" w:styleId="Titre1Car">
+    <w:name w:val="Titre 1 Car"/>
+    <w:basedOn w:val="Policepardfaut"/>
+    <w:link w:val="Titre1"/>
     <w:uiPriority w:val="9"/>
     <w:rsid w:val="000F4A7A"/>
     <w:rPr>
@@ -10666,10 +9996,10 @@
       <w:shd w:val="clear" w:color="auto" w:fill="DAE9F7" w:themeFill="text2" w:themeFillTint="1A"/>
     </w:rPr>
   </w:style>
-  <w:style w:type="character" w:customStyle="1" w:styleId="Heading2Char">
-    <w:name w:val="Heading 2 Char"/>
-    <w:basedOn w:val="DefaultParagraphFont"/>
-    <w:link w:val="Heading2"/>
+  <w:style w:type="character" w:customStyle="1" w:styleId="Titre2Car">
+    <w:name w:val="Titre 2 Car"/>
+    <w:basedOn w:val="Policepardfaut"/>
+    <w:link w:val="Titre2"/>
     <w:uiPriority w:val="9"/>
     <w:rsid w:val="001A61BE"/>
     <w:rPr>
@@ -10681,10 +10011,10 @@
       <w:szCs w:val="28"/>
     </w:rPr>
   </w:style>
-  <w:style w:type="character" w:customStyle="1" w:styleId="Heading3Char">
-    <w:name w:val="Heading 3 Char"/>
-    <w:basedOn w:val="DefaultParagraphFont"/>
-    <w:link w:val="Heading3"/>
+  <w:style w:type="character" w:customStyle="1" w:styleId="Titre3Car">
+    <w:name w:val="Titre 3 Car"/>
+    <w:basedOn w:val="Policepardfaut"/>
+    <w:link w:val="Titre3"/>
     <w:uiPriority w:val="9"/>
     <w:semiHidden/>
     <w:rsid w:val="001E77D4"/>
@@ -10695,10 +10025,10 @@
       <w:szCs w:val="28"/>
     </w:rPr>
   </w:style>
-  <w:style w:type="character" w:customStyle="1" w:styleId="Heading4Char">
-    <w:name w:val="Heading 4 Char"/>
-    <w:basedOn w:val="DefaultParagraphFont"/>
-    <w:link w:val="Heading4"/>
+  <w:style w:type="character" w:customStyle="1" w:styleId="Titre4Car">
+    <w:name w:val="Titre 4 Car"/>
+    <w:basedOn w:val="Policepardfaut"/>
+    <w:link w:val="Titre4"/>
     <w:uiPriority w:val="9"/>
     <w:semiHidden/>
     <w:rsid w:val="001E77D4"/>
@@ -10709,10 +10039,10 @@
       <w:color w:val="0F4761" w:themeColor="accent1" w:themeShade="BF"/>
     </w:rPr>
   </w:style>
-  <w:style w:type="character" w:customStyle="1" w:styleId="Heading5Char">
-    <w:name w:val="Heading 5 Char"/>
-    <w:basedOn w:val="DefaultParagraphFont"/>
-    <w:link w:val="Heading5"/>
+  <w:style w:type="character" w:customStyle="1" w:styleId="Titre5Car">
+    <w:name w:val="Titre 5 Car"/>
+    <w:basedOn w:val="Policepardfaut"/>
+    <w:link w:val="Titre5"/>
     <w:uiPriority w:val="9"/>
     <w:semiHidden/>
     <w:rsid w:val="001E77D4"/>
@@ -10721,10 +10051,10 @@
       <w:color w:val="0F4761" w:themeColor="accent1" w:themeShade="BF"/>
     </w:rPr>
   </w:style>
-  <w:style w:type="character" w:customStyle="1" w:styleId="Heading6Char">
-    <w:name w:val="Heading 6 Char"/>
-    <w:basedOn w:val="DefaultParagraphFont"/>
-    <w:link w:val="Heading6"/>
+  <w:style w:type="character" w:customStyle="1" w:styleId="Titre6Car">
+    <w:name w:val="Titre 6 Car"/>
+    <w:basedOn w:val="Policepardfaut"/>
+    <w:link w:val="Titre6"/>
     <w:uiPriority w:val="9"/>
     <w:semiHidden/>
     <w:rsid w:val="001E77D4"/>
@@ -10735,10 +10065,10 @@
       <w:color w:val="595959" w:themeColor="text1" w:themeTint="A6"/>
     </w:rPr>
   </w:style>
-  <w:style w:type="character" w:customStyle="1" w:styleId="Heading7Char">
-    <w:name w:val="Heading 7 Char"/>
-    <w:basedOn w:val="DefaultParagraphFont"/>
-    <w:link w:val="Heading7"/>
+  <w:style w:type="character" w:customStyle="1" w:styleId="Titre7Car">
+    <w:name w:val="Titre 7 Car"/>
+    <w:basedOn w:val="Policepardfaut"/>
+    <w:link w:val="Titre7"/>
     <w:uiPriority w:val="9"/>
     <w:semiHidden/>
     <w:rsid w:val="001E77D4"/>
@@ -10747,10 +10077,10 @@
       <w:color w:val="595959" w:themeColor="text1" w:themeTint="A6"/>
     </w:rPr>
   </w:style>
-  <w:style w:type="character" w:customStyle="1" w:styleId="Heading8Char">
-    <w:name w:val="Heading 8 Char"/>
-    <w:basedOn w:val="DefaultParagraphFont"/>
-    <w:link w:val="Heading8"/>
+  <w:style w:type="character" w:customStyle="1" w:styleId="Titre8Car">
+    <w:name w:val="Titre 8 Car"/>
+    <w:basedOn w:val="Policepardfaut"/>
+    <w:link w:val="Titre8"/>
     <w:uiPriority w:val="9"/>
     <w:semiHidden/>
     <w:rsid w:val="001E77D4"/>
@@ -10761,10 +10091,10 @@
       <w:color w:val="272727" w:themeColor="text1" w:themeTint="D8"/>
     </w:rPr>
   </w:style>
-  <w:style w:type="character" w:customStyle="1" w:styleId="Heading9Char">
-    <w:name w:val="Heading 9 Char"/>
-    <w:basedOn w:val="DefaultParagraphFont"/>
-    <w:link w:val="Heading9"/>
+  <w:style w:type="character" w:customStyle="1" w:styleId="Titre9Car">
+    <w:name w:val="Titre 9 Car"/>
+    <w:basedOn w:val="Policepardfaut"/>
+    <w:link w:val="Titre9"/>
     <w:uiPriority w:val="9"/>
     <w:semiHidden/>
     <w:rsid w:val="001E77D4"/>
@@ -10773,11 +10103,11 @@
       <w:color w:val="272727" w:themeColor="text1" w:themeTint="D8"/>
     </w:rPr>
   </w:style>
-  <w:style w:type="paragraph" w:styleId="Title">
+  <w:style w:type="paragraph" w:styleId="Titre">
     <w:name w:val="Title"/>
     <w:basedOn w:val="Normal"/>
     <w:next w:val="Normal"/>
-    <w:link w:val="TitleChar"/>
+    <w:link w:val="TitreCar"/>
     <w:uiPriority w:val="10"/>
     <w:qFormat/>
     <w:rsid w:val="001E77D4"/>
@@ -10793,10 +10123,10 @@
       <w:szCs w:val="56"/>
     </w:rPr>
   </w:style>
-  <w:style w:type="character" w:customStyle="1" w:styleId="TitleChar">
-    <w:name w:val="Title Char"/>
-    <w:basedOn w:val="DefaultParagraphFont"/>
-    <w:link w:val="Title"/>
+  <w:style w:type="character" w:customStyle="1" w:styleId="TitreCar">
+    <w:name w:val="Titre Car"/>
+    <w:basedOn w:val="Policepardfaut"/>
+    <w:link w:val="Titre"/>
     <w:uiPriority w:val="10"/>
     <w:rsid w:val="001E77D4"/>
     <w:rPr>
@@ -10807,11 +10137,11 @@
       <w:szCs w:val="56"/>
     </w:rPr>
   </w:style>
-  <w:style w:type="paragraph" w:styleId="Subtitle">
+  <w:style w:type="paragraph" w:styleId="Sous-titre">
     <w:name w:val="Subtitle"/>
     <w:basedOn w:val="Normal"/>
     <w:next w:val="Normal"/>
-    <w:link w:val="SubtitleChar"/>
+    <w:link w:val="Sous-titreCar"/>
     <w:uiPriority w:val="11"/>
     <w:qFormat/>
     <w:rsid w:val="001E77D4"/>
@@ -10828,10 +10158,10 @@
       <w:szCs w:val="28"/>
     </w:rPr>
   </w:style>
-  <w:style w:type="character" w:customStyle="1" w:styleId="SubtitleChar">
-    <w:name w:val="Subtitle Char"/>
-    <w:basedOn w:val="DefaultParagraphFont"/>
-    <w:link w:val="Subtitle"/>
+  <w:style w:type="character" w:customStyle="1" w:styleId="Sous-titreCar">
+    <w:name w:val="Sous-titre Car"/>
+    <w:basedOn w:val="Policepardfaut"/>
+    <w:link w:val="Sous-titre"/>
     <w:uiPriority w:val="11"/>
     <w:rsid w:val="001E77D4"/>
     <w:rPr>
@@ -10842,11 +10172,11 @@
       <w:szCs w:val="28"/>
     </w:rPr>
   </w:style>
-  <w:style w:type="paragraph" w:styleId="Quote">
+  <w:style w:type="paragraph" w:styleId="Citation">
     <w:name w:val="Quote"/>
     <w:basedOn w:val="Normal"/>
     <w:next w:val="Normal"/>
-    <w:link w:val="QuoteChar"/>
+    <w:link w:val="CitationCar"/>
     <w:uiPriority w:val="29"/>
     <w:qFormat/>
     <w:rsid w:val="001E77D4"/>
@@ -10860,10 +10190,10 @@
       <w:color w:val="404040" w:themeColor="text1" w:themeTint="BF"/>
     </w:rPr>
   </w:style>
-  <w:style w:type="character" w:customStyle="1" w:styleId="QuoteChar">
-    <w:name w:val="Quote Char"/>
-    <w:basedOn w:val="DefaultParagraphFont"/>
-    <w:link w:val="Quote"/>
+  <w:style w:type="character" w:customStyle="1" w:styleId="CitationCar">
+    <w:name w:val="Citation Car"/>
+    <w:basedOn w:val="Policepardfaut"/>
+    <w:link w:val="Citation"/>
     <w:uiPriority w:val="29"/>
     <w:rsid w:val="001E77D4"/>
     <w:rPr>
@@ -10872,7 +10202,7 @@
       <w:color w:val="404040" w:themeColor="text1" w:themeTint="BF"/>
     </w:rPr>
   </w:style>
-  <w:style w:type="paragraph" w:styleId="ListParagraph">
+  <w:style w:type="paragraph" w:styleId="Paragraphedeliste">
     <w:name w:val="List Paragraph"/>
     <w:basedOn w:val="Normal"/>
     <w:uiPriority w:val="34"/>
@@ -10883,9 +10213,9 @@
       <w:contextualSpacing/>
     </w:pPr>
   </w:style>
-  <w:style w:type="character" w:styleId="IntenseEmphasis">
+  <w:style w:type="character" w:styleId="Accentuationintense">
     <w:name w:val="Intense Emphasis"/>
-    <w:basedOn w:val="DefaultParagraphFont"/>
+    <w:basedOn w:val="Policepardfaut"/>
     <w:uiPriority w:val="21"/>
     <w:qFormat/>
     <w:rsid w:val="001E77D4"/>
@@ -10895,11 +10225,11 @@
       <w:color w:val="0F4761" w:themeColor="accent1" w:themeShade="BF"/>
     </w:rPr>
   </w:style>
-  <w:style w:type="paragraph" w:styleId="IntenseQuote">
+  <w:style w:type="paragraph" w:styleId="Citationintense">
     <w:name w:val="Intense Quote"/>
     <w:basedOn w:val="Normal"/>
     <w:next w:val="Normal"/>
-    <w:link w:val="IntenseQuoteChar"/>
+    <w:link w:val="CitationintenseCar"/>
     <w:uiPriority w:val="30"/>
     <w:qFormat/>
     <w:rsid w:val="001E77D4"/>
@@ -10918,10 +10248,10 @@
       <w:color w:val="0F4761" w:themeColor="accent1" w:themeShade="BF"/>
     </w:rPr>
   </w:style>
-  <w:style w:type="character" w:customStyle="1" w:styleId="IntenseQuoteChar">
-    <w:name w:val="Intense Quote Char"/>
-    <w:basedOn w:val="DefaultParagraphFont"/>
-    <w:link w:val="IntenseQuote"/>
+  <w:style w:type="character" w:customStyle="1" w:styleId="CitationintenseCar">
+    <w:name w:val="Citation intense Car"/>
+    <w:basedOn w:val="Policepardfaut"/>
+    <w:link w:val="Citationintense"/>
     <w:uiPriority w:val="30"/>
     <w:rsid w:val="001E77D4"/>
     <w:rPr>
@@ -10930,9 +10260,9 @@
       <w:color w:val="0F4761" w:themeColor="accent1" w:themeShade="BF"/>
     </w:rPr>
   </w:style>
-  <w:style w:type="character" w:styleId="IntenseReference">
+  <w:style w:type="character" w:styleId="Rfrenceintense">
     <w:name w:val="Intense Reference"/>
-    <w:basedOn w:val="DefaultParagraphFont"/>
+    <w:basedOn w:val="Policepardfaut"/>
     <w:uiPriority w:val="32"/>
     <w:qFormat/>
     <w:rsid w:val="001E77D4"/>
@@ -10944,10 +10274,10 @@
       <w:spacing w:val="5"/>
     </w:rPr>
   </w:style>
-  <w:style w:type="paragraph" w:styleId="Header">
+  <w:style w:type="paragraph" w:styleId="En-tte">
     <w:name w:val="header"/>
     <w:basedOn w:val="Normal"/>
-    <w:link w:val="HeaderChar"/>
+    <w:link w:val="En-tteCar"/>
     <w:uiPriority w:val="99"/>
     <w:unhideWhenUsed/>
     <w:rsid w:val="002439E3"/>
@@ -10959,17 +10289,17 @@
       <w:spacing w:after="0" w:line="240" w:lineRule="auto"/>
     </w:pPr>
   </w:style>
-  <w:style w:type="character" w:customStyle="1" w:styleId="HeaderChar">
-    <w:name w:val="Header Char"/>
-    <w:basedOn w:val="DefaultParagraphFont"/>
-    <w:link w:val="Header"/>
+  <w:style w:type="character" w:customStyle="1" w:styleId="En-tteCar">
+    <w:name w:val="En-tête Car"/>
+    <w:basedOn w:val="Policepardfaut"/>
+    <w:link w:val="En-tte"/>
     <w:uiPriority w:val="99"/>
     <w:rsid w:val="002439E3"/>
   </w:style>
-  <w:style w:type="paragraph" w:styleId="Footer">
+  <w:style w:type="paragraph" w:styleId="Pieddepage">
     <w:name w:val="footer"/>
     <w:basedOn w:val="Normal"/>
-    <w:link w:val="FooterChar"/>
+    <w:link w:val="PieddepageCar"/>
     <w:uiPriority w:val="99"/>
     <w:unhideWhenUsed/>
     <w:rsid w:val="002439E3"/>
@@ -10981,16 +10311,16 @@
       <w:spacing w:after="0" w:line="240" w:lineRule="auto"/>
     </w:pPr>
   </w:style>
-  <w:style w:type="character" w:customStyle="1" w:styleId="FooterChar">
-    <w:name w:val="Footer Char"/>
-    <w:basedOn w:val="DefaultParagraphFont"/>
-    <w:link w:val="Footer"/>
+  <w:style w:type="character" w:customStyle="1" w:styleId="PieddepageCar">
+    <w:name w:val="Pied de page Car"/>
+    <w:basedOn w:val="Policepardfaut"/>
+    <w:link w:val="Pieddepage"/>
     <w:uiPriority w:val="99"/>
     <w:rsid w:val="002439E3"/>
   </w:style>
-  <w:style w:type="paragraph" w:styleId="TOCHeading">
+  <w:style w:type="paragraph" w:styleId="En-ttedetabledesmatires">
     <w:name w:val="TOC Heading"/>
-    <w:basedOn w:val="Heading1"/>
+    <w:basedOn w:val="Titre1"/>
     <w:next w:val="Normal"/>
     <w:uiPriority w:val="39"/>
     <w:unhideWhenUsed/>
@@ -11010,7 +10340,7 @@
       <w14:ligatures w14:val="none"/>
     </w:rPr>
   </w:style>
-  <w:style w:type="paragraph" w:styleId="TOC1">
+  <w:style w:type="paragraph" w:styleId="TM1">
     <w:name w:val="toc 1"/>
     <w:basedOn w:val="Normal"/>
     <w:next w:val="Normal"/>
@@ -11022,7 +10352,7 @@
       <w:spacing w:after="100"/>
     </w:pPr>
   </w:style>
-  <w:style w:type="paragraph" w:styleId="TOC2">
+  <w:style w:type="paragraph" w:styleId="TM2">
     <w:name w:val="toc 2"/>
     <w:basedOn w:val="Normal"/>
     <w:next w:val="Normal"/>
@@ -11035,9 +10365,9 @@
       <w:ind w:left="240"/>
     </w:pPr>
   </w:style>
-  <w:style w:type="character" w:styleId="Hyperlink">
+  <w:style w:type="character" w:styleId="Lienhypertexte">
     <w:name w:val="Hyperlink"/>
-    <w:basedOn w:val="DefaultParagraphFont"/>
+    <w:basedOn w:val="Policepardfaut"/>
     <w:uiPriority w:val="99"/>
     <w:unhideWhenUsed/>
     <w:rsid w:val="009E0E4D"/>
@@ -11046,9 +10376,9 @@
       <w:u w:val="single"/>
     </w:rPr>
   </w:style>
-  <w:style w:type="table" w:styleId="TableGrid">
+  <w:style w:type="table" w:styleId="Grilledutableau">
     <w:name w:val="Table Grid"/>
-    <w:basedOn w:val="TableNormal"/>
+    <w:basedOn w:val="TableauNormal"/>
     <w:uiPriority w:val="39"/>
     <w:rsid w:val="00E90F28"/>
     <w:pPr>
@@ -11065,7 +10395,7 @@
       </w:tblBorders>
     </w:tblPr>
   </w:style>
-  <w:style w:type="paragraph" w:styleId="NoSpacing">
+  <w:style w:type="paragraph" w:styleId="Sansinterligne">
     <w:name w:val="No Spacing"/>
     <w:uiPriority w:val="1"/>
     <w:qFormat/>
@@ -11077,9 +10407,9 @@
       <w:rFonts w:ascii="Arial" w:hAnsi="Arial" w:cs="Arial"/>
     </w:rPr>
   </w:style>
-  <w:style w:type="character" w:styleId="UnresolvedMention">
+  <w:style w:type="character" w:styleId="Mentionnonrsolue">
     <w:name w:val="Unresolved Mention"/>
-    <w:basedOn w:val="DefaultParagraphFont"/>
+    <w:basedOn w:val="Policepardfaut"/>
     <w:uiPriority w:val="99"/>
     <w:semiHidden/>
     <w:unhideWhenUsed/>

</xml_diff>

<commit_message>
Update documentation and planning workbook
Apply updates to project documentation and planning workbook. Modified Documentations/Documentation.docx and Documentations/Planning-Journal_de_travail-TPI-Jimmy.xlsx (binary files) to include the latest content/formatting changes; no source code affected.
</commit_message>
<xml_diff>
--- a/Documentations/Documentation.docx
+++ b/Documentations/Documentation.docx
@@ -463,6 +463,14 @@
     </w:p>
     <w:sdt>
       <w:sdtPr>
+        <w:rPr>
+          <w:rFonts w:ascii="Aptos" w:eastAsiaTheme="minorEastAsia" w:hAnsi="Aptos" w:cstheme="minorBidi"/>
+          <w:b w:val="0"/>
+          <w:bCs w:val="0"/>
+          <w:color w:val="2A2A2A"/>
+          <w:sz w:val="21"/>
+          <w:szCs w:val="22"/>
+        </w:rPr>
         <w:id w:val="404423486"/>
         <w:docPartObj>
           <w:docPartGallery w:val="Table of Contents"/>
@@ -471,11 +479,7 @@
       </w:sdtPr>
       <w:sdtEndPr>
         <w:rPr>
-          <w:rFonts w:ascii="Aptos" w:eastAsiaTheme="minorEastAsia" w:hAnsi="Aptos" w:cstheme="minorBidi"/>
           <w:noProof/>
-          <w:color w:val="2A2A2A"/>
-          <w:sz w:val="21"/>
-          <w:szCs w:val="22"/>
         </w:rPr>
       </w:sdtEndPr>
       <w:sdtContent>
@@ -8951,7 +8955,15 @@
       </w:r>
       <w:proofErr w:type="spellEnd"/>
       <w:r>
-        <w:t xml:space="preserve"> de franchir une étape importante. C'était la première fois que je menais un projet aussi complet, avec interface, base de données, OCR, tests et documentation. J'ai dû prendre des décisions techniques, assumer des changements d'orientation et accepter que certaines estimations initiales étaient trop optimistes.</w:t>
+        <w:t xml:space="preserve"> de </w:t>
+      </w:r>
+      <w:proofErr w:type="spellStart"/>
+      <w:r>
+        <w:t>franchir</w:t>
+      </w:r>
+      <w:proofErr w:type="spellEnd"/>
+      <w:r>
+        <w:t xml:space="preserve"> une étape importante. C'était la première fois que je menais un projet aussi complet, avec interface, base de données, OCR, tests et documentation. J'ai dû prendre des décisions techniques, assumer des changements d'orientation et accepter que certaines estimations initiales étaient trop optimistes.</w:t>
       </w:r>
     </w:p>
     <w:p>
@@ -9692,7 +9704,15 @@
         <w:pStyle w:val="Caption"/>
       </w:pPr>
       <w:r>
-        <w:t xml:space="preserve">Annexe E - Paramètres </w:t>
+        <w:t xml:space="preserve">Annexe E - </w:t>
+      </w:r>
+      <w:proofErr w:type="spellStart"/>
+      <w:r>
+        <w:t>Paramètres</w:t>
+      </w:r>
+      <w:proofErr w:type="spellEnd"/>
+      <w:r>
+        <w:t xml:space="preserve"> </w:t>
       </w:r>
       <w:proofErr w:type="spellStart"/>
       <w:r>
@@ -9719,9 +9739,183 @@
         <w:t>.</w:t>
       </w:r>
     </w:p>
+    <w:p>
+      <w:pPr>
+        <w:spacing w:after="200"/>
+      </w:pPr>
+      <w:r>
+        <w:br w:type="page"/>
+      </w:r>
+    </w:p>
+    <w:p>
+      <w:pPr>
+        <w:pStyle w:val="Caption"/>
+      </w:pPr>
+      <w:r>
+        <w:lastRenderedPageBreak/>
+        <w:drawing>
+          <wp:inline distT="0" distB="0" distL="0" distR="0" wp14:anchorId="3E5BCE1E" wp14:editId="00AB1557">
+            <wp:extent cx="6332220" cy="6991985"/>
+            <wp:effectExtent l="0" t="0" r="0" b="0"/>
+            <wp:docPr id="1551956617" name="Picture 1"/>
+            <wp:cNvGraphicFramePr>
+              <a:graphicFrameLocks xmlns:a="http://schemas.openxmlformats.org/drawingml/2006/main" noChangeAspect="1"/>
+            </wp:cNvGraphicFramePr>
+            <a:graphic xmlns:a="http://schemas.openxmlformats.org/drawingml/2006/main">
+              <a:graphicData uri="http://schemas.openxmlformats.org/drawingml/2006/picture">
+                <pic:pic xmlns:pic="http://schemas.openxmlformats.org/drawingml/2006/picture">
+                  <pic:nvPicPr>
+                    <pic:cNvPr id="1551956617" name=""/>
+                    <pic:cNvPicPr/>
+                  </pic:nvPicPr>
+                  <pic:blipFill>
+                    <a:blip r:embed="rId24"/>
+                    <a:stretch>
+                      <a:fillRect/>
+                    </a:stretch>
+                  </pic:blipFill>
+                  <pic:spPr>
+                    <a:xfrm>
+                      <a:off x="0" y="0"/>
+                      <a:ext cx="6332220" cy="6991985"/>
+                    </a:xfrm>
+                    <a:prstGeom prst="rect">
+                      <a:avLst/>
+                    </a:prstGeom>
+                  </pic:spPr>
+                </pic:pic>
+              </a:graphicData>
+            </a:graphic>
+          </wp:inline>
+        </w:drawing>
+      </w:r>
+      <w:r>
+        <w:t xml:space="preserve"> </w:t>
+      </w:r>
+    </w:p>
+    <w:p>
+      <w:pPr>
+        <w:pStyle w:val="Caption"/>
+      </w:pPr>
+      <w:proofErr w:type="spellStart"/>
+      <w:r>
+        <w:t>Annexe</w:t>
+      </w:r>
+      <w:proofErr w:type="spellEnd"/>
+      <w:r>
+        <w:t xml:space="preserve"> </w:t>
+      </w:r>
+      <w:r>
+        <w:t>F</w:t>
+      </w:r>
+      <w:r>
+        <w:t xml:space="preserve"> </w:t>
+      </w:r>
+      <w:r>
+        <w:t>–</w:t>
+      </w:r>
+      <w:r>
+        <w:t xml:space="preserve"> </w:t>
+      </w:r>
+      <w:proofErr w:type="spellStart"/>
+      <w:r>
+        <w:t>Diagramme</w:t>
+      </w:r>
+      <w:proofErr w:type="spellEnd"/>
+      <w:r>
+        <w:t xml:space="preserve"> de flux du code</w:t>
+      </w:r>
+    </w:p>
+    <w:p>
+      <w:pPr>
+        <w:spacing w:after="200"/>
+      </w:pPr>
+      <w:r>
+        <w:br w:type="page"/>
+      </w:r>
+    </w:p>
+    <w:p>
+      <w:pPr>
+        <w:pStyle w:val="Caption"/>
+      </w:pPr>
+      <w:r>
+        <w:lastRenderedPageBreak/>
+        <w:drawing>
+          <wp:inline distT="0" distB="0" distL="0" distR="0" wp14:anchorId="18250D74" wp14:editId="6601C626">
+            <wp:extent cx="6332220" cy="3413125"/>
+            <wp:effectExtent l="0" t="0" r="0" b="0"/>
+            <wp:docPr id="1785934814" name="Picture 1"/>
+            <wp:cNvGraphicFramePr>
+              <a:graphicFrameLocks xmlns:a="http://schemas.openxmlformats.org/drawingml/2006/main" noChangeAspect="1"/>
+            </wp:cNvGraphicFramePr>
+            <a:graphic xmlns:a="http://schemas.openxmlformats.org/drawingml/2006/main">
+              <a:graphicData uri="http://schemas.openxmlformats.org/drawingml/2006/picture">
+                <pic:pic xmlns:pic="http://schemas.openxmlformats.org/drawingml/2006/picture">
+                  <pic:nvPicPr>
+                    <pic:cNvPr id="1785934814" name=""/>
+                    <pic:cNvPicPr/>
+                  </pic:nvPicPr>
+                  <pic:blipFill>
+                    <a:blip r:embed="rId25"/>
+                    <a:stretch>
+                      <a:fillRect/>
+                    </a:stretch>
+                  </pic:blipFill>
+                  <pic:spPr>
+                    <a:xfrm>
+                      <a:off x="0" y="0"/>
+                      <a:ext cx="6332220" cy="3413125"/>
+                    </a:xfrm>
+                    <a:prstGeom prst="rect">
+                      <a:avLst/>
+                    </a:prstGeom>
+                  </pic:spPr>
+                </pic:pic>
+              </a:graphicData>
+            </a:graphic>
+          </wp:inline>
+        </w:drawing>
+      </w:r>
+      <w:r>
+        <w:t xml:space="preserve"> </w:t>
+      </w:r>
+    </w:p>
+    <w:p>
+      <w:pPr>
+        <w:pStyle w:val="Caption"/>
+      </w:pPr>
+      <w:proofErr w:type="spellStart"/>
+      <w:r>
+        <w:t>Annexe</w:t>
+      </w:r>
+      <w:proofErr w:type="spellEnd"/>
+      <w:r>
+        <w:t xml:space="preserve"> G</w:t>
+      </w:r>
+      <w:r>
+        <w:t xml:space="preserve"> – </w:t>
+      </w:r>
+      <w:r>
+        <w:t>MLD</w:t>
+      </w:r>
+      <w:r>
+        <w:t xml:space="preserve"> / schema </w:t>
+      </w:r>
+      <w:proofErr w:type="spellStart"/>
+      <w:r>
+        <w:t>relationnel</w:t>
+      </w:r>
+      <w:proofErr w:type="spellEnd"/>
+      <w:r>
+        <w:t xml:space="preserve"> </w:t>
+      </w:r>
+      <w:r>
+        <w:t xml:space="preserve"> de la database</w:t>
+      </w:r>
+    </w:p>
     <w:p/>
     <w:sectPr>
-      <w:footerReference w:type="default" r:id="rId24"/>
+      <w:footerReference w:type="default" r:id="rId26"/>
       <w:pgSz w:w="12240" w:h="15840"/>
       <w:pgMar w:top="1134" w:right="1134" w:bottom="1020" w:left="1134" w:header="720" w:footer="720" w:gutter="0"/>
       <w:cols w:space="720"/>

</xml_diff>